<commit_message>
Add corrected table evidence, bounded conflict views, and complete Chinese manuscript
</commit_message>
<xml_diff>
--- a/paper/zh-CN/按步执行与信息共享_中文最新稿.docx
+++ b/paper/zh-CN/按步执行与信息共享_中文最新稿.docx
@@ -84,7 +84,7 @@
           <w:color w:val="000000"/>
           <w:sz w:val="17"/>
         </w:rPr>
-        <w:t>智能体运行中出现的新步骤，会改变执行位置、接收方及所需输入。一次性裁剪可能给后续工具多发信息，也可能遗漏下一步计算的必要事实。本文演示一个按步执行原型：已支持的操作在本地完成，外部步骤使用接收方视图；模型可以申请缺失事实或提出受限计算表达式，本地控制器分别核验权限、执行依赖和最终请求。双栏界面把任务推进与实际出站记录对应起来。我们补充了同能力强对照及公开表格验证，共 496 次新任务、592 次 DeepSeek 调用。合成任务中，按需补充与获准字段全量对照分别通过 57/64 和 58/64 次，前者减少多余传输但增加调用；公开表格中，只发送结构并在本地计算减少了原始数值外发，却降低了通过率。演示据此呈现完成任务、共享范围和执行代价之间的可核对取舍。</w:t>
+        <w:t>智能体在运行中发现新步骤时，执行位置与输入需求可能同时改变。一次性裁剪既可能沿工具链传播无关信息，也可能遗漏后续计算所需事实。本文演示一个按步执行系统：为当前接收方构造视图，允许受限事实补充或本地表达式计算，并在发送前核验源值、授权与最终请求。界面将任务步骤、实际外发内容和本地计算依赖逐项关联。对 60 页公开财务表格进行五方法、两次重复的冻结验证，共 600 次任务与 1,210 次真实模型调用。本地计算通过 98/120 次，全量数值通过 96/120 次；前者未传输业务数值，但差异区间不足以证明准确率优势。补充分歧视图增加了调用成本，未稳定改善结果。系统据此展示信息共享与任务完成之间可复核的取舍。</w:t>
       </w:r>
     </w:p>
     <w:p>
@@ -235,7 +235,7 @@
           <w:color w:val="000000"/>
           <w:sz w:val="18"/>
         </w:rPr>
-        <w:t>相关工作已研究本地规划抽象与受限能力 [1]、工具参数最小化 [2]、任务相关观察视图 [3]，以及保持回答效用的信息裁剪 [4]。本地网关、动态取数与计算下推均有先例。</w:t>
+        <w:t>PlanTwin [1] 研究本地规划抽象与受限能力；ToolMinimize [2] 和 MINIM [3] 分别约束工具参数与观察视图。程序辅助推理 [4] 与多方案一致性 [5] 也已有研究。本地网关、程序计算和方案投票本身均不是本文的独创。</w:t>
       </w:r>
     </w:p>
     <w:p>
@@ -260,7 +260,7 @@
           <w:color w:val="000000"/>
           <w:sz w:val="18"/>
         </w:rPr>
-        <w:t>本文的贡献是把这些决定落实为带有执行依赖与实际请求证据的交互原型，并用同能力对照检验其收益和代价，不主张提出通用最优共享算法。</w:t>
+        <w:t>本文面向数据管理中的运行时访问控制与计算放置问题，将接收方视图、源值依赖和实际请求纳入同一执行记录。观众可以沿一次任务追溯“为何在此处计算、为何发送这些字段、实际发送是否一致”，而不只看到最终回答。</w:t>
       </w:r>
     </w:p>
     <w:p>
@@ -277,7 +277,7 @@
           <w:color w:val="000000"/>
           <w:sz w:val="18"/>
         </w:rPr>
-        <w:t>系统提供两条具体路径：缺少事实时申请获准字段；可表达为有限算式时，把模型提出的计算交给本地解释器。我们同时公开两条路径的失败结果，使观众能够检查“发送更少”和“完成更好”是否在同一任务上成立。</w:t>
+        <w:t>系统实现事实补充与本地计算两条路径，并加入按候选算式分歧选择有界补充字段的实验机制。贡献包括可核验的执行原型、保持表结构的数值视图，以及带同能力对照和失败记录的演示。我们不将句法最小集合等同于语义最小共享。</w:t>
       </w:r>
     </w:p>
     <w:p>
@@ -337,7 +337,7 @@
           <w:color w:val="000000"/>
           <w:sz w:val="18"/>
         </w:rPr>
-        <w:t>本地状态 S 保存原始事实和后来取得的资料。每个登记操作 o 对应候选执行能力与接收方 r。确定性本地规则适用时直接执行；否则，按当前操作构造字段集合 K，并发送其投影视图：</w:t>
+        <w:t>本地状态 S 保存原始事实与查询结果。对登记操作 o，本地规则适用时直接执行；否则为接收方 r 选择字段 K，并构造视图：</w:t>
       </w:r>
     </w:p>
     <w:p>
@@ -428,7 +428,7 @@
           <w:color w:val="000000"/>
           <w:sz w:val="18"/>
         </w:rPr>
-        <w:t>t 表示一次外部调用。初始选择器使用登记字段与文本规则，可能漏选；它不被假定为充分或最优。模型同时获知可申请字段的名称。若返回字段申请 G，本地检查源字段存在、操作授权、新增性与轮数限制，然后更新 K：</w:t>
+        <w:t>t 表示一次外部调用。初始选择器使用登记字段与文本规则，可能漏选。模型可以申请字段 G；本地核验存在性、授权、新增性及轮数，再更新 K：</w:t>
       </w:r>
     </w:p>
     <w:p>
@@ -525,7 +525,7 @@
           <w:color w:val="000000"/>
           <w:sz w:val="18"/>
         </w:rPr>
-        <w:t>A(o,r) 是授权集合，独立于评价标签。身份、联系方式、账号、内部备注和无关记录不能通过业务事实接口申请。获准不等于必要：模型仍可能多索取合同金额。合同与学习任务最多补充两轮、分析六轮；超限或越权明确失败。</w:t>
+        <w:t>A(o,r) 是独立于评价标签的授权集合，排除身份、联系方式、账号、内部备注及无关记录。获准不等于必要。合同与学习任务最多补充两轮、分析六轮；越权或超限即失败。</w:t>
       </w:r>
     </w:p>
     <w:p>
@@ -542,7 +542,7 @@
           <w:color w:val="000000"/>
           <w:sz w:val="18"/>
         </w:rPr>
-        <w:t>若模型请求资料，控制器为该接收方新建视图，只发送登记编号与版本；返回正文和出处写入 S，后续分析再使用。先前获准给模型的字段不会自动传给资料服务。原型支持登记操作，不支持任意工具或任意网址。</w:t>
+        <w:t>若模型请求资料，控制器另建仅含登记编号与版本的工具视图，将返回正文与出处写入 S。给模型的授权不会自动延伸至资料服务；原型只支持登记操作。</w:t>
       </w:r>
     </w:p>
     <w:p>
@@ -575,7 +575,7 @@
           <w:color w:val="000000"/>
           <w:sz w:val="18"/>
         </w:rPr>
-        <w:t>数值任务提供另一种选择：云端先读问题及行列结构，提出由加、减、乘、除等有限算子组成的表达式 p。参数只能是获准字段、常数或前序结果。解释器拒绝未知算子、循环引用、非有限结果和不参与最终输出的中间计算，不执行模型生成的脚本。</w:t>
+        <w:t>数值任务可由云端根据问题与表结构提出有限表达式 p，参数限于获准字段、常数或前序结果。本地解释器拒绝未知算子、循环引用、非有限结果及无用中间节点，不执行生成脚本。</w:t>
       </w:r>
     </w:p>
     <w:p>
@@ -683,7 +683,7 @@
           <w:color w:val="000000"/>
           <w:sz w:val="18"/>
         </w:rPr>
-        <w:t>实现逐字段保存摘要，结果在本地组装。本路径中，云端不接收表格数值或计算返回值；问题、标签和单位仍然可见。依赖记录说明程序读了哪些值，并不能证明程序正确理解了问题，也不能排除从问题或表结构推断信息。</w:t>
+        <w:t>实现逐字段保存摘要并在本地组装结果。云端可见问题、标签、年份和单位，不接收业务数值或计算结果。依赖记录不能证明程序理解正确，也不能排除从结构推断信息。</w:t>
       </w:r>
     </w:p>
     <w:p>
@@ -700,7 +700,107 @@
           <w:color w:val="000000"/>
           <w:sz w:val="18"/>
         </w:rPr>
-        <w:t>例如公开表格中的占比问题，模型根据行列标签提出 r1c1 除以 r2c1。本地读取 7,367 和 72,238，计算得到约 0.101982，并保存这两个单元格的依赖。其余数值不参与计算。若模型把分子与分母选反，权限检查仍可能通过，因此程序合法与答案正确必须分开评价。</w:t>
+        <w:t>转换器保留原始行列位置、年份和单位，用字段标识替换业务数值。无法确定的合并表头保持原有网格。运行时从原表重建并核对缓存，防止结构与源值不一致。</w:t>
+      </w:r>
+    </w:p>
+    <w:p>
+      <w:pPr>
+        <w:keepNext/>
+        <w:spacing w:before="80" w:after="40"/>
+      </w:pPr>
+      <w:r>
+        <w:rPr>
+          <w:rFonts w:ascii="Linux Libertine" w:hAnsi="Linux Libertine" w:eastAsia="SimHei"/>
+          <w:b/>
+          <w:i w:val="0"/>
+          <w:color w:val="000000"/>
+          <w:sz w:val="18"/>
+        </w:rPr>
+        <w:t>2.3  按分歧选择补充字段</w:t>
+      </w:r>
+    </w:p>
+    <w:p>
+      <w:pPr>
+        <w:spacing w:after="40" w:line="246" w:lineRule="auto"/>
+        <w:ind w:firstLine="230"/>
+        <w:jc w:val="both"/>
+      </w:pPr>
+      <w:r>
+        <w:rPr>
+          <w:rFonts w:ascii="Linux Libertine" w:hAnsi="Linux Libertine" w:eastAsia="SimSun"/>
+          <w:b w:val="0"/>
+          <w:i w:val="0"/>
+          <w:color w:val="000000"/>
+          <w:sz w:val="18"/>
+        </w:rPr>
+        <w:t>实验模式规范化三个候选算式。对每对不同候选，依赖不同则取对称差，依赖相同但算子不同则取并集，得到集合 C。可行 K 须获授权、至多含三个字段，且与每个 C 相交。选择：</w:t>
+      </w:r>
+    </w:p>
+    <w:p>
+      <w:pPr>
+        <w:spacing w:before="60" w:after="60"/>
+        <w:jc w:val="center"/>
+      </w:pPr>
+      <m:oMathPara>
+        <m:oMath>
+          <m:sSup>
+            <m:e>
+              <m:r>
+                <m:t>K</m:t>
+              </m:r>
+            </m:e>
+            <m:sup>
+              <m:r>
+                <m:t>*</m:t>
+              </m:r>
+            </m:sup>
+          </m:sSup>
+          <m:r>
+            <m:t>=</m:t>
+          </m:r>
+          <m:limLow>
+            <m:e>
+              <m:r>
+                <m:t>arg min</m:t>
+              </m:r>
+            </m:e>
+            <m:lim>
+              <m:r>
+                <m:t>K</m:t>
+              </m:r>
+            </m:lim>
+          </m:limLow>
+          <m:r>
+            <m:t>|K|</m:t>
+          </m:r>
+        </m:oMath>
+      </m:oMathPara>
+      <w:r>
+        <w:rPr>
+          <w:rFonts w:ascii="Linux Libertine" w:hAnsi="Linux Libertine" w:eastAsia="SimSun"/>
+          <w:b w:val="0"/>
+          <w:i w:val="0"/>
+          <w:color w:val="000000"/>
+          <w:sz w:val="16"/>
+        </w:rPr>
+        <w:t xml:space="preserve">  (4)</w:t>
+      </w:r>
+    </w:p>
+    <w:p>
+      <w:pPr>
+        <w:spacing w:after="20" w:line="246" w:lineRule="auto"/>
+        <w:ind w:firstLine="230"/>
+        <w:jc w:val="both"/>
+      </w:pPr>
+      <w:r>
+        <w:rPr>
+          <w:rFonts w:ascii="Linux Libertine" w:hAnsi="Linux Libertine" w:eastAsia="SimSun"/>
+          <w:b w:val="0"/>
+          <w:i w:val="0"/>
+          <w:color w:val="000000"/>
+          <w:sz w:val="18"/>
+        </w:rPr>
+        <w:t>分支搜索保留最小基数解，标识顺序打破平局；无法覆盖则停止。复核接收候选程序与获准字段，不接收本地结果。至多三组句法约束下的最小覆盖，不保证语义充分或答案正确。</w:t>
       </w:r>
     </w:p>
     <w:p>
@@ -724,7 +824,7 @@
           <w:color w:val="000000"/>
           <w:sz w:val="18"/>
         </w:rPr>
-        <w:t>2.3  复核最后实际发送的内容</w:t>
+        <w:t>2.4  复核最后实际发送的内容</w:t>
       </w:r>
     </w:p>
     <w:p>
@@ -851,7 +951,7 @@
           <w:color w:val="000000"/>
           <w:sz w:val="16"/>
         </w:rPr>
-        <w:t xml:space="preserve">  (4)</w:t>
+        <w:t xml:space="preserve">  (5)</w:t>
       </w:r>
     </w:p>
     <w:p>
@@ -1307,7 +1407,7 @@
           <w:color w:val="000000"/>
           <w:sz w:val="18"/>
         </w:rPr>
-        <w:t>2.4  依赖检查的含义与代价</w:t>
+        <w:t>2.5  依赖检查的含义与代价</w:t>
       </w:r>
     </w:p>
     <w:p>
@@ -1324,7 +1424,7 @@
           <w:color w:val="000000"/>
           <w:sz w:val="18"/>
         </w:rPr>
-        <w:t>依赖只包含本步使用的源值。若延期天数改变，已准备的相关请求必须重新核准；若只修改未使用的内部备注，当前请求仍可继续。外发字段与本地计算依赖分开记录：本地程序读取一个数值，不意味着该数值曾被发送；同样，某个字段未出现在本次请求中，也不意味着它此前从未外发。</w:t>
+        <w:t>依赖只包含本步使用的源值。修改相关数值会使已准备请求失效，修改未使用字段不影响当前凭据。外发字段与本地计算依赖分开记录：本地读取不等于对外发送；本次未发送也不等于此前从未发送。</w:t>
       </w:r>
     </w:p>
     <w:p>
@@ -1341,7 +1441,7 @@
           <w:color w:val="000000"/>
           <w:sz w:val="18"/>
         </w:rPr>
-        <w:t>对含 m 个节点的有限表达式，解释器顺序检查并计算各节点，再遍历最终结果的依赖，时间与空间均为 O(m)。请求核验随使用字段和载荷长度线性增长。这里能保证的是访问范围、序列化一致性和可重算性；是否选对算式、是否需要所申请字段，仍由任务评价检验。</w:t>
+        <w:t>有限表达式含 m 个节点时，解释器的顺序执行与依赖遍历需要 O(m) 时间和空间。请求核验随使用字段与载荷长度线性增长。保证范围限于登记出口的访问检查、字节一致性与可重算性，不保证问题理解或信息推断安全。</w:t>
       </w:r>
     </w:p>
     <w:p>
@@ -1363,7 +1463,7 @@
       <w:r>
         <w:drawing>
           <wp:inline xmlns:a="http://schemas.openxmlformats.org/drawingml/2006/main" xmlns:pic="http://schemas.openxmlformats.org/drawingml/2006/picture">
-            <wp:extent cx="5806440" cy="3295273"/>
+            <wp:extent cx="5715000" cy="3420341"/>
             <wp:docPr id="2" name="Picture 2"/>
             <wp:cNvGraphicFramePr>
               <a:graphicFrameLocks noChangeAspect="1"/>
@@ -1384,7 +1484,7 @@
                   <pic:spPr>
                     <a:xfrm>
                       <a:off x="0" y="0"/>
-                      <a:ext cx="5806440" cy="3295273"/>
+                      <a:ext cx="5715000" cy="3420341"/>
                     </a:xfrm>
                     <a:prstGeom prst="rect"/>
                   </pic:spPr>
@@ -1408,7 +1508,7 @@
           <w:color w:val="000000"/>
           <w:sz w:val="14"/>
         </w:rPr>
-        <w:t>图 2  真实 DeepSeek 记录的执行详情。① 模型提出缺失事实申请，触发本地核验与后续分析；② 右栏对应当前步骤的实际发送和本次保留字段；③ 本地组装结果。该例正确计算 1,150 元，但额外索取合同总额，且解释存在无根据的金额比较；记录保留这一缺陷。</w:t>
+        <w:t>图 2  公开表格开发示例的真实执行记录。① 从原表核对结构与数值角色；② 右栏显示模型实际收到的问题与表结构，以及本次保留的业务数值；③ 本地执行算式并返回结果。截图裁去导航与源文件卡片，并添加编号；此示例不计入测试。</w:t>
       </w:r>
     </w:p>
     <w:p>
@@ -1468,7 +1568,7 @@
           <w:color w:val="000000"/>
           <w:sz w:val="18"/>
         </w:rPr>
-        <w:t>首先运行本地规则适用的标准条款，修改金额后重新执行，观察数值变化及零外部调用。然后运行图 2 的补充案例：每日 230 元的条款最初缺少延期天数，模型申请后获得 5 天，再完成计算。选择前后两次分析，可比较接收内容的变化；案例也说明数值正确不保证解释正确。</w:t>
+        <w:t>首先运行本地规则适用的标准条款，修改金额后重新执行，观察数值变化及零外部调用。随后运行补充事实案例：每日 230 元的条款最初缺少延期天数，模型申请后获得 5 天，再完成计算。选择前后两次分析，可比较接收内容的变化；案例也说明数值正确不保证解释正确。</w:t>
       </w:r>
     </w:p>
     <w:p>
@@ -1485,7 +1585,7 @@
           <w:color w:val="000000"/>
           <w:sz w:val="18"/>
         </w:rPr>
-        <w:t>第三个场景是运行中查找指定版本资料。查询步骤只含编号和版本，后续分析增加正文。观众可在发送前撤权，对比请求被阻断与已产生接收记录的轨迹。第四个场景使用公开财务表格：对照发送全部数值、按需获取单元格和本地解释器三种路径，展开模型提出的算式与本地依赖。</w:t>
+        <w:t>第三个场景在运行中查找指定版本资料：查询仅含编号和版本，后续分析增加返回正文；观众可在发送前撤权。第四个场景使用公开年报表格，先查看年份表头与业务数值的分离，再比较全量、按需和本地计算。营运资金示例读取 2015 年与 2016 年的两个本地数值，得到约 25.43% 的增幅；云端看到列的含义，但不接收数值或计算结果。</w:t>
       </w:r>
     </w:p>
     <w:p>
@@ -1543,7 +1643,7 @@
           <w:color w:val="000000"/>
           <w:sz w:val="18"/>
         </w:rPr>
-        <w:t>实验前冻结代码、输入、标签和调用配置，历史批次单独保留。以下实验均使用 deepseek-flash、temperature=0，每例重复两次，失败与异常全部进入分母。合成强对照共 32×4×2=256 次任务；公开表格共 40×3×2=240 次。592 次实际供应商调用均与接收记录逐项对应。</w:t>
+        <w:t>实验前冻结源码、输入、标签与配置。60 页来自 57 份公司年度报告、38 家公司；每例五种方法、重复两次，共 600 次任务。采用 deepseek-flash、temperature=0、每次最多 900 个输出 token，四任务并发；方法次序轮换。1,210 次真实调用均与请求及响应摘要对应。</w:t>
       </w:r>
     </w:p>
     <w:p>
@@ -1560,7 +1660,7 @@
           <w:color w:val="000000"/>
           <w:sz w:val="18"/>
         </w:rPr>
-        <w:t>合成部分复用已公开的 32 例，属于强对照复验，不是新留出集。四种方法共享本地规则、模型提示、评价器和资料服务视图：按需补充；关闭补充；提前发送全部获准业务字段；预取全部登记业务数值。后两者均排除五类私有字段，避免把泄露身份的弱基线当作主要优势来源。</w:t>
+        <w:t>表格取自 FinQA [6] 官方数据的受限子集：问题只依赖表格，标注算子受支持，操作数可唯一定位。按固定摘要顺序选择页面，并排除此前测试与开发使用的全部公司年度报告。旧批次的六个开发题及六个诊断题只用于修复接口与表头；本轮测试没有按模型表现筛题。数据可能在模型训练中出现。</w:t>
       </w:r>
     </w:p>
     <w:p>
@@ -1577,7 +1677,7 @@
           <w:color w:val="000000"/>
           <w:sz w:val="18"/>
         </w:rPr>
-        <w:t>公开部分来自 FinQA [5] 的官方测试数据。按固定摘要顺序选择 40 个页面，涉及 38 份公司年度报告；只保留标注依赖表格、算子受支持且操作数可唯一定位的题目。这是受限子集，不是完整基准。只用三个开发集题目检查接口和输出单位，测试标签从未作为执行输入。公开数据可能在模型训练中出现。</w:t>
+        <w:t>五种方法共享修正后的表结构、权限与解释器。全量与本地计算各规划一次，前者传输数值，后者只传结构；按需方法先申请单元格。无数值复核与分歧补充均先独立提出三个方案，再在不一致时复核；两者的复核提示相同，区别是是否提供式（4）的字段。默认采用单次本地计算。</w:t>
       </w:r>
     </w:p>
     <w:p>
@@ -1594,7 +1694,7 @@
           <w:color w:val="000000"/>
           <w:sz w:val="18"/>
         </w:rPr>
-        <w:t>公开表格三种方法共享问题、表结构、解释器及评价器。全量方法先提供所有数值；按需方法先请求至多 12 个单元格，只能在这些字段上计算；本地表达式方法只提供结构，由本地读取表达式依赖的值。数值以原标签 exe_ans 评分，绝对容差为 0.00005；不把解释器成功执行当作答对。</w:t>
+        <w:t>按原始 exe_ans 评分，绝对容差为 0.00005；错误及异常均计入分母。业务数值按实际请求累计，重复发送重复计数；标签、年份和单位仍可见。耗时包含结构重建、调用与检查，排除界面放慢。两次结果先在案例内平均，再按年度报告做 4,000 次配对聚类重采样。</w:t>
       </w:r>
     </w:p>
     <w:p>
@@ -1617,7 +1717,7 @@
       <w:r>
         <w:drawing>
           <wp:inline xmlns:a="http://schemas.openxmlformats.org/drawingml/2006/main" xmlns:pic="http://schemas.openxmlformats.org/drawingml/2006/picture">
-            <wp:extent cx="6199632" cy="3232665"/>
+            <wp:extent cx="6199632" cy="3498364"/>
             <wp:docPr id="3" name="Picture 3"/>
             <wp:cNvGraphicFramePr>
               <a:graphicFrameLocks noChangeAspect="1"/>
@@ -1638,7 +1738,7 @@
                   <pic:spPr>
                     <a:xfrm>
                       <a:off x="0" y="0"/>
-                      <a:ext cx="6199632" cy="3232665"/>
+                      <a:ext cx="6199632" cy="3498364"/>
                     </a:xfrm>
                     <a:prstGeom prst="rect"/>
                   </pic:spPr>
@@ -1662,7 +1762,7 @@
           <w:color w:val="000000"/>
           <w:sz w:val="14"/>
         </w:rPr>
-        <w:t>图 3  强对照与公开表格结果。a–c，合成任务的通过率、多余字段及耗时；d–f，公开子集的数值通过率、实际发送单元格及耗时。次数包含失败；耗时为核心执行时间。上下两组共享量的定义不同，不跨组比较其数值大小。</w:t>
+        <w:t>图 3  最新冻结表格实验。a–c，正确性、业务数值外发与执行耗时；d，本地计算相对各对照的通过率差及报告聚类区间；e，实际调用；f，结构一致但答案错误的任务。每种方法 120 次任务，失败均保留。</w:t>
       </w:r>
     </w:p>
     <w:p>
@@ -1705,7 +1805,7 @@
           <w:color w:val="000000"/>
           <w:sz w:val="18"/>
         </w:rPr>
-        <w:t>合成任务按问题代码、金额及引用联合评分。多余传输是各接收请求中不在预定必要字段集合内的字段数之和，同一字段重复发送重复计数。按需补充通过 57/64 次；关闭补充为 50/64，获准字段全量与数值预取均为 58/64。对比关闭补充的增量为 10.94 个百分点，案例配对的描述性 95% 区间为 [1.56, 21.88]。</w:t>
+        <w:t>图 3 显示单次本地计算通过 98/120 次，全部数值为 96/120，按需单元格为 94/120。对应每任务业务数值发送量为 0、14.833 和 2.417；调用总数为 120、120 和 236。本地计算相对全量的通过率差为 1.67 个百分点，描述性 95% 区间为 [−5.83, 9.02]，不能据此声称更优或不劣。</w:t>
       </w:r>
     </w:p>
     <w:p>
@@ -1722,7 +1822,7 @@
           <w:color w:val="000000"/>
           <w:sz w:val="18"/>
         </w:rPr>
-        <w:t>按需补充的多余字段均值为 0.031 次/任务，获准字段全量为 0.563，数值预取为 0.063；模型调用分别为 80、64、64 次。相对全量对照的通过率差为 −1.56 个百分点，区间 [−15.63, 12.50]。因此不能主张完成率更优或等效；当少数数值可预先识别时，直接预取是有竞争力的选择。</w:t>
+        <w:t>分歧补充通过 96/120 次，无数值复核为 95/120；前者发送 0.075 个业务数值/任务，两者分别调用 368 和 366 次。与单次本地计算相比，多方案方法未呈现准确率收益，核心耗时中位数约由 0.72 秒增至 2.25 秒。分歧补充中有 18 次任务的三个方案结构一致却答案错误；一致性只能决定是否复核，不能作为正确性证书。</w:t>
       </w:r>
     </w:p>
     <w:p>
@@ -1739,7 +1839,7 @@
           <w:color w:val="000000"/>
           <w:sz w:val="18"/>
         </w:rPr>
-        <w:t>公开表格的全量、按需、本地表达式分别通过 62/80、53/80 和 51/80 次，每任务发送数值单元格均值分别为 15.425、2.425 和 0。结构规划相对全量下降 13.75 个百分点，按年度报告聚类的区间为 [−24.43, −3.95]；问题理解、符号及单元格选择仍会出错。零原始数值传输是该路径的设计约束，并非零信息泄露证明。</w:t>
+        <w:t>历史合成强对照另保留 256 次任务。按需补充、关闭补充、获准业务字段全量、数值预取分别通过 57/64、50/64、58/64、58/64 次；多余字段均值分别为 0.031、0、0.563、0.063。按需补充需 80 次调用，后两种预取各为 64 次。当必要数值容易预先识别时，预取仍是有竞争力的基线。该集合已用于开发，不与新表格结果合并。</w:t>
       </w:r>
     </w:p>
     <w:p>
@@ -1756,7 +1856,7 @@
           <w:color w:val="000000"/>
           <w:sz w:val="18"/>
         </w:rPr>
-        <w:t>区间先在案例内平均重复，再进行 4,000 次配对重采样；表格按报告聚类，合成任务按案例采样。它们仅描述当前集合，不代表真实企业总体。原有请求绑定检查另保留 52 个变更与八个合法对照；本轮补充程序越权、非法引用及展示元数据改写测试。</w:t>
+        <w:t>旧表格转换曾把部分年份表头当作业务数值隐藏，破坏了无数值视图的列含义。本轮修复输入构造并使用新报告重新测试；旧协议、原始结果和更正说明全部保留，不能将跨批次差异归因于新算法。边界测试另外覆盖撤权、源值改写、接收方替换、凭据重放和程序越权。</w:t>
       </w:r>
     </w:p>
     <w:p>
@@ -1797,7 +1897,7 @@
           <w:color w:val="000000"/>
           <w:sz w:val="18"/>
         </w:rPr>
-        <w:t>仓库提供界面、执行器、冻结协议、原始调用、失败样本及无密钥复算教程。所有新结果可从 496 份运行记录重算，旧批次单独保留。模型密钥与商业客户端未进入公开包。自由文本盲审材料已准备，真人评阅尚未完成；本文只报告结构化与数值结果，不宣称专家认可或真实部署成效。</w:t>
+        <w:t>仓库公开独立界面、执行器、冻结协议、原始调用及失败样本；600 份最新记录可无密钥复算。读者可重放真实调用，或配置自己的 DeepSeek 密钥重新执行。商业客户端与凭据不在开源包内。自由文本盲审材料已准备，但真人评阅尚未完成，本文只报告结构化与数值结果。</w:t>
       </w:r>
     </w:p>
     <w:p>
@@ -1814,7 +1914,7 @@
           <w:color w:val="000000"/>
           <w:sz w:val="18"/>
         </w:rPr>
-        <w:t>本原型说明了可检查的执行控制如何呈现共享取舍。算法仍依赖登记能力，未证明语义最小性，也未运行相关工作的完整系统对照。公开表格的失败结果进一步限定了仅凭结构选择计算的适用范围。</w:t>
+        <w:t>实验只涉及一个模型和受限公开子集，不代表真实部署效果。我们未完成相关系统的端到端复现比较，也未证明语义最小性或任意工具的安全性。本文的演示价值在于把执行决策与实际数据流联系起来，让共享收益、额外调用和失败原因都能被检查。</w:t>
       </w:r>
     </w:p>
     <w:p>
@@ -1915,7 +2015,7 @@
           <w:color w:val="000000"/>
           <w:sz w:val="14"/>
         </w:rPr>
-        <w:t>[4] J. Zhou 等. Operationalizing Data Minimization for Privacy-Preserving LLM Prompting. arXiv:2510.03662, 2025.</w:t>
+        <w:t>[4] L. Gao 等. PAL: Program-aided Language Models. ICML, 2023, 10764–10799.</w:t>
       </w:r>
     </w:p>
     <w:p>
@@ -1932,7 +2032,24 @@
           <w:color w:val="000000"/>
           <w:sz w:val="14"/>
         </w:rPr>
-        <w:t>[5] Z. Chen 等. FinQA: A Dataset of Numerical Reasoning over Financial Data. EMNLP, 2021, 3697–3711.</w:t>
+        <w:t>[5] X. Wang 等. Self-Consistency Improves Chain of Thought Reasoning in Language Models. ICLR, 2023.</w:t>
+      </w:r>
+    </w:p>
+    <w:p>
+      <w:pPr>
+        <w:spacing w:after="20" w:line="246" w:lineRule="auto"/>
+        <w:ind w:left="202" w:hanging="202"/>
+        <w:jc w:val="left"/>
+      </w:pPr>
+      <w:r>
+        <w:rPr>
+          <w:rFonts w:ascii="Linux Libertine" w:hAnsi="Linux Libertine" w:eastAsia="SimSun"/>
+          <w:b w:val="0"/>
+          <w:i w:val="0"/>
+          <w:color w:val="000000"/>
+          <w:sz w:val="14"/>
+        </w:rPr>
+        <w:t>[6] Z. Chen 等. FinQA: A Dataset of Numerical Reasoning over Financial Data. EMNLP, 2021, 3697–3711.</w:t>
       </w:r>
     </w:p>
     <w:sectPr>

</xml_diff>

<commit_message>
Add disclosure-aware continuation repair, frozen evaluation, and revised Chinese paper
</commit_message>
<xml_diff>
--- a/paper/zh-CN/按步执行与信息共享_中文最新稿.docx
+++ b/paper/zh-CN/按步执行与信息共享_中文最新稿.docx
@@ -84,7 +84,7 @@
           <w:color w:val="000000"/>
           <w:sz w:val="17"/>
         </w:rPr>
-        <w:t>智能体在运行中发现新步骤时，执行位置与输入需求可能同时改变。一次性裁剪既可能沿工具链传播无关信息，也可能遗漏后续计算所需事实。本文演示一个按步执行系统：为当前接收方构造视图，允许受限事实补充或本地表达式计算，并在发送前核验源值、授权与最终请求。界面将任务步骤、实际外发内容和本地计算依赖逐项关联。对 60 页公开财务表格进行五方法、两次重复的冻结验证，共 600 次任务与 1,210 次真实模型调用。本地计算通过 98/120 次，全量数值通过 96/120 次；前者未传输业务数值，但差异区间不足以证明准确率优势。补充分歧视图增加了调用成本，未稳定改善结果。系统据此展示信息共享与任务完成之间可复核的取舍。</w:t>
+        <w:t>智能体的后续步骤可能改变执行位置与输入需求；请求准备完成后，源值、授权和可用能力仍可能变化。逐步裁剪难以兼顾跨步骤的累计披露，完整重跑则重复已完成的工作。本文演示一个按步执行系统：依据接收方已见信息规划当前已知的后续步骤，在发送前核验规划依赖，并保留仍有效的纯计算结果。独立接收进程记录实际载荷，界面将状态变化、失效请求与修复结果逐项对应。288 个受控场景的六方法比较中，局部修复比完整重跑减少 12.5% 的外部执行；后续规划比逐步贪心少披露 2.9% 的不同信息项，但重复传输字段增加 54.5%。另保留真实模型调用验证本地计算路径。演示使这些收益、代价和适用边界均可检查。</w:t>
       </w:r>
     </w:p>
     <w:p>
@@ -101,7 +101,7 @@
           <w:color w:val="000000"/>
           <w:sz w:val="16"/>
         </w:rPr>
-        <w:t>关键词：智能体执行；数据视图；按需取数；本地计算；系统演示。</w:t>
+        <w:t>关键词：智能体执行；接收方视图；累计披露；局部修复；系统演示。</w:t>
       </w:r>
     </w:p>
     <w:p>
@@ -134,7 +134,7 @@
           <w:color w:val="000000"/>
           <w:sz w:val="18"/>
         </w:rPr>
-        <w:t>一份合同规定按延期天数计费。云端已收到条款，但延期天数仍在本地；如果不能申请补充，模型可能把“未传输”误判成“源数据不存在”。随后出现的资料查询只需要编号和版本，不需要合同金额或身份。任务推进改变了信息需求，执行位置和发送内容应随当前步骤重新确定。</w:t>
+        <w:t>以合同计费任务为例：一个步骤计算金额，另一个步骤检查限额。外部服务可以接收原始数值，也可以接收本地计算的金额。只看当前步骤，发送一个派生值似乎更省；考虑后续步骤，向同一接收方复用已披露的输入可能更合适。若限额在发送前改变，旧请求应当失效，但不依赖限额的已完成计算仍可保留。</w:t>
       </w:r>
     </w:p>
     <w:p>
@@ -191,7 +191,7 @@
           <w:color w:val="000000"/>
           <w:sz w:val="14"/>
         </w:rPr>
-        <w:t>图 1  按步执行与出域核验。原始资料在本地保存；模型和工具只通过登记出口交互。任务产生新步骤后重新确定执行位置与输入，结果回到本地状态。</w:t>
+        <w:t>图 1  按步执行的系统结构。原始资料保留在本地；模型与工具通过登记出口交互。新步骤或状态变化触发重新判定，外部结果写回本地状态。</w:t>
       </w:r>
     </w:p>
     <w:p>
@@ -218,7 +218,7 @@
           <w:color w:val="000000"/>
           <w:sz w:val="18"/>
         </w:rPr>
-        <w:t>本原型围绕三个可观察的决定展开：哪些操作可由本地能力完成；外部接收方当前需要看到什么；准备好的请求到真正发送时是否仍获准。它既要防止无关上下文沿工具链继续传播，也要允许任务在信息不足时继续执行。</w:t>
+        <w:t>这涉及三个相互关联的数据管理问题：计算放在哪里、每个接收方累计获知什么、状态变化后哪些结果仍有效。图 1 展示执行边界；本文在这一结构上实现可追溯的后续规划与局部修复。</w:t>
       </w:r>
     </w:p>
     <w:p>
@@ -235,7 +235,7 @@
           <w:color w:val="000000"/>
           <w:sz w:val="18"/>
         </w:rPr>
-        <w:t>PlanTwin [1] 研究本地规划抽象与受限能力；ToolMinimize [2] 和 MINIM [3] 分别约束工具参数与观察视图。程序辅助推理 [4] 与多方案一致性 [5] 也已有研究。本地网关、程序计算和方案投票本身均不是本文的独创。</w:t>
+        <w:t>PlanTwin [1] 研究本地规划抽象，ToolMinimize [2] 与 MINIM [3] 约束工具调用和观察视图；ATR [4] 已研究决策依赖与选择性重验证。FreshCtx [5] 提供可嵌入的上下文时效检查。因此，数据裁剪、依赖失效和程序辅助计算 [6] 本身不能作为本文的新颖性主张。</w:t>
       </w:r>
     </w:p>
     <w:p>
@@ -260,7 +260,7 @@
           <w:color w:val="000000"/>
           <w:sz w:val="18"/>
         </w:rPr>
-        <w:t>本文面向数据管理中的运行时访问控制与计算放置问题，将接收方视图、源值依赖和实际请求纳入同一执行记录。观众可以沿一次任务追溯“为何在此处计算、为何发送这些字段、实际发送是否一致”，而不只看到最终回答。</w:t>
+        <w:t>本文关注其交汇处：在信息已经发送、无法撤回的条件下，结合各接收方的披露历史，为当前已知步骤选择等价输入方案，并在变化后重建剩余执行。我们给出有限候选下的精确选择、包含未选候选的依赖核验，以及结果复用和真实接收记录的一体化实现。</w:t>
       </w:r>
     </w:p>
     <w:p>
@@ -277,7 +277,7 @@
           <w:color w:val="000000"/>
           <w:sz w:val="18"/>
         </w:rPr>
-        <w:t>系统实现事实补充与本地计算两条路径，并加入按候选算式分歧选择有界补充字段的实验机制。贡献包括可核验的执行原型、保持表结构的数值视图，以及带同能力对照和失败记录的演示。我们不将句法最小集合等同于语义最小共享。</w:t>
+        <w:t>演示不是将“裁剪越多越好”作为结论。观众可改变限额、撤销接收方授权或添加步骤，比较完整重跑、逐步贪心和后续规划，看到不同信息项减少时传输量仍可能上升。该取舍由可复算记录支持，而非仅由界面呈现。</w:t>
       </w:r>
     </w:p>
     <w:p>
@@ -304,7 +304,7 @@
           <w:color w:val="000000"/>
           <w:sz w:val="18"/>
         </w:rPr>
-        <w:t>2  按步执行机制</w:t>
+        <w:t>2  面向接收方的后续执行</w:t>
       </w:r>
     </w:p>
     <w:p>
@@ -320,7 +320,7 @@
           <w:color w:val="000000"/>
           <w:sz w:val="18"/>
         </w:rPr>
-        <w:t>2.1  执行位置与接收方视图</w:t>
+        <w:t>2.1  执行候选与披露历史</w:t>
       </w:r>
     </w:p>
     <w:p>
@@ -337,7 +337,24 @@
           <w:color w:val="000000"/>
           <w:sz w:val="18"/>
         </w:rPr>
-        <w:t>本地状态 S 保存原始事实与查询结果。对登记操作 o，本地规则适用时直接执行；否则为接收方 r 选择字段 K，并构造视图：</w:t>
+        <w:t>版本化状态 S 保存源事实、授权和本地能力。对登记操作 o，候选 a 指定接收方 r、输入视图 V 及其依赖。视图可以包含原值或本地派生值；登记算子须保证不同输入形式产生相同任务结果。模型不能任意增加字段或执行生成脚本。</w:t>
+      </w:r>
+    </w:p>
+    <w:p>
+      <w:pPr>
+        <w:spacing w:after="40" w:line="246" w:lineRule="auto"/>
+        <w:ind w:firstLine="230"/>
+        <w:jc w:val="both"/>
+      </w:pPr>
+      <w:r>
+        <w:rPr>
+          <w:rFonts w:ascii="Linux Libertine" w:hAnsi="Linux Libertine" w:eastAsia="SimSun"/>
+          <w:b w:val="0"/>
+          <w:i w:val="0"/>
+          <w:color w:val="000000"/>
+          <w:sz w:val="18"/>
+        </w:rPr>
+        <w:t>一次披露按接收方、字段及其值与来源版本的指纹计数。令 E(a) 为候选披露项集合，H 为此前发送的集合；本地执行的 E(a) 为空。准备发送时保守地更新历史：</w:t>
       </w:r>
     </w:p>
     <w:p>
@@ -350,7 +367,22 @@
           <m:sSub>
             <m:e>
               <m:r>
-                <m:t>V</m:t>
+                <m:t>H</m:t>
+              </m:r>
+            </m:e>
+            <m:sub>
+              <m:r>
+                <m:t>t+1</m:t>
+              </m:r>
+            </m:sub>
+          </m:sSub>
+          <m:r>
+            <m:t>=</m:t>
+          </m:r>
+          <m:sSub>
+            <m:e>
+              <m:r>
+                <m:t>H</m:t>
               </m:r>
             </m:e>
             <m:sub>
@@ -360,36 +392,12 @@
             </m:sub>
           </m:sSub>
           <m:r>
-            <m:t>=</m:t>
+            <m:t>∪E(</m:t>
           </m:r>
           <m:sSub>
             <m:e>
               <m:r>
-                <m:t>π</m:t>
-              </m:r>
-            </m:e>
-            <m:sub>
-              <m:sSub>
-                <m:e>
-                  <m:r>
-                    <m:t>K</m:t>
-                  </m:r>
-                </m:e>
-                <m:sub>
-                  <m:r>
-                    <m:t>t</m:t>
-                  </m:r>
-                </m:sub>
-              </m:sSub>
-            </m:sub>
-          </m:sSub>
-          <m:r>
-            <m:t>(</m:t>
-          </m:r>
-          <m:sSub>
-            <m:e>
-              <m:r>
-                <m:t>S</m:t>
+                <m:t>a</m:t>
               </m:r>
             </m:e>
             <m:sub>
@@ -428,87 +436,23 @@
           <w:color w:val="000000"/>
           <w:sz w:val="18"/>
         </w:rPr>
-        <w:t>t 表示一次外部调用。初始选择器使用登记字段与文本规则，可能漏选。模型可以申请字段 G；本地核验存在性、授权、新增性及轮数，再更新 K：</w:t>
+        <w:t>同一字段发送给不同接收方分别计数；派生值也计数。源版本变化后再次发送计为新项。H 不随重试或局部修复回退。该指标描述显式披露，不度量敏感性，也不排除接收方通过多个值联合推断。</w:t>
       </w:r>
     </w:p>
     <w:p>
       <w:pPr>
-        <w:spacing w:before="60" w:after="60"/>
-        <w:jc w:val="center"/>
+        <w:keepNext/>
+        <w:spacing w:before="80" w:after="40"/>
       </w:pPr>
-      <m:oMathPara>
-        <m:oMath>
-          <m:sSub>
-            <m:e>
-              <m:r>
-                <m:t>K</m:t>
-              </m:r>
-            </m:e>
-            <m:sub>
-              <m:r>
-                <m:t>t+1</m:t>
-              </m:r>
-            </m:sub>
-          </m:sSub>
-          <m:r>
-            <m:t>=</m:t>
-          </m:r>
-          <m:sSub>
-            <m:e>
-              <m:r>
-                <m:t>K</m:t>
-              </m:r>
-            </m:e>
-            <m:sub>
-              <m:r>
-                <m:t>t</m:t>
-              </m:r>
-            </m:sub>
-          </m:sSub>
-          <m:r>
-            <m:t>∪</m:t>
-          </m:r>
-          <m:sSub>
-            <m:e>
-              <m:r>
-                <m:t>G</m:t>
-              </m:r>
-            </m:e>
-            <m:sub>
-              <m:r>
-                <m:t>t</m:t>
-              </m:r>
-            </m:sub>
-          </m:sSub>
-          <m:r>
-            <m:t>,</m:t>
-          </m:r>
-          <m:sSub>
-            <m:e>
-              <m:r>
-                <m:t>G</m:t>
-              </m:r>
-            </m:e>
-            <m:sub>
-              <m:r>
-                <m:t>t</m:t>
-              </m:r>
-            </m:sub>
-          </m:sSub>
-          <m:r>
-            <m:t>⊆A(o,r)</m:t>
-          </m:r>
-        </m:oMath>
-      </m:oMathPara>
       <w:r>
         <w:rPr>
-          <w:rFonts w:ascii="Linux Libertine" w:hAnsi="Linux Libertine" w:eastAsia="SimSun"/>
-          <w:b w:val="0"/>
+          <w:rFonts w:ascii="Linux Libertine" w:hAnsi="Linux Libertine" w:eastAsia="SimHei"/>
+          <w:b/>
           <w:i w:val="0"/>
           <w:color w:val="000000"/>
-          <w:sz w:val="16"/>
+          <w:sz w:val="18"/>
         </w:rPr>
-        <w:t xml:space="preserve">  (2)</w:t>
+        <w:t>2.2  比较当前已知的后续方案</w:t>
       </w:r>
     </w:p>
     <w:p>
@@ -525,74 +469,7 @@
           <w:color w:val="000000"/>
           <w:sz w:val="18"/>
         </w:rPr>
-        <w:t>A(o,r) 是独立于评价标签的授权集合，排除身份、联系方式、账号、内部备注及无关记录。获准不等于必要。合同与学习任务最多补充两轮、分析六轮；越权或超限即失败。</w:t>
-      </w:r>
-    </w:p>
-    <w:p>
-      <w:pPr>
-        <w:spacing w:after="40" w:line="246" w:lineRule="auto"/>
-        <w:ind w:firstLine="230"/>
-        <w:jc w:val="both"/>
-      </w:pPr>
-      <w:r>
-        <w:rPr>
-          <w:rFonts w:ascii="Linux Libertine" w:hAnsi="Linux Libertine" w:eastAsia="SimSun"/>
-          <w:b w:val="0"/>
-          <w:i w:val="0"/>
-          <w:color w:val="000000"/>
-          <w:sz w:val="18"/>
-        </w:rPr>
-        <w:t>若模型请求资料，控制器另建仅含登记编号与版本的工具视图，将返回正文与出处写入 S。给模型的授权不会自动延伸至资料服务；原型只支持登记操作。</w:t>
-      </w:r>
-    </w:p>
-    <w:p>
-      <w:pPr>
-        <w:keepNext/>
-        <w:spacing w:before="80" w:after="40"/>
-      </w:pPr>
-      <w:r>
-        <w:rPr>
-          <w:rFonts w:ascii="Linux Libertine" w:hAnsi="Linux Libertine" w:eastAsia="SimHei"/>
-          <w:b/>
-          <w:i w:val="0"/>
-          <w:color w:val="000000"/>
-          <w:sz w:val="18"/>
-        </w:rPr>
-        <w:t>2.2  将可表达的计算留在本地</w:t>
-      </w:r>
-    </w:p>
-    <w:p>
-      <w:pPr>
-        <w:spacing w:after="40" w:line="246" w:lineRule="auto"/>
-        <w:ind w:firstLine="230"/>
-        <w:jc w:val="both"/>
-      </w:pPr>
-      <w:r>
-        <w:rPr>
-          <w:rFonts w:ascii="Linux Libertine" w:hAnsi="Linux Libertine" w:eastAsia="SimSun"/>
-          <w:b w:val="0"/>
-          <w:i w:val="0"/>
-          <w:color w:val="000000"/>
-          <w:sz w:val="18"/>
-        </w:rPr>
-        <w:t>数值任务可由云端根据问题与表结构提出有限表达式 p，参数限于获准字段、常数或前序结果。本地解释器拒绝未知算子、循环引用、非有限结果及无用中间节点，不执行生成脚本。</w:t>
-      </w:r>
-    </w:p>
-    <w:p>
-      <w:pPr>
-        <w:spacing w:after="40" w:line="246" w:lineRule="auto"/>
-        <w:ind w:firstLine="230"/>
-        <w:jc w:val="both"/>
-      </w:pPr>
-      <w:r>
-        <w:rPr>
-          <w:rFonts w:ascii="Linux Libertine" w:hAnsi="Linux Libertine" w:eastAsia="SimSun"/>
-          <w:b w:val="0"/>
-          <w:i w:val="0"/>
-          <w:color w:val="000000"/>
-          <w:sz w:val="18"/>
-        </w:rPr>
-        <w:t>解释器返回计算值及实际读取的字段集合 Read(p)。记录的依赖摘要为：</w:t>
+        <w:t>设 Q 为已知待执行步骤，P(Q,S) 为满足当前授权与能力的候选组合。方案 p 的新增披露及外部执行量 W(p) 定义为：</w:t>
       </w:r>
     </w:p>
     <w:p>
@@ -602,59 +479,81 @@
       </w:pPr>
       <m:oMathPara>
         <m:oMath>
-          <m:sSub>
+          <m:r>
+            <m:t>D(p)=(</m:t>
+          </m:r>
+          <m:nary>
+            <m:naryPr>
+              <m:chr m:val="⋃"/>
+              <m:limLoc m:val="undOvr"/>
+              <m:grow m:val="1"/>
+              <m:subHide m:val="off"/>
+              <m:supHide m:val="on"/>
+            </m:naryPr>
+            <m:sub>
+              <m:r>
+                <m:t>a∈p</m:t>
+              </m:r>
+            </m:sub>
+            <m:sup/>
             <m:e>
               <m:r>
-                <m:t>D</m:t>
+                <m:t>E(a))∖H</m:t>
               </m:r>
             </m:e>
-            <m:sub>
-              <m:r>
-                <m:t>t</m:t>
-              </m:r>
-            </m:sub>
-          </m:sSub>
-          <m:r>
-            <m:t>=H(</m:t>
-          </m:r>
-          <m:sSub>
-            <m:e>
-              <m:r>
-                <m:t>S</m:t>
-              </m:r>
-            </m:e>
-            <m:sub>
-              <m:r>
-                <m:t>t</m:t>
-              </m:r>
-            </m:sub>
-          </m:sSub>
-          <m:r>
-            <m:t>[</m:t>
-          </m:r>
-          <m:r>
-            <m:rPr>
-              <m:sty m:val="p"/>
-            </m:rPr>
-            <m:t>Read</m:t>
-          </m:r>
-          <m:r>
-            <m:t>(</m:t>
-          </m:r>
-          <m:sSub>
+          </m:nary>
+        </m:oMath>
+      </m:oMathPara>
+      <w:r>
+        <w:rPr>
+          <w:rFonts w:ascii="Linux Libertine" w:hAnsi="Linux Libertine" w:eastAsia="SimSun"/>
+          <w:b w:val="0"/>
+          <w:i w:val="0"/>
+          <w:color w:val="000000"/>
+          <w:sz w:val="16"/>
+        </w:rPr>
+        <w:t xml:space="preserve">  (2)</w:t>
+      </w:r>
+    </w:p>
+    <w:p>
+      <w:pPr>
+        <w:spacing w:before="60" w:after="60"/>
+        <w:jc w:val="center"/>
+      </w:pPr>
+      <m:oMathPara>
+        <m:oMath>
+          <m:sSup>
             <m:e>
               <m:r>
                 <m:t>p</m:t>
               </m:r>
             </m:e>
-            <m:sub>
+            <m:sup>
               <m:r>
-                <m:t>t</m:t>
+                <m:t>*</m:t>
               </m:r>
-            </m:sub>
-          </m:sSub>
+            </m:sup>
+          </m:sSup>
           <m:r>
-            <m:t>)])</m:t>
+            <m:t>=</m:t>
+          </m:r>
+          <m:limLow>
+            <m:e>
+              <m:r>
+                <m:rPr>
+                  <m:nor/>
+                </m:rPr>
+                <m:t>arg min lex</m:t>
+              </m:r>
+            </m:e>
+            <m:lim>
+              <m:r>
+                <m:t>p∈P(Q,S)</m:t>
+              </m:r>
+            </m:lim>
+          </m:limLow>
+          <m:r>
+            <m:t>(|D(p)|,W(p))</m:t>
           </m:r>
         </m:oMath>
       </m:oMathPara>
@@ -683,7 +582,84 @@
           <w:color w:val="000000"/>
           <w:sz w:val="18"/>
         </w:rPr>
-        <w:t>实现逐字段保存摘要并在本地组装结果。云端可见问题、标签、年份和单位，不接收业务数值或计算结果。依赖记录不能证明程序理解正确，也不能排除从结构推断信息。</w:t>
+        <w:t>式（3）先减少不同披露项，再以外部执行量打破平局。搜索逐步扩展标签 (E,w)，其中 E 包含历史与当前前缀的披露，w 为前缀外部执行数。同一深度满足下式时，可删除第二个标签：</w:t>
+      </w:r>
+    </w:p>
+    <w:p>
+      <w:pPr>
+        <w:spacing w:before="60" w:after="60"/>
+        <w:jc w:val="center"/>
+      </w:pPr>
+      <m:oMathPara>
+        <m:oMath>
+          <m:sSub>
+            <m:e>
+              <m:r>
+                <m:t>E</m:t>
+              </m:r>
+            </m:e>
+            <m:sub>
+              <m:r>
+                <m:t>1</m:t>
+              </m:r>
+            </m:sub>
+          </m:sSub>
+          <m:r>
+            <m:t>⊆</m:t>
+          </m:r>
+          <m:sSub>
+            <m:e>
+              <m:r>
+                <m:t>E</m:t>
+              </m:r>
+            </m:e>
+            <m:sub>
+              <m:r>
+                <m:t>2</m:t>
+              </m:r>
+            </m:sub>
+          </m:sSub>
+          <m:r>
+            <m:t>∧</m:t>
+          </m:r>
+          <m:sSub>
+            <m:e>
+              <m:r>
+                <m:t>w</m:t>
+              </m:r>
+            </m:e>
+            <m:sub>
+              <m:r>
+                <m:t>1</m:t>
+              </m:r>
+            </m:sub>
+          </m:sSub>
+          <m:r>
+            <m:t>≤</m:t>
+          </m:r>
+          <m:sSub>
+            <m:e>
+              <m:r>
+                <m:t>w</m:t>
+              </m:r>
+            </m:e>
+            <m:sub>
+              <m:r>
+                <m:t>2</m:t>
+              </m:r>
+            </m:sub>
+          </m:sSub>
+        </m:oMath>
+      </m:oMathPara>
+      <w:r>
+        <w:rPr>
+          <w:rFonts w:ascii="Linux Libertine" w:hAnsi="Linux Libertine" w:eastAsia="SimSun"/>
+          <w:b w:val="0"/>
+          <w:i w:val="0"/>
+          <w:color w:val="000000"/>
+          <w:sz w:val="16"/>
+        </w:rPr>
+        <w:t xml:space="preserve">  (4)</w:t>
       </w:r>
     </w:p>
     <w:p>
@@ -700,7 +676,7 @@
           <w:color w:val="000000"/>
           <w:sz w:val="18"/>
         </w:rPr>
-        <w:t>转换器保留原始行列位置、年份和单位，用字段标识替换业务数值。无法确定的合并表头保持原有网格。运行时从原表重建并核对缓存，防止结构与源值不一致。</w:t>
+        <w:t>当候选输出等价、后续可行性不依赖所选表示时，为两标签追加同一后缀保持上述关系，因此剪枝不丢失式（3）的最优解。最坏标签数仍为指数级；实现超过 4,096 个标签即明确失败。这里不声称新的通用动态规划，也不声称对尚未发现的步骤全局最优。</w:t>
       </w:r>
     </w:p>
     <w:p>
@@ -716,7 +692,7 @@
           <w:color w:val="000000"/>
           <w:sz w:val="18"/>
         </w:rPr>
-        <w:t>2.3  按分歧选择补充字段</w:t>
+        <w:t>一个逐步选择失效的例子</w:t>
       </w:r>
     </w:p>
     <w:p>
@@ -733,62 +709,12 @@
           <w:color w:val="000000"/>
           <w:sz w:val="18"/>
         </w:rPr>
-        <w:t>实验模式规范化三个候选算式。对每对不同候选，依赖不同则取对称差，依赖相同但算子不同则取并集，得到集合 C。可行 K 须获授权、至多含三个字段，且与每个 C 相交。选择：</w:t>
+        <w:t>设两个步骤均可向服务甲发送同一对原值 {x,y}；另一条路径向服务乙分别发送一个派生值 {u} 与两个不同派生值 {v,w}。逐步贪心先选乙，只披露一项；第二步无论选哪条路径，累计都至少为三项。后续规划连续选择甲，累计只有两项，但会传输四个字段。该例说明为什么披露集合与传输次数须分别衡量。</w:t>
       </w:r>
     </w:p>
     <w:p>
       <w:pPr>
-        <w:spacing w:before="60" w:after="60"/>
-        <w:jc w:val="center"/>
-      </w:pPr>
-      <m:oMathPara>
-        <m:oMath>
-          <m:sSup>
-            <m:e>
-              <m:r>
-                <m:t>K</m:t>
-              </m:r>
-            </m:e>
-            <m:sup>
-              <m:r>
-                <m:t>*</m:t>
-              </m:r>
-            </m:sup>
-          </m:sSup>
-          <m:r>
-            <m:t>=</m:t>
-          </m:r>
-          <m:limLow>
-            <m:e>
-              <m:r>
-                <m:t>arg min</m:t>
-              </m:r>
-            </m:e>
-            <m:lim>
-              <m:r>
-                <m:t>K</m:t>
-              </m:r>
-            </m:lim>
-          </m:limLow>
-          <m:r>
-            <m:t>|K|</m:t>
-          </m:r>
-        </m:oMath>
-      </m:oMathPara>
-      <w:r>
-        <w:rPr>
-          <w:rFonts w:ascii="Linux Libertine" w:hAnsi="Linux Libertine" w:eastAsia="SimSun"/>
-          <w:b w:val="0"/>
-          <w:i w:val="0"/>
-          <w:color w:val="000000"/>
-          <w:sz w:val="16"/>
-        </w:rPr>
-        <w:t xml:space="preserve">  (4)</w:t>
-      </w:r>
-    </w:p>
-    <w:p>
-      <w:pPr>
-        <w:spacing w:after="20" w:line="246" w:lineRule="auto"/>
+        <w:spacing w:after="40" w:line="246" w:lineRule="auto"/>
         <w:ind w:firstLine="230"/>
         <w:jc w:val="both"/>
       </w:pPr>
@@ -800,7 +726,7 @@
           <w:color w:val="000000"/>
           <w:sz w:val="18"/>
         </w:rPr>
-        <w:t>分支搜索保留最小基数解，标识顺序打破平局；无法覆盖则停止。复核接收候选程序与获准字段，不接收本地结果。至多三组句法约束下的最小覆盖，不保证语义充分或答案正确。</w:t>
+        <w:t>这一比较只在等价实现之间成立。若某个服务无法完成步骤，即使披露更少也不能选择；如果派生方式改变后续语义，则不能使用上述剪枝保证。登记与授权先限定可行方案，式（3）只在其中进行选择。</w:t>
       </w:r>
     </w:p>
     <w:p>
@@ -824,7 +750,7 @@
           <w:color w:val="000000"/>
           <w:sz w:val="18"/>
         </w:rPr>
-        <w:t>2.4  复核最后实际发送的内容</w:t>
+        <w:t>2.3  核验决策，而不只核验请求字段</w:t>
       </w:r>
     </w:p>
     <w:p>
@@ -841,7 +767,7 @@
           <w:color w:val="000000"/>
           <w:sz w:val="18"/>
         </w:rPr>
-        <w:t>视图确定后，请求仍可能被改写。控制器为最终序列化载荷 B 建立一次性凭据，绑定操作、接收方、授权版本 v、所用源字段摘要 D 与请求摘要：</w:t>
+        <w:t>请求未改变，不代表原决定仍合适。例如，本地能力变为可用时，旧外发载荷可以逐字相同。系统因此记录所有候选的源值与能力、授权、端点读取，包括未选候选；派生字段展开为传递依赖。</w:t>
       </w:r>
     </w:p>
     <w:p>
@@ -851,50 +777,47 @@
       </w:pPr>
       <m:oMathPara>
         <m:oMath>
+          <m:r>
+            <m:t>Δ=</m:t>
+          </m:r>
           <m:sSub>
             <m:e>
               <m:r>
-                <m:t>T</m:t>
+                <m:t>Δ</m:t>
               </m:r>
             </m:e>
             <m:sub>
               <m:r>
-                <m:t>t</m:t>
+                <m:rPr>
+                  <m:nor/>
+                </m:rPr>
+                <m:t>值</m:t>
               </m:r>
             </m:sub>
           </m:sSub>
           <m:r>
-            <m:t>=(</m:t>
+            <m:t>∪</m:t>
           </m:r>
           <m:sSub>
             <m:e>
               <m:r>
-                <m:t>o</m:t>
+                <m:t>Δ</m:t>
               </m:r>
             </m:e>
             <m:sub>
               <m:r>
-                <m:t>t</m:t>
+                <m:rPr>
+                  <m:nor/>
+                </m:rPr>
+                <m:t>规划</m:t>
               </m:r>
             </m:sub>
           </m:sSub>
           <m:r>
             <m:t>,</m:t>
           </m:r>
-          <m:sSub>
-            <m:e>
-              <m:r>
-                <m:t>r</m:t>
-              </m:r>
-            </m:e>
-            <m:sub>
-              <m:r>
-                <m:t>t</m:t>
-              </m:r>
-            </m:sub>
-          </m:sSub>
           <m:r>
-            <m:t>,</m:t>
+            <m:t>∀k∈Δ:v(k)=</m:t>
           </m:r>
           <m:sSub>
             <m:e>
@@ -904,42 +827,15 @@
             </m:e>
             <m:sub>
               <m:r>
-                <m:t>t</m:t>
+                <m:rPr>
+                  <m:nor/>
+                </m:rPr>
+                <m:t>当前</m:t>
               </m:r>
             </m:sub>
           </m:sSub>
           <m:r>
-            <m:t>,</m:t>
-          </m:r>
-          <m:sSub>
-            <m:e>
-              <m:r>
-                <m:t>D</m:t>
-              </m:r>
-            </m:e>
-            <m:sub>
-              <m:r>
-                <m:t>t</m:t>
-              </m:r>
-            </m:sub>
-          </m:sSub>
-          <m:r>
-            <m:t>,H(</m:t>
-          </m:r>
-          <m:sSub>
-            <m:e>
-              <m:r>
-                <m:t>B</m:t>
-              </m:r>
-            </m:e>
-            <m:sub>
-              <m:r>
-                <m:t>t</m:t>
-              </m:r>
-            </m:sub>
-          </m:sSub>
-          <m:r>
-            <m:t>))</m:t>
+            <m:t>(k)</m:t>
           </m:r>
         </m:oMath>
       </m:oMathPara>
@@ -968,7 +864,7 @@
           <w:color w:val="000000"/>
           <w:sz w:val="18"/>
         </w:rPr>
-        <w:t>发送前任一绑定项改变即拒绝。内部凭据与展示副本分离，避免修改展示元数据影响源值核验。接收进程记录实际字节；适配器另外记录加入固定非思考参数后的供应商载荷，两者由复算脚本对应核验。</w:t>
+        <w:t>凭据将这些版本、接收方与最终序列化请求绑定。任一依赖变化即放弃未发送请求，重新规划；没有使用的源字段变化不触发失效。单调版本号能发现值变化后又恢复的情况。版本核验是保守条件，失效不一定意味着旧请求会产生错误答案。</w:t>
       </w:r>
     </w:p>
     <w:p>
@@ -987,13 +883,13 @@
           <w:color w:val="000000"/>
           <w:sz w:val="18"/>
         </w:rPr>
-        <w:t>算法 1  按步执行与出域判定</w:t>
+        <w:t>算法 1  面向接收方的后续规划与局部修复</w:t>
       </w:r>
     </w:p>
     <w:p>
       <w:pPr>
         <w:keepNext/>
-        <w:spacing w:after="0" w:line="252" w:lineRule="auto"/>
+        <w:spacing w:after="0" w:line="245" w:lineRule="auto"/>
       </w:pPr>
       <w:r>
         <w:rPr>
@@ -1003,13 +899,13 @@
           <w:color w:val="000000"/>
           <w:sz w:val="16"/>
         </w:rPr>
-        <w:t>Input: state S, operation registry R, policy P</w:t>
+        <w:t>Input: versioned state S, pending steps Q, registry R</w:t>
       </w:r>
     </w:p>
     <w:p>
       <w:pPr>
         <w:keepNext/>
-        <w:spacing w:after="0" w:line="252" w:lineRule="auto"/>
+        <w:spacing w:after="0" w:line="245" w:lineRule="auto"/>
       </w:pPr>
       <w:r>
         <w:rPr>
@@ -1019,13 +915,13 @@
           <w:color w:val="000000"/>
           <w:sz w:val="16"/>
         </w:rPr>
-        <w:t>Output: local result and checked execution trace</w:t>
+        <w:t>Output: checked results C and disclosure history H</w:t>
       </w:r>
     </w:p>
     <w:p>
       <w:pPr>
         <w:keepNext/>
-        <w:spacing w:after="0" w:line="252" w:lineRule="auto"/>
+        <w:spacing w:after="0" w:line="245" w:lineRule="auto"/>
       </w:pPr>
       <w:r>
         <w:rPr>
@@ -1035,13 +931,13 @@
           <w:color w:val="000000"/>
           <w:sz w:val="16"/>
         </w:rPr>
-        <w:t>1:  while a registered operation o is pending do</w:t>
+        <w:t>1:  C ← ∅; H ← ∅</w:t>
       </w:r>
     </w:p>
     <w:p>
       <w:pPr>
         <w:keepNext/>
-        <w:spacing w:after="0" w:line="252" w:lineRule="auto"/>
+        <w:spacing w:after="0" w:line="245" w:lineRule="auto"/>
       </w:pPr>
       <w:r>
         <w:rPr>
@@ -1051,13 +947,13 @@
           <w:color w:val="000000"/>
           <w:sz w:val="16"/>
         </w:rPr>
-        <w:t>2:      if LocalRule(o, S) is applicable then</w:t>
+        <w:t>2:  while Q is not empty do</w:t>
       </w:r>
     </w:p>
     <w:p>
       <w:pPr>
         <w:keepNext/>
-        <w:spacing w:after="0" w:line="252" w:lineRule="auto"/>
+        <w:spacing w:after="0" w:line="245" w:lineRule="auto"/>
       </w:pPr>
       <w:r>
         <w:rPr>
@@ -1067,13 +963,13 @@
           <w:color w:val="000000"/>
           <w:sz w:val="16"/>
         </w:rPr>
-        <w:t>3:          S ← Merge(S, LocalRule(o, S)); continue</w:t>
+        <w:t>3:      A, Δ ← EnumerateAlternatives(S, Q, R)</w:t>
       </w:r>
     </w:p>
     <w:p>
       <w:pPr>
         <w:keepNext/>
-        <w:spacing w:after="0" w:line="252" w:lineRule="auto"/>
+        <w:spacing w:after="0" w:line="245" w:lineRule="auto"/>
       </w:pPr>
       <w:r>
         <w:rPr>
@@ -1083,13 +979,13 @@
           <w:color w:val="000000"/>
           <w:sz w:val="16"/>
         </w:rPr>
-        <w:t>4:      (r, K) ← InitialView(o, R, S)</w:t>
+        <w:t>4:      p ← FrontierPlan(A, H)</w:t>
       </w:r>
     </w:p>
     <w:p>
       <w:pPr>
         <w:keepNext/>
-        <w:spacing w:after="0" w:line="252" w:lineRule="auto"/>
+        <w:spacing w:after="0" w:line="245" w:lineRule="auto"/>
       </w:pPr>
       <w:r>
         <w:rPr>
@@ -1099,13 +995,13 @@
           <w:color w:val="000000"/>
           <w:sz w:val="16"/>
         </w:rPr>
-        <w:t>5:      repeat within the registered round limit</w:t>
+        <w:t>5:      if p is infeasible then return BLOCKED</w:t>
       </w:r>
     </w:p>
     <w:p>
       <w:pPr>
         <w:keepNext/>
-        <w:spacing w:after="0" w:line="252" w:lineRule="auto"/>
+        <w:spacing w:after="0" w:line="245" w:lineRule="auto"/>
       </w:pPr>
       <w:r>
         <w:rPr>
@@ -1115,13 +1011,13 @@
           <w:color w:val="000000"/>
           <w:sz w:val="16"/>
         </w:rPr>
-        <w:t>6:          B ← Serialize(o, Project(S, K))</w:t>
+        <w:t>6:      a ← First(p); B ← Serialize(a)</w:t>
       </w:r>
     </w:p>
     <w:p>
       <w:pPr>
         <w:keepNext/>
-        <w:spacing w:after="0" w:line="252" w:lineRule="auto"/>
+        <w:spacing w:after="0" w:line="245" w:lineRule="auto"/>
       </w:pPr>
       <w:r>
         <w:rPr>
@@ -1131,13 +1027,13 @@
           <w:color w:val="000000"/>
           <w:sz w:val="16"/>
         </w:rPr>
-        <w:t>7:          T ← Bind(o, r, P.version, S[K], B)</w:t>
+        <w:t>7:      T ← Bind(a, Versions(S, Δ), Hash(B))</w:t>
       </w:r>
     </w:p>
     <w:p>
       <w:pPr>
         <w:keepNext/>
-        <w:spacing w:after="0" w:line="252" w:lineRule="auto"/>
+        <w:spacing w:after="0" w:line="245" w:lineRule="auto"/>
       </w:pPr>
       <w:r>
         <w:rPr>
@@ -1147,13 +1043,13 @@
           <w:color w:val="000000"/>
           <w:sz w:val="16"/>
         </w:rPr>
-        <w:t>8:          RequireCurrentAndUnchanged(T)</w:t>
+        <w:t>8:      if not Current(T, S) then</w:t>
       </w:r>
     </w:p>
     <w:p>
       <w:pPr>
         <w:keepNext/>
-        <w:spacing w:after="0" w:line="252" w:lineRule="auto"/>
+        <w:spacing w:after="0" w:line="245" w:lineRule="auto"/>
       </w:pPr>
       <w:r>
         <w:rPr>
@@ -1163,13 +1059,13 @@
           <w:color w:val="000000"/>
           <w:sz w:val="16"/>
         </w:rPr>
-        <w:t>9:          y, receipt ← SendOnce(T, B)</w:t>
+        <w:t>9:          C ← KeepValidPureResults(C, S)</w:t>
       </w:r>
     </w:p>
     <w:p>
       <w:pPr>
         <w:keepNext/>
-        <w:spacing w:after="0" w:line="252" w:lineRule="auto"/>
+        <w:spacing w:after="0" w:line="245" w:lineRule="auto"/>
       </w:pPr>
       <w:r>
         <w:rPr>
@@ -1179,13 +1075,13 @@
           <w:color w:val="000000"/>
           <w:sz w:val="16"/>
         </w:rPr>
-        <w:t>10:         RequireMatchingReceipt(receipt, B)</w:t>
+        <w:t>10:         Q ← PendingFromCurrentState(C, S)</w:t>
       </w:r>
     </w:p>
     <w:p>
       <w:pPr>
         <w:keepNext/>
-        <w:spacing w:after="0" w:line="252" w:lineRule="auto"/>
+        <w:spacing w:after="0" w:line="245" w:lineRule="auto"/>
       </w:pPr>
       <w:r>
         <w:rPr>
@@ -1195,13 +1091,13 @@
           <w:color w:val="000000"/>
           <w:sz w:val="16"/>
         </w:rPr>
-        <w:t>11:         if y requests additional fields G then</w:t>
+        <w:t>11:         continue</w:t>
       </w:r>
     </w:p>
     <w:p>
       <w:pPr>
         <w:keepNext/>
-        <w:spacing w:after="0" w:line="252" w:lineRule="auto"/>
+        <w:spacing w:after="0" w:line="245" w:lineRule="auto"/>
       </w:pPr>
       <w:r>
         <w:rPr>
@@ -1211,13 +1107,13 @@
           <w:color w:val="000000"/>
           <w:sz w:val="16"/>
         </w:rPr>
-        <w:t>12:             RequireAllowedNewFields(G, o, r)</w:t>
+        <w:t>12:     if a.recipient = local then y ← Evaluate(a)</w:t>
       </w:r>
     </w:p>
     <w:p>
       <w:pPr>
         <w:keepNext/>
-        <w:spacing w:after="0" w:line="252" w:lineRule="auto"/>
+        <w:spacing w:after="0" w:line="245" w:lineRule="auto"/>
       </w:pPr>
       <w:r>
         <w:rPr>
@@ -1227,13 +1123,13 @@
           <w:color w:val="000000"/>
           <w:sz w:val="16"/>
         </w:rPr>
-        <w:t>13:             K ← K ∪ G</w:t>
+        <w:t>13:     else</w:t>
       </w:r>
     </w:p>
     <w:p>
       <w:pPr>
         <w:keepNext/>
-        <w:spacing w:after="0" w:line="252" w:lineRule="auto"/>
+        <w:spacing w:after="0" w:line="245" w:lineRule="auto"/>
       </w:pPr>
       <w:r>
         <w:rPr>
@@ -1243,13 +1139,13 @@
           <w:color w:val="000000"/>
           <w:sz w:val="16"/>
         </w:rPr>
-        <w:t>14:         else if y requests local program p then</w:t>
+        <w:t>14:         RequireUnchanged(T, B)</w:t>
       </w:r>
     </w:p>
     <w:p>
       <w:pPr>
         <w:keepNext/>
-        <w:spacing w:after="0" w:line="252" w:lineRule="auto"/>
+        <w:spacing w:after="0" w:line="245" w:lineRule="auto"/>
       </w:pPr>
       <w:r>
         <w:rPr>
@@ -1259,13 +1155,13 @@
           <w:color w:val="000000"/>
           <w:sz w:val="16"/>
         </w:rPr>
-        <w:t>15:             z, D ← InterpretChecked(p, S)</w:t>
+        <w:t>15:         H ← H ∪ DisclosureTokens(a)</w:t>
       </w:r>
     </w:p>
     <w:p>
       <w:pPr>
         <w:keepNext/>
-        <w:spacing w:after="0" w:line="252" w:lineRule="auto"/>
+        <w:spacing w:after="0" w:line="245" w:lineRule="auto"/>
       </w:pPr>
       <w:r>
         <w:rPr>
@@ -1275,13 +1171,13 @@
           <w:color w:val="000000"/>
           <w:sz w:val="16"/>
         </w:rPr>
-        <w:t>16:             S ← Merge(S, z, D); break</w:t>
+        <w:t>16:         y, receipt ← SendOnce(B)</w:t>
       </w:r>
     </w:p>
     <w:p>
       <w:pPr>
         <w:keepNext/>
-        <w:spacing w:after="0" w:line="252" w:lineRule="auto"/>
+        <w:spacing w:after="0" w:line="245" w:lineRule="auto"/>
       </w:pPr>
       <w:r>
         <w:rPr>
@@ -1291,13 +1187,13 @@
           <w:color w:val="000000"/>
           <w:sz w:val="16"/>
         </w:rPr>
-        <w:t>17:         else if y requests a reference then</w:t>
+        <w:t>17:         VerifyReceipt(receipt, B)</w:t>
       </w:r>
     </w:p>
     <w:p>
       <w:pPr>
         <w:keepNext/>
-        <w:spacing w:after="0" w:line="252" w:lineRule="auto"/>
+        <w:spacing w:after="0" w:line="245" w:lineRule="auto"/>
       </w:pPr>
       <w:r>
         <w:rPr>
@@ -1307,13 +1203,13 @@
           <w:color w:val="000000"/>
           <w:sz w:val="16"/>
         </w:rPr>
-        <w:t>18:             S ← Merge(S, CheckedLookup(y))</w:t>
+        <w:t>18:     C ← SavePureResult(C, y, ValueDeps(a))</w:t>
       </w:r>
     </w:p>
     <w:p>
       <w:pPr>
         <w:keepNext/>
-        <w:spacing w:after="0" w:line="252" w:lineRule="auto"/>
+        <w:spacing w:after="0" w:line="245" w:lineRule="auto"/>
       </w:pPr>
       <w:r>
         <w:rPr>
@@ -1323,45 +1219,13 @@
           <w:color w:val="000000"/>
           <w:sz w:val="16"/>
         </w:rPr>
-        <w:t>19:             K ← RebuildView(o, r, S)</w:t>
-      </w:r>
-    </w:p>
-    <w:p>
-      <w:pPr>
-        <w:keepNext/>
-        <w:spacing w:after="0" w:line="252" w:lineRule="auto"/>
-      </w:pPr>
-      <w:r>
-        <w:rPr>
-          <w:rFonts w:ascii="Linux Libertine" w:hAnsi="Linux Libertine" w:eastAsia="SimSun"/>
-          <w:b w:val="0"/>
-          <w:i w:val="0"/>
-          <w:color w:val="000000"/>
-          <w:sz w:val="16"/>
-        </w:rPr>
-        <w:t>20:         else S ← Merge(S, Validate(y)); break</w:t>
-      </w:r>
-    </w:p>
-    <w:p>
-      <w:pPr>
-        <w:keepNext/>
-        <w:spacing w:after="0" w:line="252" w:lineRule="auto"/>
-      </w:pPr>
-      <w:r>
-        <w:rPr>
-          <w:rFonts w:ascii="Linux Libertine" w:hAnsi="Linux Libertine" w:eastAsia="SimSun"/>
-          <w:b w:val="0"/>
-          <w:i w:val="0"/>
-          <w:color w:val="000000"/>
-          <w:sz w:val="16"/>
-        </w:rPr>
-        <w:t>21:     RequireOperationComplete(o)</w:t>
+        <w:t>19:     Q ← RemoveCompletedAndAppendNew(Q, y)</w:t>
       </w:r>
     </w:p>
     <w:p>
       <w:pPr>
         <w:keepNext w:val="0"/>
-        <w:spacing w:after="0" w:line="252" w:lineRule="auto"/>
+        <w:spacing w:after="0" w:line="245" w:lineRule="auto"/>
         <w:pBdr>
           <w:bottom w:val="single" w:sz="6"/>
         </w:pBdr>
@@ -1374,7 +1238,7 @@
           <w:color w:val="000000"/>
           <w:sz w:val="16"/>
         </w:rPr>
-        <w:t>22: return AssembleLocally(S), Trace</w:t>
+        <w:t>20: return C, H</w:t>
       </w:r>
     </w:p>
     <w:p>
@@ -1391,23 +1255,7 @@
           <w:color w:val="000000"/>
           <w:sz w:val="18"/>
         </w:rPr>
-        <w:t>算法中的操作接口和轮数由登记表限定。模型提出的新步骤保存父步骤和工具调用标识；本地补充与下一次实际发送分别记录。控制器及适配器须可信，性质只覆盖登记出口；它不能阻止网络旁路，也不能撤回已经发送的信息。</w:t>
-      </w:r>
-    </w:p>
-    <w:p>
-      <w:pPr>
-        <w:keepNext/>
-        <w:spacing w:before="80" w:after="40"/>
-      </w:pPr>
-      <w:r>
-        <w:rPr>
-          <w:rFonts w:ascii="Linux Libertine" w:hAnsi="Linux Libertine" w:eastAsia="SimHei"/>
-          <w:b/>
-          <w:i w:val="0"/>
-          <w:color w:val="000000"/>
-          <w:sz w:val="18"/>
-        </w:rPr>
-        <w:t>2.5  依赖检查的含义与代价</w:t>
+        <w:t>结果缓存只适用于无副作用的登记计算，按值依赖决定是否保留；授权变化不能撤回此前披露，但会限制后续发送。没有可行候选时停止。未知副作用和不确定的网络失败不自动重试，控制器与登记出口须可信。</w:t>
       </w:r>
     </w:p>
     <w:p>
@@ -1424,7 +1272,7 @@
           <w:color w:val="000000"/>
           <w:sz w:val="18"/>
         </w:rPr>
-        <w:t>依赖只包含本步使用的源值。修改相关数值会使已准备请求失效，修改未使用字段不影响当前凭据。外发字段与本地计算依赖分开记录：本地读取不等于对外发送；本次未发送也不等于此前从未发送。</w:t>
+        <w:t>接收进程保存原始请求字节、摘要和运行标识，以核对“准备发送”与“实际收到”。该记录不构成远端平台认证，也不提供分布式原子提交保证。FreshCtx 可替换版本检查部分，后续规划与结果复用仍由本系统负责。</w:t>
       </w:r>
     </w:p>
     <w:p>
@@ -1441,7 +1289,7 @@
           <w:color w:val="000000"/>
           <w:sz w:val="18"/>
         </w:rPr>
-        <w:t>有限表达式含 m 个节点时，解释器的顺序执行与依赖遍历需要 O(m) 时间和空间。请求核验随使用字段与载荷长度线性增长。保证范围限于登记出口的访问检查、字节一致性与可重算性，不保证问题理解或信息推断安全。</w:t>
+        <w:t>实现区分两类依赖：规划依赖决定是否要重新选择执行方式，值依赖决定既有结果能否复用。例如，限额变化使待执行的限额检查失效，但先前金额计算只读取基数、比例和天数，其结果仍有效。系统重新核验后保留该结果，不把“所有旧工作都作废”作为默认恢复方式。</w:t>
       </w:r>
     </w:p>
     <w:p>
@@ -1463,7 +1311,7 @@
       <w:r>
         <w:drawing>
           <wp:inline xmlns:a="http://schemas.openxmlformats.org/drawingml/2006/main" xmlns:pic="http://schemas.openxmlformats.org/drawingml/2006/picture">
-            <wp:extent cx="5715000" cy="3420341"/>
+            <wp:extent cx="6080760" cy="3362845"/>
             <wp:docPr id="2" name="Picture 2"/>
             <wp:cNvGraphicFramePr>
               <a:graphicFrameLocks noChangeAspect="1"/>
@@ -1472,7 +1320,7 @@
               <a:graphicData uri="http://schemas.openxmlformats.org/drawingml/2006/picture">
                 <pic:pic>
                   <pic:nvPicPr>
-                    <pic:cNvPr id="0" name="interaction.png"/>
+                    <pic:cNvPr id="0" name="paper-ui.png"/>
                     <pic:cNvPicPr/>
                   </pic:nvPicPr>
                   <pic:blipFill>
@@ -1484,7 +1332,7 @@
                   <pic:spPr>
                     <a:xfrm>
                       <a:off x="0" y="0"/>
-                      <a:ext cx="5715000" cy="3420341"/>
+                      <a:ext cx="6080760" cy="3362845"/>
                     </a:xfrm>
                     <a:prstGeom prst="rect"/>
                   </pic:spPr>
@@ -1508,7 +1356,7 @@
           <w:color w:val="000000"/>
           <w:sz w:val="14"/>
         </w:rPr>
-        <w:t>图 2  公开表格开发示例的真实执行记录。① 从原表核对结构与数值角色；② 右栏显示模型实际收到的问题与表结构，以及本次保留的业务数值；③ 本地执行算式并返回结果。截图裁去导航与源文件卡片，并添加编号；此示例不计入测试。</w:t>
+        <w:t>图 2  限额变化案例的实际执行截图。① 已完成金额计算后，限额改变；② 旧请求失效，系统保留不依赖限额的结果；③ 右侧展示重新规划后的接收方与实际输入。截图裁去导航并添加编号，使用独立开发样例，不计入冻结测试。</w:t>
       </w:r>
     </w:p>
     <w:p>
@@ -1551,7 +1399,7 @@
           <w:color w:val="000000"/>
           <w:sz w:val="18"/>
         </w:rPr>
-        <w:t>演示采用独立研究界面，沿用客户端任务布局。中栏自动推进，右栏显示选中步骤的执行位置、输入、保留字段和接收记录。观众可以取消跟随查看某一步，也可下载请求体、计算表达式和完整轨迹。新增步骤由实际工具调用触发，不由预设动画生成。</w:t>
+        <w:t>界面沿用客户端的双栏任务布局。左侧执行自动推进，右侧随选中步骤展示接收方、发送内容、保留字段与接收记录。观众可暂停跟随检查旧请求，再回到当前步骤；无需逐步点击才能完成任务。展示节奏单独放慢，不计入实验耗时。</w:t>
       </w:r>
     </w:p>
     <w:p>
@@ -1568,7 +1416,7 @@
           <w:color w:val="000000"/>
           <w:sz w:val="18"/>
         </w:rPr>
-        <w:t>首先运行本地规则适用的标准条款，修改金额后重新执行，观察数值变化及零外部调用。随后运行补充事实案例：每日 230 元的条款最初缺少延期天数，模型申请后获得 5 天，再完成计算。选择前后两次分析，可比较接收内容的变化；案例也说明数值正确不保证解释正确。</w:t>
+        <w:t>第一组演示从计费与限额案例开始。观众先运行后续规划，再切换完整重跑，比较相同输入下哪些计算被重复执行。第二个案例撤销本地能力，观察工作转至可用的外部算子；第三个撤销某个接收方授权，观察未发送请求失效和改路。第四个在运行中注入新的登记步骤，显示规划只使用当时已知的信息。</w:t>
       </w:r>
     </w:p>
     <w:p>
@@ -1585,7 +1433,7 @@
           <w:color w:val="000000"/>
           <w:sz w:val="18"/>
         </w:rPr>
-        <w:t>第三个场景在运行中查找指定版本资料：查询仅含编号和版本，后续分析增加返回正文；观众可在发送前撤权。第四个场景使用公开年报表格，先查看年份表头与业务数值的分离，再比较全量、按需和本地计算。营运资金示例读取 2015 年与 2016 年的两个本地数值，得到约 25.43% 的增幅；云端看到列的含义，但不接收数值或计算结果。</w:t>
+        <w:t>这些控制场景使用独立进程执行真实 HTTP 算子，不调用语言模型。它们隔离状态变化与修复行为，不用于证明模型自主发现步骤。真实模型路径另提供保存的 DeepSeek 调用：缺少事实时申请补充、调用资料查询，以及根据表结构提出本地表达式。重放原始调用与读者自带密钥的现场调用明确区分。</w:t>
       </w:r>
     </w:p>
     <w:p>
@@ -1602,7 +1450,7 @@
           <w:color w:val="000000"/>
           <w:sz w:val="18"/>
         </w:rPr>
-        <w:t>实现由 Node.js 控制器、独立 HTTP 接收进程和双语网页构成。合成 PDF 用 PDF.js 读取并与登记字段核对；公开表格读取结构化文件，PDF 仅作预览。无密钥时可执行有限本地规则或重放保存的真实调用；现场 DeepSeek 运行使用读者自己的密钥。展示间隔单独放慢，实验耗时不含这部分时间。</w:t>
+        <w:t>界面和执行器作为独立研究实现公开，不包含商业客户端。每轮可下载原始接收记录与完整轨迹。无密钥即可运行控制案例、核对冻结数据或重放已有模型调用；双语界面展示相同执行状态。</w:t>
       </w:r>
     </w:p>
     <w:p>
@@ -1643,7 +1491,7 @@
           <w:color w:val="000000"/>
           <w:sz w:val="18"/>
         </w:rPr>
-        <w:t>实验前冻结源码、输入、标签与配置。60 页来自 57 份公司年度报告、38 家公司；每例五种方法、重复两次，共 600 次任务。采用 deepseek-flash、temperature=0、每次最多 900 个输出 token，四任务并发；方法次序轮换。1,210 次真实调用均与请求及响应摘要对应。</w:t>
+        <w:t>控制实验在运行前冻结源码、场景与评价规则。四种步骤顺序各取六组数值，交叉十二类变化，共 288 个场景、六种方法与 1,728 次执行。变化涵盖无变化、未用字段、源值、限额、本地能力增减、接收方撤权或替换、全部撤权、版本往返、新步骤和步骤间变化。参数变体不是独立真实业务样本。</w:t>
       </w:r>
     </w:p>
     <w:p>
@@ -1660,7 +1508,7 @@
           <w:color w:val="000000"/>
           <w:sz w:val="18"/>
         </w:rPr>
-        <w:t>表格取自 FinQA [6] 官方数据的受限子集：问题只依赖表格，标注算子受支持，操作数可唯一定位。按固定摘要顺序选择页面，并排除此前测试与开发使用的全部公司年度报告。旧批次的六个开发题及六个诊断题只用于修复接口与表头；本轮测试没有按模型表现筛题。数据可能在模型训练中出现。</w:t>
+        <w:t>六种方法为：仅检查载荷直接字段的消融、完整重跑、局部修复与逐步贪心、局部修复与后续规划，以及 FreshCtx 分别搭配完整重跑和后续规划。除消融外，方法获得相同的完整依赖。FreshCtx 固定为 0.16.0，实际调用其观察—推理—执行检查；重跑策略由本实验提供，不是该库的固有限制。</w:t>
       </w:r>
     </w:p>
     <w:p>
@@ -1677,7 +1525,7 @@
           <w:color w:val="000000"/>
           <w:sz w:val="18"/>
         </w:rPr>
-        <w:t>五种方法共享修正后的表结构、权限与解释器。全量与本地计算各规划一次，前者传输数值，后者只传结构；按需方法先申请单元格。无数值复核与分歧补充均先独立提出三个方案，再在不一致时复核；两者的复核提示相同，区别是是否提供式（4）的字段。默认采用单次本地计算。</w:t>
+        <w:t>评价区分结果正确、版本契约符合和授权有效。每种方法有 264 个可完成场景及 24 个必须阻止的全部撤权场景；正确阻止计为契约符合，不计为完成任务。独立脚本重建状态、重算算子并核对全部 3,684 条 HTTP 接收记录，同时统计不同披露项、重复传输字段、外部执行和结果复用。</w:t>
       </w:r>
     </w:p>
     <w:p>
@@ -1694,7 +1542,7 @@
           <w:color w:val="000000"/>
           <w:sz w:val="18"/>
         </w:rPr>
-        <w:t>按原始 exe_ans 评分，绝对容差为 0.00005；错误及异常均计入分母。业务数值按实际请求累计，重复发送重复计数；标签、年份和单位仍可见。耗时包含结构重建、调用与检查，排除界面放慢。两次结果先在案例内平均，再按年度报告做 4,000 次配对聚类重采样。</w:t>
+        <w:t>另保留基于 FinQA [7] 的独立模型实验：60 页来自 57 份公司年报，五种方法各重复两次，共 600 次任务、1,210 次真实 DeepSeek 调用。表结构对照已修正，开发用公司年报被排除。该数据评价模型提出本地计算的有效性，不与控制实验合并，也不作为局部修复算法的效果证据。</w:t>
       </w:r>
     </w:p>
     <w:p>
@@ -1762,7 +1610,7 @@
           <w:color w:val="000000"/>
           <w:sz w:val="14"/>
         </w:rPr>
-        <w:t>图 3  最新冻结表格实验。a–c，正确性、业务数值外发与执行耗时；d，本地计算相对各对照的通过率差及报告聚类区间；e，实际调用；f，结构一致但答案错误的任务。每种方法 120 次任务，失败均保留。</w:t>
+        <w:t>图 3  a–e：288 个受控场景的六方法比较，F 表示 FreshCtx；契约符合包含正确阻止。d：完整重跑与后续规划的逐场景执行次数差；e：不同披露项与重复传输量的取舍。f：独立保存的真实模型数值实验，不能与 a–e 合并解释。</w:t>
       </w:r>
     </w:p>
     <w:p>
@@ -1788,7 +1636,7 @@
           <w:color w:val="000000"/>
           <w:sz w:val="18"/>
         </w:rPr>
-        <w:t>5  结果与适用边界</w:t>
+        <w:t>5  结果与讨论</w:t>
       </w:r>
     </w:p>
     <w:p>
@@ -1805,7 +1653,7 @@
           <w:color w:val="000000"/>
           <w:sz w:val="18"/>
         </w:rPr>
-        <w:t>图 3 显示单次本地计算通过 98/120 次，全部数值为 96/120，按需单元格为 94/120。对应每任务业务数值发送量为 0、14.833 和 2.417；调用总数为 120、120 和 236。本地计算相对全量的通过率差为 1.67 个百分点，描述性 95% 区间为 [−5.83, 9.02]，不能据此声称更优或不劣。</w:t>
+        <w:t>完整依赖方法均在 264 个可行场景中给出正确结果，并阻止全部 24 个撤权场景。仅查载荷的消融符合 108/288 个场景，出现 180 次过期执行，其中有 48 次未获授权。过期还包括版本往返或安全的能力变化，不能全部称为数据泄露。</w:t>
       </w:r>
     </w:p>
     <w:p>
@@ -1822,7 +1670,7 @@
           <w:color w:val="000000"/>
           <w:sz w:val="18"/>
         </w:rPr>
-        <w:t>分歧补充通过 96/120 次，无数值复核为 95/120；前者发送 0.075 个业务数值/任务，两者分别调用 368 和 366 次。与单次本地计算相比，多方案方法未呈现准确率收益，核心耗时中位数约由 0.72 秒增至 2.25 秒。分歧补充中有 18 次任务的三个方案结构一致却答案错误；一致性只能决定是否复核，不能作为正确性证书。</w:t>
+        <w:t>后续规划的外部执行为 588 次，完整重跑为 672 次，减少 12.5%；84 个场景各少一次，204 个不变。局部修复累计复用 180 个仍有效结果。与逐步贪心相比，不同披露项从 834 降为 810，减少 2.9%；但传输字段从 1,002 增为 1,548，增加 54.5%。这是集合目标偏向重复利用已有信息的代价，不能据此声称通信更少。</w:t>
       </w:r>
     </w:p>
     <w:p>
@@ -1839,7 +1687,7 @@
           <w:color w:val="000000"/>
           <w:sz w:val="18"/>
         </w:rPr>
-        <w:t>历史合成强对照另保留 256 次任务。按需补充、关闭补充、获准业务字段全量、数值预取分别通过 57/64、50/64、58/64、58/64 次；多余字段均值分别为 0.031、0、0.563、0.063。按需补充需 80 次调用，后两种预取各为 64 次。当必要数值容易预先识别时，预取仍是有竞争力的基线。该集合已用于开发，不与新表格结果合并。</w:t>
+        <w:t>FreshCtx 两个组合分别复现相应的重跑与后续规划结果，共执行 576 次外部时效检查。这说明检查层可以复用，新增行为来自披露历史、规划目标与修复策略；不能解读为本系统在时效检查上优于 FreshCtx。</w:t>
       </w:r>
     </w:p>
     <w:p>
@@ -1856,7 +1704,7 @@
           <w:color w:val="000000"/>
           <w:sz w:val="18"/>
         </w:rPr>
-        <w:t>旧表格转换曾把部分年份表头当作业务数值隐藏，破坏了无数值视图的列含义。本轮修复输入构造并使用新报告重新测试；旧协议、原始结果和更正说明全部保留，不能将跨批次差异归因于新算法。边界测试另外覆盖撤权、源值改写、接收方替换、凭据重放和程序越权。</w:t>
+        <w:t>独立模型实验中，全量数值通过 96/120 次，本地计算为 98/120。后者不发送业务数值，但仍公开问题、结构、年份和单位。按年报聚类的通过率差区间为 [−5.83, 9.02] 个百分点，不能证明准确率优势或不劣；自由文本真人盲审仍待完成。</w:t>
       </w:r>
     </w:p>
     <w:p>
@@ -1880,7 +1728,7 @@
           <w:color w:val="000000"/>
           <w:sz w:val="18"/>
         </w:rPr>
-        <w:t>6  开放实现与局限</w:t>
+        <w:t>6  适用范围与开放实现</w:t>
       </w:r>
     </w:p>
     <w:p>
@@ -1897,7 +1745,7 @@
           <w:color w:val="000000"/>
           <w:sz w:val="18"/>
         </w:rPr>
-        <w:t>仓库公开独立界面、执行器、冻结协议、原始调用及失败样本；600 份最新记录可无密钥复算。读者可重放真实调用，或配置自己的 DeepSeek 密钥重新执行。商业客户端与凭据不在开源包内。自由文本盲审材料已准备，但真人评阅尚未完成，本文只报告结构化与数值结果。</w:t>
+        <w:t>本系统适用于已登记、可提供等价输入的操作。精确选择限于当前已知步骤，最坏搜索代价为指数级；自动识别语义充分视图、任意工具副作用及真实生产部署均未验证。披露项减少不等于隐私风险同比降低，接收方串通与控制器旁路也不在保证范围内。</w:t>
       </w:r>
     </w:p>
     <w:p>
@@ -1914,7 +1762,7 @@
           <w:color w:val="000000"/>
           <w:sz w:val="18"/>
         </w:rPr>
-        <w:t>实验只涉及一个模型和受限公开子集，不代表真实部署效果。我们未完成相关系统的端到端复现比较，也未证明语义最小性或任意工具的安全性。本文的演示价值在于把执行决策与实际数据流联系起来，让共享收益、额外调用和失败原因都能被检查。</w:t>
+        <w:t>仓库提供完整源码、双语界面、固定依赖、协议、原始请求及独立核验脚本；所有失败保留。模型调用与控制实验分别存档。演示的贡献在于将执行位置、累计披露和变化后的修复连成可操作、可核对的过程，使观众能检查选择依据及其代价。</w:t>
       </w:r>
     </w:p>
     <w:p>
@@ -2015,7 +1863,7 @@
           <w:color w:val="000000"/>
           <w:sz w:val="14"/>
         </w:rPr>
-        <w:t>[4] L. Gao 等. PAL: Program-aided Language Models. ICML, 2023, 10764–10799.</w:t>
+        <w:t>[4] Y. Lyu, Y. Ren, R. Lai, W. Liu. From Version Conflicts to Decision Conflicts: Selective Revalidation for Long-Running AI Agents. arXiv:2609.08015, 2026.</w:t>
       </w:r>
     </w:p>
     <w:p>
@@ -2032,7 +1880,7 @@
           <w:color w:val="000000"/>
           <w:sz w:val="14"/>
         </w:rPr>
-        <w:t>[5] X. Wang 等. Self-Consistency Improves Chain of Thought Reasoning in Language Models. ICLR, 2023.</w:t>
+        <w:t>[5] Hyperwise. FreshCtx 0.16.0. github.com/Hyperwise-LLC/freshctx, 2026. Apache-2.0.</w:t>
       </w:r>
     </w:p>
     <w:p>
@@ -2049,7 +1897,24 @@
           <w:color w:val="000000"/>
           <w:sz w:val="14"/>
         </w:rPr>
-        <w:t>[6] Z. Chen 等. FinQA: A Dataset of Numerical Reasoning over Financial Data. EMNLP, 2021, 3697–3711.</w:t>
+        <w:t>[6] L. Gao 等. PAL: Program-aided Language Models. ICML, 2023, 10764–10799.</w:t>
+      </w:r>
+    </w:p>
+    <w:p>
+      <w:pPr>
+        <w:spacing w:after="20" w:line="246" w:lineRule="auto"/>
+        <w:ind w:left="202" w:hanging="202"/>
+        <w:jc w:val="left"/>
+      </w:pPr>
+      <w:r>
+        <w:rPr>
+          <w:rFonts w:ascii="Linux Libertine" w:hAnsi="Linux Libertine" w:eastAsia="SimSun"/>
+          <w:b w:val="0"/>
+          <w:i w:val="0"/>
+          <w:color w:val="000000"/>
+          <w:sz w:val="14"/>
+        </w:rPr>
+        <w:t>[7] Z. Chen 等. FinQA: A Dataset of Numerical Reasoning over Financial Data. EMNLP, 2021, 3697–3711.</w:t>
       </w:r>
     </w:p>
     <w:sectPr>

</xml_diff>

<commit_message>
Connect real model graphs to budgeted disclosure execution
</commit_message>
<xml_diff>
--- a/paper/zh-CN/按步执行与信息共享_中文最新稿.docx
+++ b/paper/zh-CN/按步执行与信息共享_中文最新稿.docx
@@ -82,9 +82,9 @@
           <w:b w:val="0"/>
           <w:i w:val="0"/>
           <w:color w:val="000000"/>
-          <w:sz w:val="17"/>
+          <w:sz w:val="18"/>
         </w:rPr>
-        <w:t>智能体的后续步骤可能改变执行位置与输入需求；请求准备完成后，源值、授权和可用能力仍可能变化。逐步裁剪难以兼顾跨步骤的累计披露，完整重跑则重复已完成的工作。本文演示一个按步执行系统：依据接收方已见信息规划当前已知的后续步骤，在发送前核验规划依赖，并保留仍有效的纯计算结果。独立接收进程记录实际载荷，界面将状态变化、失效请求与修复结果逐项对应。288 个受控场景的六方法比较中，局部修复比完整重跑减少 12.5% 的外部执行；后续规划比逐步贪心少披露 2.9% 的不同信息项，但重复传输字段增加 54.5%。另保留真实模型调用验证本地计算路径。演示使这些收益、代价和适用边界均可检查。</w:t>
+        <w:t>智能体运行中出现的新步骤，可能需要不同的执行位置与输入；源值或能力变化又会使已有计划失效。本文演示按步执行与信息共享系统：结合接收方已见信息选择当前已知步骤的等价输入，在数值字段传输预算内规划后续执行，并保留仍有效的纯计算结果。24 道公开财务问题的 96 次真实 DeepSeek 调用产生 48 份计划；在五种受控条件、六方法的配对执行中，局部修复比完整重跑减少 21.1% 的 HTTP 算子调用。后续规划在该批次未优于逐步贪心；48 份计划均可执行，但仅 28 份与原始数值标签一致。双栏界面将模型提出的步骤、条件变化与实际接收内容对应展示，使执行收益及其边界可以核对。</w:t>
       </w:r>
     </w:p>
     <w:p>
@@ -189,7 +189,7 @@
           <w:b w:val="0"/>
           <w:i w:val="0"/>
           <w:color w:val="000000"/>
-          <w:sz w:val="14"/>
+          <w:sz w:val="16"/>
         </w:rPr>
         <w:t>图 1  按步执行的系统结构。原始资料保留在本地；模型与工具通过登记出口交互。新步骤或状态变化触发重新判定，外部结果写回本地状态。</w:t>
       </w:r>
@@ -235,7 +235,7 @@
           <w:color w:val="000000"/>
           <w:sz w:val="18"/>
         </w:rPr>
-        <w:t>PlanTwin [1] 研究本地规划抽象，ToolMinimize [2] 与 MINIM [3] 约束工具调用和观察视图；ATR [4] 已研究决策依赖与选择性重验证。FreshCtx [5] 提供可嵌入的上下文时效检查。因此，数据裁剪、依赖失效和程序辅助计算 [6] 本身不能作为本文的新颖性主张。</w:t>
+        <w:t>PlanTwin [1] 已提出云端规划抽象与累计披露预算；ToolMinimize [2] 和 MINIM [3] 分别限制工具参数与界面观察。ATR [4] 研究变化后的决策重验证，FreshCtx [5] 提供上下文时效检查。因此，裁剪、预算和依赖核验本身均不足以构成新颖性。</w:t>
       </w:r>
     </w:p>
     <w:p>
@@ -260,7 +260,7 @@
           <w:color w:val="000000"/>
           <w:sz w:val="18"/>
         </w:rPr>
-        <w:t>本文关注其交汇处：在信息已经发送、无法撤回的条件下，结合各接收方的披露历史，为当前已知步骤选择等价输入方案，并在变化后重建剩余执行。我们给出有限候选下的精确选择、包含未选候选的依赖核验，以及结果复用和真实接收记录的一体化实现。</w:t>
+        <w:t>本文将执行位置、不可撤回的披露历史与变化后的结果复用联合处理。具体实现比较当前已知步骤的登记等价输入，在一个阶段共用剩余传输预算，并用来源依赖区分需要重算和可以保留的结果。贡献是这一受限执行机制及可核验演示，而非新的通用动态规划或自动语义脱敏算法。</w:t>
       </w:r>
     </w:p>
     <w:p>
@@ -277,7 +277,7 @@
           <w:color w:val="000000"/>
           <w:sz w:val="18"/>
         </w:rPr>
-        <w:t>演示不是将“裁剪越多越好”作为结论。观众可改变限额、撤销接收方授权或添加步骤，比较完整重跑、逐步贪心和后续规划，看到不同信息项减少时传输量仍可能上升。该取舍由可复算记录支持，而非仅由界面呈现。</w:t>
+        <w:t>演示让观众回答三个具体问题：模型提出了哪些计算；条件变化后哪些步骤仍有效；外部接收方究竟收到哪些数值。预算约束限制重复发送字段，已披露集合则记录不同信息项，两者不能混为一谈。真实模型计划和受控干预保存在同一条执行链中，错误答案与无收益结果也予以保留。</w:t>
       </w:r>
     </w:p>
     <w:p>
@@ -337,7 +337,7 @@
           <w:color w:val="000000"/>
           <w:sz w:val="18"/>
         </w:rPr>
-        <w:t>版本化状态 S 保存源事实、授权和本地能力。对登记操作 o，候选 a 指定接收方 r、输入视图 V 及其依赖。视图可以包含原值或本地派生值；登记算子须保证不同输入形式产生相同任务结果。模型不能任意增加字段或执行生成脚本。</w:t>
+        <w:t>版本化状态 S 保存源值、授权与本地能力。模型先申请不含业务数值的表结构，再提交有限计算图；控制器仅接受六种登记算子、前向执行且无无用节点的程序。候选 a 指定接收方 r 与等价视图 V：原始字段加子表达式，或已计算的直接操作数。</w:t>
       </w:r>
     </w:p>
     <w:p>
@@ -354,7 +354,7 @@
           <w:color w:val="000000"/>
           <w:sz w:val="18"/>
         </w:rPr>
-        <w:t>一次披露按接收方、字段及其值与来源版本的指纹计数。令 E(a) 为候选披露项集合，H 为此前发送的集合；本地执行的 E(a) 为空。准备发送时保守地更新历史：</w:t>
+        <w:t>一次披露以接收方、源字段或派生表达式及来源版本的指纹标识。令 E(a) 为候选披露项，H 为确认发送的集合；本地执行的 E(a) 为空。每次得到匹配接收记录后更新：</w:t>
       </w:r>
     </w:p>
     <w:p>
@@ -469,7 +469,7 @@
           <w:color w:val="000000"/>
           <w:sz w:val="18"/>
         </w:rPr>
-        <w:t>设 Q 为已知待执行步骤，P(Q,S) 为满足当前授权与能力的候选组合。方案 p 的新增披露及外部执行量 W(p) 定义为：</w:t>
+        <w:t>设 Q 为当前已知待执行图，P(Q,S) 为满足授权、能力和剩余预算的候选组合；W(p) 是本地及接收端实际求值的算子数，T(p) 是发送的数值字段次数。原始字段重复发送仍计入 T，新增披露集合为：</w:t>
       </w:r>
     </w:p>
     <w:p>
@@ -530,7 +530,7 @@
             </m:e>
             <m:sup>
               <m:r>
-                <m:t>*</m:t>
+                <m:t>∗</m:t>
               </m:r>
             </m:sup>
           </m:sSup>
@@ -553,7 +553,7 @@
             </m:lim>
           </m:limLow>
           <m:r>
-            <m:t>(|D(p)|,W(p))</m:t>
+            <m:t>(|D(p)|,W(p),T(p))</m:t>
           </m:r>
         </m:oMath>
       </m:oMathPara>
@@ -582,7 +582,62 @@
           <w:color w:val="000000"/>
           <w:sz w:val="18"/>
         </w:rPr>
-        <w:t>式（3）先减少不同披露项，再以外部执行量打破平局。搜索逐步扩展标签 (E,w)，其中 E 包含历史与当前前缀的披露，w 为前缀外部执行数。同一深度满足下式时，可删除第二个标签：</w:t>
+        <w:t>式（3）依次比较不同披露项、算子求值与传输字段。阶段开始时，以相同状态下逐步贪心的传输量为基准设预算 B；默认不增加字段，敏感性设置允许增加 10% 或 25%。执行每一步都扣减同一余额，不能重新取得整份额度。</w:t>
+      </w:r>
+    </w:p>
+    <w:p>
+      <w:pPr>
+        <w:spacing w:before="60" w:after="60"/>
+        <w:jc w:val="center"/>
+      </w:pPr>
+      <m:oMathPara>
+        <m:oMath>
+          <m:r>
+            <m:t>B=⌊(1+ρ)T(</m:t>
+          </m:r>
+          <m:sSub>
+            <m:e>
+              <m:r>
+                <m:t>p</m:t>
+              </m:r>
+            </m:e>
+            <m:sub>
+              <m:r>
+                <m:t>g</m:t>
+              </m:r>
+            </m:sub>
+          </m:sSub>
+          <m:r>
+            <m:t>)⌋</m:t>
+          </m:r>
+        </m:oMath>
+      </m:oMathPara>
+      <w:r>
+        <w:rPr>
+          <w:rFonts w:ascii="Linux Libertine" w:hAnsi="Linux Libertine" w:eastAsia="SimSun"/>
+          <w:b w:val="0"/>
+          <w:i w:val="0"/>
+          <w:color w:val="000000"/>
+          <w:sz w:val="16"/>
+        </w:rPr>
+        <w:t xml:space="preserve">  (4)</w:t>
+      </w:r>
+    </w:p>
+    <w:p>
+      <w:pPr>
+        <w:spacing w:after="40" w:line="246" w:lineRule="auto"/>
+        <w:ind w:firstLine="230"/>
+        <w:jc w:val="both"/>
+      </w:pPr>
+      <w:r>
+        <w:rPr>
+          <w:rFonts w:ascii="Linux Libertine" w:hAnsi="Linux Libertine" w:eastAsia="SimSun"/>
+          <w:b w:val="0"/>
+          <w:i w:val="0"/>
+          <w:color w:val="000000"/>
+          <w:sz w:val="18"/>
+        </w:rPr>
+        <w:t>同一深度的标签记录披露集合、累计求值与传输 (E,w,b)。下式成立时第二个标签可被剪枝：</w:t>
       </w:r>
     </w:p>
     <w:p>
@@ -649,6 +704,36 @@
               </m:r>
             </m:sub>
           </m:sSub>
+          <m:r>
+            <m:t>∧</m:t>
+          </m:r>
+          <m:sSub>
+            <m:e>
+              <m:r>
+                <m:t>b</m:t>
+              </m:r>
+            </m:e>
+            <m:sub>
+              <m:r>
+                <m:t>1</m:t>
+              </m:r>
+            </m:sub>
+          </m:sSub>
+          <m:r>
+            <m:t>≤</m:t>
+          </m:r>
+          <m:sSub>
+            <m:e>
+              <m:r>
+                <m:t>b</m:t>
+              </m:r>
+            </m:e>
+            <m:sub>
+              <m:r>
+                <m:t>2</m:t>
+              </m:r>
+            </m:sub>
+          </m:sSub>
         </m:oMath>
       </m:oMathPara>
       <w:r>
@@ -659,7 +744,7 @@
           <w:color w:val="000000"/>
           <w:sz w:val="16"/>
         </w:rPr>
-        <w:t xml:space="preserve">  (4)</w:t>
+        <w:t xml:space="preserve">  (5)</w:t>
       </w:r>
     </w:p>
     <w:p>
@@ -676,7 +761,7 @@
           <w:color w:val="000000"/>
           <w:sz w:val="18"/>
         </w:rPr>
-        <w:t>当候选输出等价、后续可行性不依赖所选表示时，为两标签追加同一后缀保持上述关系，因此剪枝不丢失式（3）的最优解。最坏标签数仍为指数级；实现超过 4,096 个标签即明确失败。这里不声称新的通用动态规划，也不声称对尚未发现的步骤全局最优。</w:t>
+        <w:t>若候选输出等价且后续可行性不依赖表示，追加同一后缀保持集合包含与两项成本关系，因此剪枝不会丢失受限问题的最优解。未来派生值用表达式及源版本标识，无需预先计算其数值。最坏搜索仍为指数级，超过 4,096 个标签明确失败。</w:t>
       </w:r>
     </w:p>
     <w:p>
@@ -710,23 +795,6 @@
           <w:sz w:val="18"/>
         </w:rPr>
         <w:t>设两个步骤均可向服务甲发送同一对原值 {x,y}；另一条路径向服务乙分别发送一个派生值 {u} 与两个不同派生值 {v,w}。逐步贪心先选乙，只披露一项；第二步无论选哪条路径，累计都至少为三项。后续规划连续选择甲，累计只有两项，但会传输四个字段。该例说明为什么披露集合与传输次数须分别衡量。</w:t>
-      </w:r>
-    </w:p>
-    <w:p>
-      <w:pPr>
-        <w:spacing w:after="40" w:line="246" w:lineRule="auto"/>
-        <w:ind w:firstLine="230"/>
-        <w:jc w:val="both"/>
-      </w:pPr>
-      <w:r>
-        <w:rPr>
-          <w:rFonts w:ascii="Linux Libertine" w:hAnsi="Linux Libertine" w:eastAsia="SimSun"/>
-          <w:b w:val="0"/>
-          <w:i w:val="0"/>
-          <w:color w:val="000000"/>
-          <w:sz w:val="18"/>
-        </w:rPr>
-        <w:t>这一比较只在等价实现之间成立。若某个服务无法完成步骤，即使披露更少也不能选择；如果派生方式改变后续语义，则不能使用上述剪枝保证。登记与授权先限定可行方案，式（3）只在其中进行选择。</w:t>
       </w:r>
     </w:p>
     <w:p>
@@ -767,7 +835,7 @@
           <w:color w:val="000000"/>
           <w:sz w:val="18"/>
         </w:rPr>
-        <w:t>请求未改变，不代表原决定仍合适。例如，本地能力变为可用时，旧外发载荷可以逐字相同。系统因此记录所有候选的源值与能力、授权、端点读取，包括未选候选；派生字段展开为传递依赖。</w:t>
+        <w:t>请求内容未变，不代表原执行方式仍可行。本地能力变化可能要求改用外部算子；源值变化可能使缓存过期。控制器区分决定候选可行性的规划依赖与决定结果数值的传递依赖：</w:t>
       </w:r>
     </w:p>
     <w:p>
@@ -847,7 +915,7 @@
           <w:color w:val="000000"/>
           <w:sz w:val="16"/>
         </w:rPr>
-        <w:t xml:space="preserve">  (5)</w:t>
+        <w:t xml:space="preserve">  (6)</w:t>
       </w:r>
     </w:p>
     <w:p>
@@ -864,7 +932,7 @@
           <w:color w:val="000000"/>
           <w:sz w:val="18"/>
         </w:rPr>
-        <w:t>凭据将这些版本、接收方与最终序列化请求绑定。任一依赖变化即放弃未发送请求，重新规划；没有使用的源字段变化不触发失效。单调版本号能发现值变化后又恢复的情况。版本核验是保守条件，失效不一定意味着旧请求会产生错误答案。</w:t>
+        <w:t>源版本、当前能力和授权在序列化前同步检查；状态变化后重新选择剩余步骤，缓存仅按值依赖判断是否保留。受控版本往返测试使用单调版本号。已失效结果不得作为新请求的操作数，未用源字段改变则不使该结果失效。</w:t>
       </w:r>
     </w:p>
     <w:p>
@@ -899,7 +967,7 @@
           <w:color w:val="000000"/>
           <w:sz w:val="16"/>
         </w:rPr>
-        <w:t>Input: versioned state S, pending steps Q, registry R</w:t>
+        <w:t>Input: versioned state S, graph Q, registry R, slack ρ</w:t>
       </w:r>
     </w:p>
     <w:p>
@@ -931,7 +999,7 @@
           <w:color w:val="000000"/>
           <w:sz w:val="16"/>
         </w:rPr>
-        <w:t>1:  C ← ∅; H ← ∅</w:t>
+        <w:t>1:  C ← ∅; H ← ∅; B ← UNSET</w:t>
       </w:r>
     </w:p>
     <w:p>
@@ -963,7 +1031,7 @@
           <w:color w:val="000000"/>
           <w:sz w:val="16"/>
         </w:rPr>
-        <w:t>3:      A, Δ ← EnumerateAlternatives(S, Q, R)</w:t>
+        <w:t>3:      if StateChanged(S) then</w:t>
       </w:r>
     </w:p>
     <w:p>
@@ -979,7 +1047,7 @@
           <w:color w:val="000000"/>
           <w:sz w:val="16"/>
         </w:rPr>
-        <w:t>4:      p ← FrontierPlan(A, H)</w:t>
+        <w:t>4:          C ← KeepValidPureResults(C, S)</w:t>
       </w:r>
     </w:p>
     <w:p>
@@ -995,7 +1063,7 @@
           <w:color w:val="000000"/>
           <w:sz w:val="16"/>
         </w:rPr>
-        <w:t>5:      if p is infeasible then return BLOCKED</w:t>
+        <w:t>5:          Q ← Pending(Q, C); B ← UNSET</w:t>
       </w:r>
     </w:p>
     <w:p>
@@ -1011,7 +1079,7 @@
           <w:color w:val="000000"/>
           <w:sz w:val="16"/>
         </w:rPr>
-        <w:t>6:      a ← First(p); B ← Serialize(a)</w:t>
+        <w:t>6:      A ← EquivalentAlternatives(S, Q, R)</w:t>
       </w:r>
     </w:p>
     <w:p>
@@ -1027,7 +1095,7 @@
           <w:color w:val="000000"/>
           <w:sz w:val="16"/>
         </w:rPr>
-        <w:t>7:      T ← Bind(a, Versions(S, Δ), Hash(B))</w:t>
+        <w:t>7:      if B = UNSET then</w:t>
       </w:r>
     </w:p>
     <w:p>
@@ -1043,7 +1111,7 @@
           <w:color w:val="000000"/>
           <w:sz w:val="16"/>
         </w:rPr>
-        <w:t>8:      if not Current(T, S) then</w:t>
+        <w:t>8:          B ← floor((1 + ρ) × Fields(Greedy(A,H)))</w:t>
       </w:r>
     </w:p>
     <w:p>
@@ -1059,7 +1127,7 @@
           <w:color w:val="000000"/>
           <w:sz w:val="16"/>
         </w:rPr>
-        <w:t>9:          C ← KeepValidPureResults(C, S)</w:t>
+        <w:t>9:      p ← BudgetFrontier(A, H, B)</w:t>
       </w:r>
     </w:p>
     <w:p>
@@ -1075,7 +1143,7 @@
           <w:color w:val="000000"/>
           <w:sz w:val="16"/>
         </w:rPr>
-        <w:t>10:         Q ← PendingFromCurrentState(C, S)</w:t>
+        <w:t>10:     if p is infeasible then return BLOCKED</w:t>
       </w:r>
     </w:p>
     <w:p>
@@ -1091,7 +1159,7 @@
           <w:color w:val="000000"/>
           <w:sz w:val="16"/>
         </w:rPr>
-        <w:t>11:         continue</w:t>
+        <w:t>11:     a ← First(p); CheckCurrent(S, a)</w:t>
       </w:r>
     </w:p>
     <w:p>
@@ -1139,7 +1207,7 @@
           <w:color w:val="000000"/>
           <w:sz w:val="16"/>
         </w:rPr>
-        <w:t>14:         RequireUnchanged(T, B)</w:t>
+        <w:t>14:         bytes ← Serialize(a); CheckCurrent(S, a)</w:t>
       </w:r>
     </w:p>
     <w:p>
@@ -1155,7 +1223,7 @@
           <w:color w:val="000000"/>
           <w:sz w:val="16"/>
         </w:rPr>
-        <w:t>15:         H ← H ∪ DisclosureTokens(a)</w:t>
+        <w:t>15:         y, receipt ← SendOnce(bytes)</w:t>
       </w:r>
     </w:p>
     <w:p>
@@ -1171,7 +1239,7 @@
           <w:color w:val="000000"/>
           <w:sz w:val="16"/>
         </w:rPr>
-        <w:t>16:         y, receipt ← SendOnce(B)</w:t>
+        <w:t>16:         VerifyReceipt(receipt, bytes)</w:t>
       </w:r>
     </w:p>
     <w:p>
@@ -1187,7 +1255,7 @@
           <w:color w:val="000000"/>
           <w:sz w:val="16"/>
         </w:rPr>
-        <w:t>17:         VerifyReceipt(receipt, B)</w:t>
+        <w:t>17:         H ← H ∪ DisclosureTokens(a)</w:t>
       </w:r>
     </w:p>
     <w:p>
@@ -1203,7 +1271,7 @@
           <w:color w:val="000000"/>
           <w:sz w:val="16"/>
         </w:rPr>
-        <w:t>18:     C ← SavePureResult(C, y, ValueDeps(a))</w:t>
+        <w:t>18:     B ← B − NumericFields(a)</w:t>
       </w:r>
     </w:p>
     <w:p>
@@ -1219,7 +1287,23 @@
           <w:color w:val="000000"/>
           <w:sz w:val="16"/>
         </w:rPr>
-        <w:t>19:     Q ← RemoveCompletedAndAppendNew(Q, y)</w:t>
+        <w:t>19:     C ← SavePureResult(C, y, SourceDeps(a))</w:t>
+      </w:r>
+    </w:p>
+    <w:p>
+      <w:pPr>
+        <w:keepNext/>
+        <w:spacing w:after="0" w:line="245" w:lineRule="auto"/>
+      </w:pPr>
+      <w:r>
+        <w:rPr>
+          <w:rFonts w:ascii="Linux Libertine" w:hAnsi="Linux Libertine" w:eastAsia="SimSun"/>
+          <w:b w:val="0"/>
+          <w:i w:val="0"/>
+          <w:color w:val="000000"/>
+          <w:sz w:val="16"/>
+        </w:rPr>
+        <w:t>20:     Q ← RemoveCompleted(Q, a)</w:t>
       </w:r>
     </w:p>
     <w:p>
@@ -1238,7 +1322,7 @@
           <w:color w:val="000000"/>
           <w:sz w:val="16"/>
         </w:rPr>
-        <w:t>20: return C, H</w:t>
+        <w:t>21: return C, H</w:t>
       </w:r>
     </w:p>
     <w:p>
@@ -1255,7 +1339,7 @@
           <w:color w:val="000000"/>
           <w:sz w:val="18"/>
         </w:rPr>
-        <w:t>结果缓存只适用于无副作用的登记计算，按值依赖决定是否保留；授权变化不能撤回此前披露，但会限制后续发送。没有可行候选时停止。未知副作用和不确定的网络失败不自动重试，控制器与登记出口须可信。</w:t>
+        <w:t>算法 1 在每个状态稳定阶段维持一个余额。阶段内，剩余旧方案为下一次受限选择提供可行解；累计实际发送字段因而不超过阶段预算。新的干预会开启新阶段，这个局部界限不能替代整轮任务的实测传输量。</w:t>
       </w:r>
     </w:p>
     <w:p>
@@ -1272,7 +1356,7 @@
           <w:color w:val="000000"/>
           <w:sz w:val="18"/>
         </w:rPr>
-        <w:t>接收进程保存原始请求字节、摘要和运行标识，以核对“准备发送”与“实际收到”。该记录不构成远端平台认证，也不提供分布式原子提交保证。FreshCtx 可替换版本检查部分，后续规划与结果复用仍由本系统负责。</w:t>
+        <w:t>接收端记录原始字节、摘要与结果，核验器逐请求重算。新模型图实验使用同一 Node 进程内的回环 HTTP 监听器；真实模型请求由另一个代理保存供应商载荷与响应摘要。它们均不构成供应商签名回执或生产分布式事务证明。</w:t>
       </w:r>
     </w:p>
     <w:p>
@@ -1289,7 +1373,24 @@
           <w:color w:val="000000"/>
           <w:sz w:val="18"/>
         </w:rPr>
-        <w:t>实现区分两类依赖：规划依赖决定是否要重新选择执行方式，值依赖决定既有结果能否复用。例如，限额变化使待执行的限额检查失效，但先前金额计算只读取基数、比例和天数，其结果仍有效。系统重新核验后保留该结果，不把“所有旧工作都作废”作为默认恢复方式。</w:t>
+        <w:t>自动复用仅限登记的无副作用计算。接收授权撤销不能收回既往披露；网络返回不确定时停止，不假设未获回执就没有信息外发。任意脚本、带副作用工具及不可信控制器均不在保证范围内。</w:t>
+      </w:r>
+    </w:p>
+    <w:p>
+      <w:pPr>
+        <w:spacing w:after="40" w:line="246" w:lineRule="auto"/>
+        <w:ind w:firstLine="230"/>
+        <w:jc w:val="both"/>
+      </w:pPr>
+      <w:r>
+        <w:rPr>
+          <w:rFonts w:ascii="Linux Libertine" w:hAnsi="Linux Libertine" w:eastAsia="SimSun"/>
+          <w:b w:val="0"/>
+          <w:i w:val="0"/>
+          <w:color w:val="000000"/>
+          <w:sz w:val="18"/>
+        </w:rPr>
+        <w:t>该预算只约束当前状态与已知后续图。新步骤或源状态变化后必须重建阶段，不能由此推导跨变化的总量界限。字段数也不是 HTTP 字节数；报文标签、表达式与结构信息另占空间，实验分别记录这些代价。</w:t>
       </w:r>
     </w:p>
     <w:p>
@@ -1311,7 +1412,7 @@
       <w:r>
         <w:drawing>
           <wp:inline xmlns:a="http://schemas.openxmlformats.org/drawingml/2006/main" xmlns:pic="http://schemas.openxmlformats.org/drawingml/2006/picture">
-            <wp:extent cx="6080760" cy="3362845"/>
+            <wp:extent cx="6080760" cy="3316778"/>
             <wp:docPr id="2" name="Picture 2"/>
             <wp:cNvGraphicFramePr>
               <a:graphicFrameLocks noChangeAspect="1"/>
@@ -1332,7 +1433,7 @@
                   <pic:spPr>
                     <a:xfrm>
                       <a:off x="0" y="0"/>
-                      <a:ext cx="6080760" cy="3362845"/>
+                      <a:ext cx="6080760" cy="3316778"/>
                     </a:xfrm>
                     <a:prstGeom prst="rect"/>
                   </pic:spPr>
@@ -1354,9 +1455,9 @@
           <w:b w:val="0"/>
           <w:i w:val="0"/>
           <w:color w:val="000000"/>
-          <w:sz w:val="14"/>
+          <w:sz w:val="16"/>
         </w:rPr>
-        <w:t>图 2  限额变化案例的实际执行截图。① 已完成金额计算后，限额改变；② 旧请求失效，系统保留不依赖限额的结果；③ 右侧展示重新规划后的接收方与实际输入。截图裁去导航并添加编号，使用独立开发样例，不计入冻结测试。</w:t>
+        <w:t>图 2  公开财务表格的实际执行界面。① 从保存的真实模型回复创建计算步骤；② 受控撤销本地能力，保留已完成结果；③ HTTP 接收端收到中间值与所需源值。截图为冻结批次中一个计划的独立重执行，裁去导航并添加编号，不增加测试样本数。</w:t>
       </w:r>
     </w:p>
     <w:p>
@@ -1416,7 +1517,7 @@
           <w:color w:val="000000"/>
           <w:sz w:val="18"/>
         </w:rPr>
-        <w:t>第一组演示从计费与限额案例开始。观众先运行后续规划，再切换完整重跑，比较相同输入下哪些计算被重复执行。第二个案例撤销本地能力，观察工作转至可用的外部算子；第三个撤销某个接收方授权，观察未发送请求失效和改路。第四个在运行中注入新的登记步骤，显示规划只使用当时已知的信息。</w:t>
+        <w:t>第一组使用公开财务表格：模型通过真实工具调用申请表结构，随后提交“相加、相加、相除”的计算图。观众查看原始回复后执行该图；首步完成时撤销登记的本地加减能力，系统保留首步结果，将后续步骤交给 HTTP 算子。切换完整重跑，可直接看到该首步被重复执行。</w:t>
       </w:r>
     </w:p>
     <w:p>
@@ -1433,7 +1534,7 @@
           <w:color w:val="000000"/>
           <w:sz w:val="18"/>
         </w:rPr>
-        <w:t>这些控制场景使用独立进程执行真实 HTTP 算子，不调用语言模型。它们隔离状态变化与修复行为，不用于证明模型自主发现步骤。真实模型路径另提供保存的 DeepSeek 调用：缺少事实时申请补充、调用资料查询，以及根据表结构提出本地表达式。重放原始调用与读者自带密钥的现场调用明确区分。</w:t>
+        <w:t>第二组分别改变已用与未用源值。已用值更新使依赖它的结果失效；未用值更新则保留已有计算。右侧显示原始字段或中间值，以及本阶段剩余字段预算。全本地条件展示无需外部数值服务的边界，混合能力是实验配置，不表示加减乘除天然需要云端。</w:t>
       </w:r>
     </w:p>
     <w:p>
@@ -1450,7 +1551,7 @@
           <w:color w:val="000000"/>
           <w:sz w:val="18"/>
         </w:rPr>
-        <w:t>界面和执行器作为独立研究实现公开，不包含商业客户端。每轮可下载原始接收记录与完整轨迹。无密钥即可运行控制案例、核对冻结数据或重放已有模型调用；双语界面展示相同执行状态。</w:t>
+        <w:t>无密钥模式重用公开的真实模型计划，但重新执行本地计算及 HTTP 请求；不是重新调用模型，也不是只播放预设结果。读者可用自己的密钥运行完整批次命令，产生新的模型计划。旧版合同案例、逐步补充和人工撤权记录继续保留，均与新实验分开。</w:t>
       </w:r>
     </w:p>
     <w:p>
@@ -1491,7 +1592,7 @@
           <w:color w:val="000000"/>
           <w:sz w:val="18"/>
         </w:rPr>
-        <w:t>控制实验在运行前冻结源码、场景与评价规则。四种步骤顺序各取六组数值，交叉十二类变化，共 288 个场景、六种方法与 1,728 次执行。变化涵盖无变化、未用字段、源值、限额、本地能力增减、接收方撤权或替换、全部撤权、版本往返、新步骤和步骤间变化。参数变体不是独立真实业务样本。</w:t>
+        <w:t>在新调用前冻结提示词、执行器、评价器和事件安排。从 FinQA [7] 排除此前使用的公司年度报告，固定顺序选择 24 题、24 份报告；12 题来自原 test 划分、12 题来自原 dev 划分，各保留来源标记。兼容筛选限定可由表格与登记算子回答的多操作问题；另四题仅用于开发。</w:t>
       </w:r>
     </w:p>
     <w:p>
@@ -1508,7 +1609,7 @@
           <w:color w:val="000000"/>
           <w:sz w:val="18"/>
         </w:rPr>
-        <w:t>六种方法为：仅检查载荷直接字段的消融、完整重跑、局部修复与逐步贪心、局部修复与后续规划，以及 FreshCtx 分别搭配完整重跑和后续规划。除消融外，方法获得相同的完整依赖。FreshCtx 固定为 0.16.0，实际调用其观察—推理—执行检查；重跑策略由本实验提供，不是该库的固有限制。</w:t>
+        <w:t>每题实际调用 DeepSeek 两轮生成计划，每份计划包含申请结构与提交计算两个请求，共 48 份计划、96 次调用。每份计划在五种条件下比较六方法：完整重跑、修复加贪心、无传输约束的后续规划，以及 0%、10%、25% 预算。共享模型前缀保证执行方法的配对可比；1,440 次执行不是 1,440 次独立模型任务。</w:t>
       </w:r>
     </w:p>
     <w:p>
@@ -1525,7 +1626,7 @@
           <w:color w:val="000000"/>
           <w:sz w:val="18"/>
         </w:rPr>
-        <w:t>评价区分结果正确、版本契约符合和授权有效。每种方法有 264 个可完成场景及 24 个必须阻止的全部撤权场景；正确阻止计为契约符合，不计为完成任务。独立脚本重建状态、重算算子并核对全部 3,684 条 HTTP 接收记录，同时统计不同披露项、重复传输字段、外部执行和结果复用。</w:t>
+        <w:t>五种条件为全本地、混合能力无变化、已用值更新、未用值更新和本地能力撤销。干预在模型图约半数步骤完成时触发，源值按预定规则变化；执行器不读参考答案。评估分别检查模型图执行一致性、原始标签一致性、来源有效性及实际载荷，全部错误保留。</w:t>
       </w:r>
     </w:p>
     <w:p>
@@ -1542,7 +1643,7 @@
           <w:color w:val="000000"/>
           <w:sz w:val="18"/>
         </w:rPr>
-        <w:t>另保留基于 FinQA [7] 的独立模型实验：60 页来自 57 份公司年报，五种方法各重复两次，共 600 次任务、1,210 次真实 DeepSeek 调用。表结构对照已修正，开发用公司年报被排除。该数据评价模型提出本地计算的有效性，不与控制实验合并，也不作为局部修复算法的效果证据。</w:t>
+        <w:t>另保存 288 个合成变化场景、六方法的机制消融，以及旧版 600 次模型任务；它们不与本批次合并统计。新批次每道题的两份计划和五种条件相关，统计单位为题。按题聚类的探索性自助法只用于描述外部调用减少量，不证明真实生产中的泛化收益。</w:t>
       </w:r>
     </w:p>
     <w:p>
@@ -1565,7 +1666,7 @@
       <w:r>
         <w:drawing>
           <wp:inline xmlns:a="http://schemas.openxmlformats.org/drawingml/2006/main" xmlns:pic="http://schemas.openxmlformats.org/drawingml/2006/picture">
-            <wp:extent cx="6199632" cy="3498364"/>
+            <wp:extent cx="6199632" cy="3099816"/>
             <wp:docPr id="3" name="Picture 3"/>
             <wp:cNvGraphicFramePr>
               <a:graphicFrameLocks noChangeAspect="1"/>
@@ -1586,7 +1687,7 @@
                   <pic:spPr>
                     <a:xfrm>
                       <a:off x="0" y="0"/>
-                      <a:ext cx="6199632" cy="3498364"/>
+                      <a:ext cx="6199632" cy="3099816"/>
                     </a:xfrm>
                     <a:prstGeom prst="rect"/>
                   </pic:spPr>
@@ -1608,9 +1709,9 @@
           <w:b w:val="0"/>
           <w:i w:val="0"/>
           <w:color w:val="000000"/>
-          <w:sz w:val="14"/>
+          <w:sz w:val="16"/>
         </w:rPr>
-        <w:t>图 3  a–e：288 个受控场景的六方法比较，F 表示 FreshCtx；契约符合包含正确阻止。d：完整重跑与后续规划的逐场景执行次数差；e：不同披露项与重复传输量的取舍。f：独立保存的真实模型数值实验，不能与 a–e 合并解释。</w:t>
+        <w:t>图 3  新模型图实验，每种方法 240 次配对执行。a、b：实际 HTTP 调用与数值字段传输；c：按干预条件拆分；d：R、G、F 分别为重跑、贪心与后续规划，后三项为传输预算设置。本批次的五种修复方法结果相同，不支持额外规划收益。</w:t>
       </w:r>
     </w:p>
     <w:p>
@@ -1653,7 +1754,7 @@
           <w:color w:val="000000"/>
           <w:sz w:val="18"/>
         </w:rPr>
-        <w:t>完整依赖方法均在 264 个可行场景中给出正确结果，并阻止全部 24 个撤权场景。仅查载荷的消融符合 108/288 个场景，出现 180 次过期执行，其中有 48 次未获授权。过期还包括版本往返或安全的能力变化，不能全部称为数据泄露。</w:t>
+        <w:t>48 份模型图均可执行，各方法在 240 次运行中均与该图的当前数值语义一致，但只有 137 次与相应的参考表达式输出一致。原始、未干预问题的标签一致性为 28/48。这里“执行正确”只说明按模型表达式算对，不能说明模型选对了字段或理解了题意。</w:t>
       </w:r>
     </w:p>
     <w:p>
@@ -1670,7 +1771,7 @@
           <w:color w:val="000000"/>
           <w:sz w:val="18"/>
         </w:rPr>
-        <w:t>后续规划的外部执行为 588 次，完整重跑为 672 次，减少 12.5%；84 个场景各少一次，204 个不变。局部修复累计复用 180 个仍有效结果。与逐步贪心相比，不同披露项从 834 降为 810，减少 2.9%；但传输字段从 1,002 增为 1,548，增加 54.5%。这是集合目标偏向重复利用已有信息的代价，不能据此声称通信更少。</w:t>
+        <w:t>与完整重跑相比，保留有效结果将外部调用从 331 降到 261，减少 21.1%，复用 112 个计算；传输数值字段由 724 降至 500。按 24 题聚类、10,000 次探索性重采样，调用减少比例的区间为 [19.1%, 23.8%]。主要收益来自能力撤销及未用值变化后的结果保留。</w:t>
       </w:r>
     </w:p>
     <w:p>
@@ -1687,7 +1788,7 @@
           <w:color w:val="000000"/>
           <w:sz w:val="18"/>
         </w:rPr>
-        <w:t>FreshCtx 两个组合分别复现相应的重跑与后续规划结果，共执行 576 次外部时效检查。这说明检查层可以复用，新增行为来自披露历史、规划目标与修复策略；不能解读为本系统在时效检查上优于 FreshCtx。</w:t>
+        <w:t>逐步贪心、后续规划及三档预算均产生 425 个不同披露项、500 个传输字段，未观察到后续规划的新增收益。旧合成测试中规划曾减少 2.9% 的披露项，却增加 54.5% 的传输字段；新约束提供阶段预算界限，但本批次并未证明该约束带来额外效率提升。</w:t>
       </w:r>
     </w:p>
     <w:p>
@@ -1704,7 +1805,7 @@
           <w:color w:val="000000"/>
           <w:sz w:val="18"/>
         </w:rPr>
-        <w:t>独立模型实验中，全量数值通过 96/120 次，本地计算为 98/120。后者不发送业务数值，但仍公开问题、结构、年份和单位。按年报聚类的通过率差区间为 [−5.83, 9.02] 个百分点，不能证明准确率优势或不劣；自由文本真人盲审仍待完成。</w:t>
+        <w:t>错误记录包括年份选择、差值方向和百分比单位；另两道平均数题的原始标签程序疑似与题意不符，仍保留原评分并公开复核材料。未作独立人审前，标签一致率不能当作已确认的语义正确率。报文字节另受运行标识长度影响，不能把命名开销差异解释成算法收益。</w:t>
       </w:r>
     </w:p>
     <w:p>
@@ -1745,7 +1846,7 @@
           <w:color w:val="000000"/>
           <w:sz w:val="18"/>
         </w:rPr>
-        <w:t>本系统适用于已登记、可提供等价输入的操作。精确选择限于当前已知步骤，最坏搜索代价为指数级；自动识别语义充分视图、任意工具副作用及真实生产部署均未验证。披露项减少不等于隐私风险同比降低，接收方串通与控制器旁路也不在保证范围内。</w:t>
+        <w:t>当前证据支持真实模型计划进入受限执行闭环，以及变化后复用有效结果的系统价值。预算是对已知图的可检验约束；后续规划相对强贪心的实际收益尚未建立。自动生成等价视图、更多任务域和模型、真人质量评阅及生产部署仍需验证。</w:t>
       </w:r>
     </w:p>
     <w:p>
@@ -1762,7 +1863,7 @@
           <w:color w:val="000000"/>
           <w:sz w:val="18"/>
         </w:rPr>
-        <w:t>仓库提供完整源码、双语界面、固定依赖、协议、原始请求及独立核验脚本；所有失败保留。模型调用与控制实验分别存档。演示的贡献在于将执行位置、累计披露和变化后的修复连成可操作、可核对的过程，使观众能检查选择依据及其代价。</w:t>
+        <w:t>仓库提供独立源码、双语界面、无密钥运行、原始模型响应、逐请求接收记录及离线核验器。模型程序与披露决策可追溯到同一轮数据；旧实验不被覆盖。该演示让观众检查每一步为何执行、发送了什么，以及条件变化后哪些工作可以保留。</w:t>
       </w:r>
     </w:p>
     <w:p>
@@ -1810,7 +1911,7 @@
           <w:b w:val="0"/>
           <w:i w:val="0"/>
           <w:color w:val="000000"/>
-          <w:sz w:val="14"/>
+          <w:sz w:val="16"/>
         </w:rPr>
         <w:t>[1] G. Yu 等. PlanTwin: Privacy-Preserving Planning Abstractions for Cloud-Assisted LLM Agents. arXiv:2603.18377, 2026.</w:t>
       </w:r>
@@ -1827,7 +1928,7 @@
           <w:b w:val="0"/>
           <w:i w:val="0"/>
           <w:color w:val="000000"/>
-          <w:sz w:val="14"/>
+          <w:sz w:val="16"/>
         </w:rPr>
         <w:t>[2] W. Li, Y. Xu. ToolMinimize: Auditing and Rewriting LLM Agent Tool Calls to Minimize Privacy Exposure. arXiv:2608.24957, 2026.</w:t>
       </w:r>
@@ -1844,7 +1945,7 @@
           <w:b w:val="0"/>
           <w:i w:val="0"/>
           <w:color w:val="000000"/>
-          <w:sz w:val="14"/>
+          <w:sz w:val="16"/>
         </w:rPr>
         <w:t>[3] H. Yu 等. MINIM: Privacy-Aware Minimal View for Agents via Trusted Local Sanitization. arXiv:2606.13949, 2026.</w:t>
       </w:r>
@@ -1861,7 +1962,7 @@
           <w:b w:val="0"/>
           <w:i w:val="0"/>
           <w:color w:val="000000"/>
-          <w:sz w:val="14"/>
+          <w:sz w:val="16"/>
         </w:rPr>
         <w:t>[4] Y. Lyu, Y. Ren, R. Lai, W. Liu. From Version Conflicts to Decision Conflicts: Selective Revalidation for Long-Running AI Agents. arXiv:2609.08015, 2026.</w:t>
       </w:r>
@@ -1878,7 +1979,7 @@
           <w:b w:val="0"/>
           <w:i w:val="0"/>
           <w:color w:val="000000"/>
-          <w:sz w:val="14"/>
+          <w:sz w:val="16"/>
         </w:rPr>
         <w:t>[5] Hyperwise. FreshCtx 0.16.0. github.com/Hyperwise-LLC/freshctx, 2026. Apache-2.0.</w:t>
       </w:r>
@@ -1895,7 +1996,7 @@
           <w:b w:val="0"/>
           <w:i w:val="0"/>
           <w:color w:val="000000"/>
-          <w:sz w:val="14"/>
+          <w:sz w:val="16"/>
         </w:rPr>
         <w:t>[6] L. Gao 等. PAL: Program-aided Language Models. ICML, 2023, 10764–10799.</w:t>
       </w:r>
@@ -1912,7 +2013,7 @@
           <w:b w:val="0"/>
           <w:i w:val="0"/>
           <w:color w:val="000000"/>
-          <w:sz w:val="14"/>
+          <w:sz w:val="16"/>
         </w:rPr>
         <w:t>[7] Z. Chen 等. FinQA: A Dataset of Numerical Reasoning over Financial Data. EMNLP, 2021, 3697–3711.</w:t>
       </w:r>

</xml_diff>

<commit_message>
Update Chinese manuscript with audited business results and registered requirement execution
</commit_message>
<xml_diff>
--- a/paper/zh-CN/按步执行与信息共享_中文最新稿.docx
+++ b/paper/zh-CN/按步执行与信息共享_中文最新稿.docx
@@ -56,6 +56,16 @@
     </w:p>
     <w:p>
       <w:pPr>
+        <w:sectPr>
+          <w:pgSz w:w="12240" w:h="15840"/>
+          <w:pgMar w:top="1500" w:right="1080" w:bottom="1600" w:left="1080" w:header="432" w:footer="504" w:gutter="0"/>
+          <w:cols w:space="480" w:num="1"/>
+          <w:docGrid w:linePitch="360"/>
+        </w:sectPr>
+      </w:pPr>
+    </w:p>
+    <w:p>
+      <w:pPr>
         <w:keepNext/>
         <w:spacing w:before="120" w:after="40"/>
       </w:pPr>
@@ -84,7 +94,7 @@
           <w:color w:val="000000"/>
           <w:sz w:val="18"/>
         </w:rPr>
-        <w:t>智能体运行中出现的新步骤，可能需要不同的执行位置与输入；源值或能力变化又会使已有计划失效。本文演示按步执行与信息共享系统：结合接收方已见信息选择当前已知步骤的等价输入，在数值字段传输预算内规划后续执行，并保留仍有效的纯计算结果。24 道公开财务问题的 96 次真实 DeepSeek 调用产生 48 份计划；在五种受控条件、六方法的配对执行中，局部修复比完整重跑减少 21.1% 的 HTTP 算子调用。后续规划在该批次未优于逐步贪心；48 份计划均可执行，但仅 28 份与原始数值标签一致。双栏界面将模型提出的步骤、条件变化与实际接收内容对应展示，使执行收益及其边界可以核对。</w:t>
+        <w:t>智能体处理本地资料时，运行中新增的步骤可能需要云端模型或外部工具。沿用完整上下文会扩大共享范围，固定裁剪又可能遗漏后续输入。本文介绍按步执行与信息共享原型：由本地控制器选择登记的执行方式和接收方视图，在发送前核对来源、能力与授权，状态变化后保留仍有效的计算结果。双栏界面将任务步骤与实际接收内容对应展示。24 道公开财务问题产生 48 份真实模型计划；受控配对执行中，结果复用使 HTTP 算子调用从 331 次降至 261 次。零售与航空多轮开发任务进一步检验原生业务操作和本地引用绑定。实验分别报告任务答案、执行一致性与实际外发，避免把成功执行等同于语义正确。</w:t>
       </w:r>
     </w:p>
     <w:p>
@@ -134,8 +144,87 @@
           <w:color w:val="000000"/>
           <w:sz w:val="18"/>
         </w:rPr>
-        <w:t>以合同计费任务为例：一个步骤计算金额，另一个步骤检查限额。外部服务可以接收原始数值，也可以接收本地计算的金额。只看当前步骤，发送一个派生值似乎更省；考虑后续步骤，向同一接收方复用已披露的输入可能更合适。若限额在发送前改变，旧请求应当失效，但不依赖限额的已完成计算仍可保留。</w:t>
+        <w:t>企业智能体常先读取内部资料，再向云端模型或工具提出请求。以合同检查为例，解释条款需要条款内容，核算金额可能只需几个数值，后续检索又需要新的查询条件。任务开始时通常无法确定所有步骤，因此，每次新增操作都需要重新判断在哪里执行、当前接收方需要哪些输入。</w:t>
       </w:r>
+    </w:p>
+    <w:p>
+      <w:pPr>
+        <w:spacing w:after="40" w:line="246" w:lineRule="auto"/>
+        <w:ind w:firstLine="230"/>
+        <w:jc w:val="both"/>
+      </w:pPr>
+      <w:r>
+        <w:rPr>
+          <w:rFonts w:ascii="Linux Libertine" w:hAnsi="Linux Libertine" w:eastAsia="SimSun"/>
+          <w:b w:val="0"/>
+          <w:i w:val="0"/>
+          <w:color w:val="000000"/>
+          <w:sz w:val="18"/>
+        </w:rPr>
+        <w:t>即使请求字段没有变化，原来的执行方式也可能失效。例如，本地计算能力被撤销后，待执行步骤必须改用外部服务；已经算出的、来源仍有效的中间结果却无需重复计算。系统需要同时管理执行候选、接收方已见信息与结果来源，而不能仅在任务开始时做一次脱敏。</w:t>
+      </w:r>
+    </w:p>
+    <w:p>
+      <w:pPr>
+        <w:spacing w:after="40" w:line="246" w:lineRule="auto"/>
+        <w:ind w:firstLine="230"/>
+        <w:jc w:val="both"/>
+      </w:pPr>
+      <w:r>
+        <w:rPr>
+          <w:rFonts w:ascii="Linux Libertine" w:hAnsi="Linux Libertine" w:eastAsia="SimSun"/>
+          <w:b w:val="0"/>
+          <w:i w:val="0"/>
+          <w:color w:val="000000"/>
+          <w:sz w:val="18"/>
+        </w:rPr>
+        <w:t>PlanTwin [1] 通过规划抽象和本地门控限制云端观察；PrivScope [2] 按子任务控制披露范围与抽象程度；MINIM [3] 根据敏感性和任务必要性处理界面观察。这些工作已覆盖本地裁剪、抽象与披露控制，本文不将这些组成技术单独作为首次提出的方法。</w:t>
+      </w:r>
+    </w:p>
+    <w:p>
+      <w:pPr>
+        <w:spacing w:after="40" w:line="246" w:lineRule="auto"/>
+        <w:ind w:firstLine="230"/>
+        <w:jc w:val="both"/>
+      </w:pPr>
+      <w:r>
+        <w:rPr>
+          <w:rFonts w:ascii="Linux Libertine" w:hAnsi="Linux Libertine" w:eastAsia="SimSun"/>
+          <w:b w:val="0"/>
+          <w:i w:val="0"/>
+          <w:color w:val="000000"/>
+          <w:sz w:val="18"/>
+        </w:rPr>
+        <w:t>本演示面向智能体应用开发者与数据管理员，将上述决策落实为可检查的执行过程：数值路径比较登记的等价输入并复用有效结果；业务路径以不透明引用保留本地精确值，在执行具体工具时完成绑定。两条路径共用“模型提案—本地核验—实际执行—接收记录”的观察方式，其适用条件和证据分别报告。</w:t>
+      </w:r>
+    </w:p>
+    <w:p>
+      <w:pPr>
+        <w:spacing w:after="40" w:line="246" w:lineRule="auto"/>
+        <w:ind w:firstLine="230"/>
+        <w:jc w:val="both"/>
+      </w:pPr>
+      <w:r>
+        <w:rPr>
+          <w:rFonts w:ascii="Linux Libertine" w:hAnsi="Linux Libertine" w:eastAsia="SimSun"/>
+          <w:b w:val="0"/>
+          <w:i w:val="0"/>
+          <w:color w:val="000000"/>
+          <w:sz w:val="18"/>
+        </w:rPr>
+        <w:t>系统的展示重点是决策与实际数据流之间的对应关系。观众可以检查模型提出的计算，改变本地能力或源值，比较哪些步骤被重算，并直接查看接收端收到的内容。本文贡献为具备可复核执行记录的研究原型，以及对复用、规划和引用检查作用的分项评估；不声称已解决任意自然语言任务的最小充分信息判定。</w:t>
+      </w:r>
+    </w:p>
+    <w:p>
+      <w:pPr>
+        <w:sectPr>
+          <w:type w:val="continuous"/>
+          <w:pgSz w:w="12240" w:h="15840"/>
+          <w:pgMar w:top="1500" w:right="1080" w:bottom="1600" w:left="1080" w:header="432" w:footer="504" w:gutter="0"/>
+          <w:cols w:space="480" w:num="2"/>
+          <w:docGrid w:linePitch="360"/>
+        </w:sectPr>
+      </w:pPr>
     </w:p>
     <w:p>
       <w:pPr>
@@ -197,96 +286,10 @@
     <w:p>
       <w:pPr>
         <w:sectPr>
+          <w:type w:val="continuous"/>
           <w:pgSz w:w="12240" w:h="15840"/>
           <w:pgMar w:top="1500" w:right="1080" w:bottom="1600" w:left="1080" w:header="432" w:footer="504" w:gutter="0"/>
           <w:cols w:space="480" w:num="1"/>
-          <w:docGrid w:linePitch="360"/>
-        </w:sectPr>
-      </w:pPr>
-    </w:p>
-    <w:p>
-      <w:pPr>
-        <w:spacing w:after="40" w:line="246" w:lineRule="auto"/>
-        <w:ind w:firstLine="230"/>
-        <w:jc w:val="both"/>
-      </w:pPr>
-      <w:r>
-        <w:rPr>
-          <w:rFonts w:ascii="Linux Libertine" w:hAnsi="Linux Libertine" w:eastAsia="SimSun"/>
-          <w:b w:val="0"/>
-          <w:i w:val="0"/>
-          <w:color w:val="000000"/>
-          <w:sz w:val="18"/>
-        </w:rPr>
-        <w:t>这涉及三个相互关联的数据管理问题：计算放在哪里、每个接收方累计获知什么、状态变化后哪些结果仍有效。图 1 展示执行边界；本文在这一结构上实现可追溯的后续规划与局部修复。</w:t>
-      </w:r>
-    </w:p>
-    <w:p>
-      <w:pPr>
-        <w:spacing w:after="40" w:line="246" w:lineRule="auto"/>
-        <w:ind w:firstLine="230"/>
-        <w:jc w:val="both"/>
-      </w:pPr>
-      <w:r>
-        <w:rPr>
-          <w:rFonts w:ascii="Linux Libertine" w:hAnsi="Linux Libertine" w:eastAsia="SimSun"/>
-          <w:b w:val="0"/>
-          <w:i w:val="0"/>
-          <w:color w:val="000000"/>
-          <w:sz w:val="18"/>
-        </w:rPr>
-        <w:t>PlanTwin [1] 已提出云端规划抽象与累计披露预算；ToolMinimize [2] 和 MINIM [3] 分别限制工具参数与界面观察。ATR [4] 研究变化后的决策重验证，FreshCtx [5] 提供上下文时效检查。因此，裁剪、预算和依赖核验本身均不足以构成新颖性。</w:t>
-      </w:r>
-    </w:p>
-    <w:p>
-      <w:pPr>
-        <w:spacing w:after="0" w:before="0" w:line="20" w:lineRule="exact"/>
-      </w:pPr>
-      <w:r>
-        <w:br w:type="column"/>
-      </w:r>
-    </w:p>
-    <w:p>
-      <w:pPr>
-        <w:spacing w:after="40" w:line="246" w:lineRule="auto"/>
-        <w:ind w:firstLine="230"/>
-        <w:jc w:val="both"/>
-      </w:pPr>
-      <w:r>
-        <w:rPr>
-          <w:rFonts w:ascii="Linux Libertine" w:hAnsi="Linux Libertine" w:eastAsia="SimSun"/>
-          <w:b w:val="0"/>
-          <w:i w:val="0"/>
-          <w:color w:val="000000"/>
-          <w:sz w:val="18"/>
-        </w:rPr>
-        <w:t>本文将执行位置、不可撤回的披露历史与变化后的结果复用联合处理。具体实现比较当前已知步骤的登记等价输入，在一个阶段共用剩余传输预算，并用来源依赖区分需要重算和可以保留的结果。贡献是这一受限执行机制及可核验演示，而非新的通用动态规划或自动语义脱敏算法。</w:t>
-      </w:r>
-    </w:p>
-    <w:p>
-      <w:pPr>
-        <w:spacing w:after="40" w:line="246" w:lineRule="auto"/>
-        <w:ind w:firstLine="230"/>
-        <w:jc w:val="both"/>
-      </w:pPr>
-      <w:r>
-        <w:rPr>
-          <w:rFonts w:ascii="Linux Libertine" w:hAnsi="Linux Libertine" w:eastAsia="SimSun"/>
-          <w:b w:val="0"/>
-          <w:i w:val="0"/>
-          <w:color w:val="000000"/>
-          <w:sz w:val="18"/>
-        </w:rPr>
-        <w:t>演示让观众回答三个具体问题：模型提出了哪些计算；条件变化后哪些步骤仍有效；外部接收方究竟收到哪些数值。预算约束限制重复发送字段，已披露集合则记录不同信息项，两者不能混为一谈。真实模型计划和受控干预保存在同一条执行链中，错误答案与无收益结果也予以保留。</w:t>
-      </w:r>
-    </w:p>
-    <w:p>
-      <w:pPr>
-        <w:sectPr>
-          <w:type w:val="continuous"/>
-          <w:pgSz w:w="12240" w:h="15840"/>
-          <w:pgMar w:top="1500" w:right="1080" w:bottom="1600" w:left="1080" w:header="432" w:footer="504" w:gutter="0"/>
-          <w:cols w:space="480" w:num="2"/>
           <w:docGrid w:linePitch="360"/>
         </w:sectPr>
       </w:pPr>
@@ -304,7 +307,7 @@
           <w:color w:val="000000"/>
           <w:sz w:val="18"/>
         </w:rPr>
-        <w:t>2  面向接收方的后续执行</w:t>
+        <w:t>2  逐步执行与接收方视图</w:t>
       </w:r>
     </w:p>
     <w:p>
@@ -337,7 +340,7 @@
           <w:color w:val="000000"/>
           <w:sz w:val="18"/>
         </w:rPr>
-        <w:t>版本化状态 S 保存源值、授权与本地能力。模型先申请不含业务数值的表结构，再提交有限计算图；控制器仅接受六种登记算子、前向执行且无无用节点的程序。候选 a 指定接收方 r 与等价视图 V：原始字段加子表达式，或已计算的直接操作数。</w:t>
+        <w:t>版本化状态 S 保存源值、授权与本地能力。数值路径中，模型先读取不含业务数值的表结构，再提交计算图；控制器只接受六种登记算子组成的前向程序，所有节点都须参与最终结果。候选 a 指定执行位置、接收方 r 和输入视图 V；视图可以是原值与子表达式，也可以是已算出的直接操作数。</w:t>
       </w:r>
     </w:p>
     <w:p>
@@ -835,7 +838,7 @@
           <w:color w:val="000000"/>
           <w:sz w:val="18"/>
         </w:rPr>
-        <w:t>请求内容未变，不代表原执行方式仍可行。本地能力变化可能要求改用外部算子；源值变化可能使缓存过期。控制器区分决定候选可行性的规划依赖与决定结果数值的传递依赖：</w:t>
+        <w:t>控制器区分两类依赖：源值决定结果是否仍有效；能力和授权决定执行方式是否仍可行。发送前，两类依赖的记录版本都必须与当前版本一致：</w:t>
       </w:r>
     </w:p>
     <w:p>
@@ -1378,6 +1381,22 @@
     </w:p>
     <w:p>
       <w:pPr>
+        <w:keepNext/>
+        <w:spacing w:before="80" w:after="40"/>
+      </w:pPr>
+      <w:r>
+        <w:rPr>
+          <w:rFonts w:ascii="Linux Libertine" w:hAnsi="Linux Libertine" w:eastAsia="SimHei"/>
+          <w:b/>
+          <w:i w:val="0"/>
+          <w:color w:val="000000"/>
+          <w:sz w:val="18"/>
+        </w:rPr>
+        <w:t>2.4  业务绑定与信息补充</w:t>
+      </w:r>
+    </w:p>
+    <w:p>
+      <w:pPr>
         <w:spacing w:after="40" w:line="246" w:lineRule="auto"/>
         <w:ind w:firstLine="230"/>
         <w:jc w:val="both"/>
@@ -1390,7 +1409,7 @@
           <w:color w:val="000000"/>
           <w:sz w:val="18"/>
         </w:rPr>
-        <w:t>该预算只约束当前状态与已知后续图。新步骤或源状态变化后必须重建阶段，不能由此推导跨变化的总量界限。字段数也不是 HTTP 字节数；报文标签、表达式与结构信息另占空间，实验分别记录这些代价。</w:t>
+        <w:t>业务适配器将六类登记字段替换为不透明引用，在原生工具调用前恢复精确值，并可检查目标参数和来源当前值；改变业务状态的操作另需本地确认。独立的信息补充执行器只接受已登记的结构需求，在本地完成、派生结果与获准原值之间选择，拒绝模型自行扩大的字段请求。它已通过构造案例的真实 HTTP 检查，尚未接入本文批量模型实验；其有限契约不能判定自由文本是否充分。</w:t>
       </w:r>
     </w:p>
     <w:p>
@@ -1517,7 +1536,7 @@
           <w:color w:val="000000"/>
           <w:sz w:val="18"/>
         </w:rPr>
-        <w:t>第一组使用公开财务表格：模型通过真实工具调用申请表结构，随后提交“相加、相加、相除”的计算图。观众查看原始回复后执行该图；首步完成时撤销登记的本地加减能力，系统保留首步结果，将后续步骤交给 HTTP 算子。切换完整重跑，可直接看到该首步被重复执行。</w:t>
+        <w:t>场景一展示公开财务表格。模型通过真实工具调用读取表结构，提交“相加、相加、相除”的计算图。观众运行保存的计划；首步完成后，预定事件撤销本地加减能力。系统保留首步结果，把后续计算交给 HTTP 算子。切换完整重跑，首步会重复执行。右栏显示这一差异对应的实际请求，观众无需从最终统计数字猜测发生了什么。</w:t>
       </w:r>
     </w:p>
     <w:p>
@@ -1534,7 +1553,7 @@
           <w:color w:val="000000"/>
           <w:sz w:val="18"/>
         </w:rPr>
-        <w:t>第二组分别改变已用与未用源值。已用值更新使依赖它的结果失效；未用值更新则保留已有计算。右侧显示原始字段或中间值，以及本阶段剩余字段预算。全本地条件展示无需外部数值服务的边界，混合能力是实验配置，不表示加减乘除天然需要云端。</w:t>
+        <w:t>场景二比较已用与未用源值更新。前者使相关结果失效，后者保留已有计算。右侧显示发送的原值或中间值，以及本阶段剩余预算。全本地设置展示不需要外部数值服务的情况；混合能力是受控配置，不表示加减乘除天然需要云端。两种干预均由程序执行，不是截图中的装饰性状态。</w:t>
       </w:r>
     </w:p>
     <w:p>
@@ -1551,7 +1570,7 @@
           <w:color w:val="000000"/>
           <w:sz w:val="18"/>
         </w:rPr>
-        <w:t>无密钥模式重用公开的真实模型计划，但重新执行本地计算及 HTTP 请求；不是重新调用模型，也不是只播放预设结果。读者可用自己的密钥运行完整批次命令，产生新的模型计划。旧版合同案例、逐步补充和人工撤权记录继续保留，均与新实验分开。</w:t>
+        <w:t>无密钥模式重用真实模型计划，重新执行计算与 HTTP 请求。现场模型调用使用读者自己的密钥；密钥不随仓库发布。合同案例保留模型运行中提出检索步骤的记录。零售和航空适配器提供独立批次与离线复核命令，尚未并入图 2 的可视界面，因此不将其描述为已完成的页面演示。</w:t>
       </w:r>
     </w:p>
     <w:p>
@@ -1592,7 +1611,7 @@
           <w:color w:val="000000"/>
           <w:sz w:val="18"/>
         </w:rPr>
-        <w:t>在新调用前冻结提示词、执行器、评价器和事件安排。从 FinQA [7] 排除此前使用的公司年度报告，固定顺序选择 24 题、24 份报告；12 题来自原 test 划分、12 题来自原 dev 划分，各保留来源标记。兼容筛选限定可由表格与登记算子回答的多操作问题；另四题仅用于开发。</w:t>
+        <w:t>数值实验在模型调用前冻结提示词、执行器、评价器与事件安排。FinQA [4] 子集包含 24 题、24 份此前未用的公司年度报告，原 test 与 dev 划分各 12 题；兼容筛选限定可由表格和登记算子处理的问题，另四题仅作开发。执行器不读取答案标签。</w:t>
       </w:r>
     </w:p>
     <w:p>
@@ -1609,7 +1628,7 @@
           <w:color w:val="000000"/>
           <w:sz w:val="18"/>
         </w:rPr>
-        <w:t>每题实际调用 DeepSeek 两轮生成计划，每份计划包含申请结构与提交计算两个请求，共 48 份计划、96 次调用。每份计划在五种条件下比较六方法：完整重跑、修复加贪心、无传输约束的后续规划，以及 0%、10%、25% 预算。共享模型前缀保证执行方法的配对可比；1,440 次执行不是 1,440 次独立模型任务。</w:t>
+        <w:t>每题生成两份 DeepSeek 计划，每份使用两次工具调用，共 48 份计划、96 次请求。各计划在五种条件下比较完整重跑、复用加贪心、无预算后续规划及三档预算方法。五种条件为全本地、混合能力稳定、已用值更新、未用值更新和能力撤销。每种方法 240 次执行，共 1,440 次；它们共享计划，不是独立模型样本。</w:t>
       </w:r>
     </w:p>
     <w:p>
@@ -1626,7 +1645,7 @@
           <w:color w:val="000000"/>
           <w:sz w:val="18"/>
         </w:rPr>
-        <w:t>五种条件为全本地、混合能力无变化、已用值更新、未用值更新和本地能力撤销。干预在模型图约半数步骤完成时触发，源值按预定规则变化；执行器不读参考答案。评估分别检查模型图执行一致性、原始标签一致性、来源有效性及实际载荷，全部错误保留。</w:t>
+        <w:t>业务开发实验使用 τ²-bench [5] 的三个零售和三个航空训练任务，保留原生工具、状态和参数校验，增加统一的本地确认层。比较完整工具返回、普通引用与受限引用；每种方法最后一批各执行六个任务。开发过程中共 54 次尝试、952 次真实调用，所有失败保留。这六个任务被反复使用，不能作为独立测试集。</w:t>
       </w:r>
     </w:p>
     <w:p>
@@ -1643,7 +1662,7 @@
           <w:color w:val="000000"/>
           <w:sz w:val="18"/>
         </w:rPr>
-        <w:t>另保存 288 个合成变化场景、六方法的机制消融，以及旧版 600 次模型任务；它们不与本批次合并统计。新批次每道题的两份计划和五种条件相关，统计单位为题。按题聚类的探索性自助法只用于描述外部调用减少量，不证明真实生产中的泛化收益。</w:t>
+        <w:t>数值评价区分模型答案与按图执行一致性，并按源问题聚类统计。业务评价检查完整数据库是否与参考操作所得状态一致，不冒充官方综合得分。另固定普通与受限引用的全部末批轨迹，在两个新数据库中仅切换引用检查；若结果分歧即停止，避免把后续保存动作误当成有效反事实。</w:t>
       </w:r>
     </w:p>
     <w:p>
@@ -1754,7 +1773,7 @@
           <w:color w:val="000000"/>
           <w:sz w:val="18"/>
         </w:rPr>
-        <w:t>48 份模型图均可执行，各方法在 240 次运行中均与该图的当前数值语义一致，但只有 137 次与相应的参考表达式输出一致。原始、未干预问题的标签一致性为 28/48。这里“执行正确”只说明按模型表达式算对，不能说明模型选对了字段或理解了题意。</w:t>
+        <w:t>数值路径中，48 份计划均可执行，但原问题标签一致性仅为 28/48。结果复用将 HTTP 调用从 331 次降至 261 次，减少 21.1%；数值字段传输从 724 次降至 500 次。按 24 题聚类的探索性自助区间为 [19.1%, 23.8%]。收益主要来自能力撤销和未用源值变化后的结果保留。</w:t>
       </w:r>
     </w:p>
     <w:p>
@@ -1771,7 +1790,417 @@
           <w:color w:val="000000"/>
           <w:sz w:val="18"/>
         </w:rPr>
-        <w:t>与完整重跑相比，保留有效结果将外部调用从 331 降到 261，减少 21.1%，复用 112 个计算；传输数值字段由 724 降至 500。按 24 题聚类、10,000 次探索性重采样，调用减少比例的区间为 [19.1%, 23.8%]。主要收益来自能力撤销及未用值变化后的结果保留。</w:t>
+        <w:t>图 3 中，贪心、后续规划和三档预算的披露项及传输字段均相同，未观察到规划的额外收益。按图执行一致也不意味着答案正确：错误涉及年份选择、差值方向和百分比单位；两道疑似标签错误的平均数题仍保留原评分，未据此提高结果。</w:t>
+      </w:r>
+    </w:p>
+    <w:p>
+      <w:pPr>
+        <w:keepNext/>
+        <w:spacing w:before="80" w:after="40"/>
+      </w:pPr>
+      <w:r>
+        <w:rPr>
+          <w:rFonts w:ascii="Linux Libertine" w:hAnsi="Linux Libertine" w:eastAsia="SimHei"/>
+          <w:b/>
+          <w:i w:val="0"/>
+          <w:color w:val="000000"/>
+          <w:sz w:val="18"/>
+        </w:rPr>
+        <w:t>表 1  原生业务开发任务的末批结果</w:t>
+      </w:r>
+    </w:p>
+    <w:tbl>
+      <w:tblPr>
+        <w:tblW w:type="auto" w:w="0"/>
+        <w:tblLayout w:type="fixed"/>
+        <w:tblLook w:firstColumn="1" w:firstRow="1" w:lastColumn="0" w:lastRow="0" w:noHBand="0" w:noVBand="1" w:val="04A0"/>
+      </w:tblPr>
+      <w:tblGrid>
+        <w:gridCol w:w="1469"/>
+        <w:gridCol w:w="1051"/>
+        <w:gridCol w:w="1166"/>
+        <w:gridCol w:w="1109"/>
+      </w:tblGrid>
+      <w:tr>
+        <w:tc>
+          <w:tcPr>
+            <w:tcW w:type="dxa" w:w="1469"/>
+            <w:tcBorders>
+              <w:top w:val="single" w:sz="4"/>
+              <w:bottom w:val="single" w:sz="4"/>
+            </w:tcBorders>
+          </w:tcPr>
+          <w:p>
+            <w:pPr>
+              <w:spacing w:after="40" w:line="240" w:lineRule="auto"/>
+            </w:pPr>
+            <w:r>
+              <w:rPr>
+                <w:rFonts w:ascii="Linux Libertine" w:hAnsi="Linux Libertine" w:eastAsia="SimSun"/>
+                <w:b/>
+                <w:i w:val="0"/>
+                <w:color w:val="000000"/>
+                <w:sz w:val="15"/>
+              </w:rPr>
+              <w:t>方法</w:t>
+            </w:r>
+          </w:p>
+        </w:tc>
+        <w:tc>
+          <w:tcPr>
+            <w:tcW w:type="dxa" w:w="1051"/>
+            <w:tcBorders>
+              <w:top w:val="single" w:sz="4"/>
+              <w:bottom w:val="single" w:sz="4"/>
+            </w:tcBorders>
+          </w:tcPr>
+          <w:p>
+            <w:pPr>
+              <w:spacing w:after="40" w:line="240" w:lineRule="auto"/>
+            </w:pPr>
+            <w:r>
+              <w:rPr>
+                <w:rFonts w:ascii="Linux Libertine" w:hAnsi="Linux Libertine" w:eastAsia="SimSun"/>
+                <w:b/>
+                <w:i w:val="0"/>
+                <w:color w:val="000000"/>
+                <w:sz w:val="15"/>
+              </w:rPr>
+              <w:t>状态一致</w:t>
+            </w:r>
+          </w:p>
+        </w:tc>
+        <w:tc>
+          <w:tcPr>
+            <w:tcW w:type="dxa" w:w="1166"/>
+            <w:tcBorders>
+              <w:top w:val="single" w:sz="4"/>
+              <w:bottom w:val="single" w:sz="4"/>
+            </w:tcBorders>
+          </w:tcPr>
+          <w:p>
+            <w:pPr>
+              <w:spacing w:after="40" w:line="240" w:lineRule="auto"/>
+            </w:pPr>
+            <w:r>
+              <w:rPr>
+                <w:rFonts w:ascii="Linux Libertine" w:hAnsi="Linux Libertine" w:eastAsia="SimSun"/>
+                <w:b/>
+                <w:i w:val="0"/>
+                <w:color w:val="000000"/>
+                <w:sz w:val="15"/>
+              </w:rPr>
+              <w:t>原值出现</w:t>
+            </w:r>
+          </w:p>
+        </w:tc>
+        <w:tc>
+          <w:tcPr>
+            <w:tcW w:type="dxa" w:w="1109"/>
+            <w:tcBorders>
+              <w:top w:val="single" w:sz="4"/>
+              <w:bottom w:val="single" w:sz="4"/>
+            </w:tcBorders>
+          </w:tcPr>
+          <w:p>
+            <w:pPr>
+              <w:spacing w:after="40" w:line="240" w:lineRule="auto"/>
+            </w:pPr>
+            <w:r>
+              <w:rPr>
+                <w:rFonts w:ascii="Linux Libertine" w:hAnsi="Linux Libertine" w:eastAsia="SimSun"/>
+                <w:b/>
+                <w:i w:val="0"/>
+                <w:color w:val="000000"/>
+                <w:sz w:val="15"/>
+              </w:rPr>
+              <w:t>检查拒绝</w:t>
+            </w:r>
+          </w:p>
+        </w:tc>
+      </w:tr>
+      <w:tr>
+        <w:tc>
+          <w:tcPr>
+            <w:tcW w:type="dxa" w:w="1469"/>
+            <w:tcBorders/>
+          </w:tcPr>
+          <w:p>
+            <w:pPr>
+              <w:spacing w:after="40" w:line="240" w:lineRule="auto"/>
+            </w:pPr>
+            <w:r>
+              <w:rPr>
+                <w:rFonts w:ascii="Linux Libertine" w:hAnsi="Linux Libertine" w:eastAsia="SimSun"/>
+                <w:b w:val="0"/>
+                <w:i w:val="0"/>
+                <w:color w:val="000000"/>
+                <w:sz w:val="15"/>
+              </w:rPr>
+              <w:t>完整返回</w:t>
+            </w:r>
+          </w:p>
+        </w:tc>
+        <w:tc>
+          <w:tcPr>
+            <w:tcW w:type="dxa" w:w="1051"/>
+            <w:tcBorders/>
+          </w:tcPr>
+          <w:p>
+            <w:pPr>
+              <w:spacing w:after="40" w:line="240" w:lineRule="auto"/>
+            </w:pPr>
+            <w:r>
+              <w:rPr>
+                <w:rFonts w:ascii="Linux Libertine" w:hAnsi="Linux Libertine" w:eastAsia="SimSun"/>
+                <w:b w:val="0"/>
+                <w:i w:val="0"/>
+                <w:color w:val="000000"/>
+                <w:sz w:val="15"/>
+              </w:rPr>
+              <w:t>5/6</w:t>
+            </w:r>
+          </w:p>
+        </w:tc>
+        <w:tc>
+          <w:tcPr>
+            <w:tcW w:type="dxa" w:w="1166"/>
+            <w:tcBorders/>
+          </w:tcPr>
+          <w:p>
+            <w:pPr>
+              <w:spacing w:after="40" w:line="240" w:lineRule="auto"/>
+            </w:pPr>
+            <w:r>
+              <w:rPr>
+                <w:rFonts w:ascii="Linux Libertine" w:hAnsi="Linux Libertine" w:eastAsia="SimSun"/>
+                <w:b w:val="0"/>
+                <w:i w:val="0"/>
+                <w:color w:val="000000"/>
+                <w:sz w:val="15"/>
+              </w:rPr>
+              <w:t>111</w:t>
+            </w:r>
+          </w:p>
+        </w:tc>
+        <w:tc>
+          <w:tcPr>
+            <w:tcW w:type="dxa" w:w="1109"/>
+            <w:tcBorders/>
+          </w:tcPr>
+          <w:p>
+            <w:pPr>
+              <w:spacing w:after="40" w:line="240" w:lineRule="auto"/>
+            </w:pPr>
+            <w:r>
+              <w:rPr>
+                <w:rFonts w:ascii="Linux Libertine" w:hAnsi="Linux Libertine" w:eastAsia="SimSun"/>
+                <w:b w:val="0"/>
+                <w:i w:val="0"/>
+                <w:color w:val="000000"/>
+                <w:sz w:val="15"/>
+              </w:rPr>
+              <w:t>0</w:t>
+            </w:r>
+          </w:p>
+        </w:tc>
+      </w:tr>
+      <w:tr>
+        <w:tc>
+          <w:tcPr>
+            <w:tcW w:type="dxa" w:w="1469"/>
+            <w:tcBorders/>
+          </w:tcPr>
+          <w:p>
+            <w:pPr>
+              <w:spacing w:after="40" w:line="240" w:lineRule="auto"/>
+            </w:pPr>
+            <w:r>
+              <w:rPr>
+                <w:rFonts w:ascii="Linux Libertine" w:hAnsi="Linux Libertine" w:eastAsia="SimSun"/>
+                <w:b w:val="0"/>
+                <w:i w:val="0"/>
+                <w:color w:val="000000"/>
+                <w:sz w:val="15"/>
+              </w:rPr>
+              <w:t>普通引用</w:t>
+            </w:r>
+          </w:p>
+        </w:tc>
+        <w:tc>
+          <w:tcPr>
+            <w:tcW w:type="dxa" w:w="1051"/>
+            <w:tcBorders/>
+          </w:tcPr>
+          <w:p>
+            <w:pPr>
+              <w:spacing w:after="40" w:line="240" w:lineRule="auto"/>
+            </w:pPr>
+            <w:r>
+              <w:rPr>
+                <w:rFonts w:ascii="Linux Libertine" w:hAnsi="Linux Libertine" w:eastAsia="SimSun"/>
+                <w:b w:val="0"/>
+                <w:i w:val="0"/>
+                <w:color w:val="000000"/>
+                <w:sz w:val="15"/>
+              </w:rPr>
+              <w:t>4/6</w:t>
+            </w:r>
+          </w:p>
+        </w:tc>
+        <w:tc>
+          <w:tcPr>
+            <w:tcW w:type="dxa" w:w="1166"/>
+            <w:tcBorders/>
+          </w:tcPr>
+          <w:p>
+            <w:pPr>
+              <w:spacing w:after="40" w:line="240" w:lineRule="auto"/>
+            </w:pPr>
+            <w:r>
+              <w:rPr>
+                <w:rFonts w:ascii="Linux Libertine" w:hAnsi="Linux Libertine" w:eastAsia="SimSun"/>
+                <w:b w:val="0"/>
+                <w:i w:val="0"/>
+                <w:color w:val="000000"/>
+                <w:sz w:val="15"/>
+              </w:rPr>
+              <w:t>0</w:t>
+            </w:r>
+          </w:p>
+        </w:tc>
+        <w:tc>
+          <w:tcPr>
+            <w:tcW w:type="dxa" w:w="1109"/>
+            <w:tcBorders/>
+          </w:tcPr>
+          <w:p>
+            <w:pPr>
+              <w:spacing w:after="40" w:line="240" w:lineRule="auto"/>
+            </w:pPr>
+            <w:r>
+              <w:rPr>
+                <w:rFonts w:ascii="Linux Libertine" w:hAnsi="Linux Libertine" w:eastAsia="SimSun"/>
+                <w:b w:val="0"/>
+                <w:i w:val="0"/>
+                <w:color w:val="000000"/>
+                <w:sz w:val="15"/>
+              </w:rPr>
+              <w:t>0</w:t>
+            </w:r>
+          </w:p>
+        </w:tc>
+      </w:tr>
+      <w:tr>
+        <w:tc>
+          <w:tcPr>
+            <w:tcW w:type="dxa" w:w="1469"/>
+            <w:tcBorders>
+              <w:bottom w:val="single" w:sz="4"/>
+            </w:tcBorders>
+          </w:tcPr>
+          <w:p>
+            <w:pPr>
+              <w:spacing w:after="40" w:line="240" w:lineRule="auto"/>
+            </w:pPr>
+            <w:r>
+              <w:rPr>
+                <w:rFonts w:ascii="Linux Libertine" w:hAnsi="Linux Libertine" w:eastAsia="SimSun"/>
+                <w:b w:val="0"/>
+                <w:i w:val="0"/>
+                <w:color w:val="000000"/>
+                <w:sz w:val="15"/>
+              </w:rPr>
+              <w:t>受限引用</w:t>
+            </w:r>
+          </w:p>
+        </w:tc>
+        <w:tc>
+          <w:tcPr>
+            <w:tcW w:type="dxa" w:w="1051"/>
+            <w:tcBorders>
+              <w:bottom w:val="single" w:sz="4"/>
+            </w:tcBorders>
+          </w:tcPr>
+          <w:p>
+            <w:pPr>
+              <w:spacing w:after="40" w:line="240" w:lineRule="auto"/>
+            </w:pPr>
+            <w:r>
+              <w:rPr>
+                <w:rFonts w:ascii="Linux Libertine" w:hAnsi="Linux Libertine" w:eastAsia="SimSun"/>
+                <w:b w:val="0"/>
+                <w:i w:val="0"/>
+                <w:color w:val="000000"/>
+                <w:sz w:val="15"/>
+              </w:rPr>
+              <w:t>6/6</w:t>
+            </w:r>
+          </w:p>
+        </w:tc>
+        <w:tc>
+          <w:tcPr>
+            <w:tcW w:type="dxa" w:w="1166"/>
+            <w:tcBorders>
+              <w:bottom w:val="single" w:sz="4"/>
+            </w:tcBorders>
+          </w:tcPr>
+          <w:p>
+            <w:pPr>
+              <w:spacing w:after="40" w:line="240" w:lineRule="auto"/>
+            </w:pPr>
+            <w:r>
+              <w:rPr>
+                <w:rFonts w:ascii="Linux Libertine" w:hAnsi="Linux Libertine" w:eastAsia="SimSun"/>
+                <w:b w:val="0"/>
+                <w:i w:val="0"/>
+                <w:color w:val="000000"/>
+                <w:sz w:val="15"/>
+              </w:rPr>
+              <w:t>0</w:t>
+            </w:r>
+          </w:p>
+        </w:tc>
+        <w:tc>
+          <w:tcPr>
+            <w:tcW w:type="dxa" w:w="1109"/>
+            <w:tcBorders>
+              <w:bottom w:val="single" w:sz="4"/>
+            </w:tcBorders>
+          </w:tcPr>
+          <w:p>
+            <w:pPr>
+              <w:spacing w:after="40" w:line="240" w:lineRule="auto"/>
+            </w:pPr>
+            <w:r>
+              <w:rPr>
+                <w:rFonts w:ascii="Linux Libertine" w:hAnsi="Linux Libertine" w:eastAsia="SimSun"/>
+                <w:b w:val="0"/>
+                <w:i w:val="0"/>
+                <w:color w:val="000000"/>
+                <w:sz w:val="15"/>
+              </w:rPr>
+              <w:t>0</w:t>
+            </w:r>
+          </w:p>
+        </w:tc>
+      </w:tr>
+    </w:tbl>
+    <w:p>
+      <w:pPr>
+        <w:spacing w:after="40" w:line="246" w:lineRule="auto"/>
+        <w:ind w:firstLine="0"/>
+        <w:jc w:val="both"/>
+      </w:pPr>
+      <w:r>
+        <w:rPr>
+          <w:rFonts w:ascii="Linux Libertine" w:hAnsi="Linux Libertine" w:eastAsia="SimSun"/>
+          <w:b w:val="0"/>
+          <w:i w:val="0"/>
+          <w:color w:val="000000"/>
+          <w:sz w:val="16"/>
+        </w:rPr>
+        <w:t>“原值出现”仅统计发给规划模型的不同工具消息中六类登记字段的非空原值，排除用户对话和确认模拟器；它不是语义泄露率。普通引用同样将该计数降为零，不能把这一效果归于新增用途检查。</w:t>
       </w:r>
     </w:p>
     <w:p>
@@ -1788,24 +2217,7 @@
           <w:color w:val="000000"/>
           <w:sz w:val="18"/>
         </w:rPr>
-        <w:t>逐步贪心、后续规划及三档预算均产生 425 个不同披露项、500 个传输字段，未观察到后续规划的新增收益。旧合成测试中规划曾减少 2.9% 的披露项，却增加 54.5% 的传输字段；新约束提供阶段预算界限，但本批次并未证明该约束带来额外效率提升。</w:t>
-      </w:r>
-    </w:p>
-    <w:p>
-      <w:pPr>
-        <w:spacing w:after="40" w:line="246" w:lineRule="auto"/>
-        <w:ind w:firstLine="230"/>
-        <w:jc w:val="both"/>
-      </w:pPr>
-      <w:r>
-        <w:rPr>
-          <w:rFonts w:ascii="Linux Libertine" w:hAnsi="Linux Libertine" w:eastAsia="SimSun"/>
-          <w:b w:val="0"/>
-          <w:i w:val="0"/>
-          <w:color w:val="000000"/>
-          <w:sz w:val="18"/>
-        </w:rPr>
-        <w:t>错误记录包括年份选择、差值方向和百分比单位；另两道平均数题的原始标签程序疑似与题意不符，仍保留原评分并公开复核材料。未作独立人审前，标签一致率不能当作已确认的语义正确率。报文字节另受运行标识长度影响，不能把命名开销差异解释成算法收益。</w:t>
+        <w:t>为核查表 1 的完成差异，对两种引用方法的 12 条轨迹、107 个业务提案逐一切换检查。两侧调用和最终状态全部一致。这说明本批次没有体现新增检查的执行收益；不同采样对话中的 4/6 与 6/6 不足以建立因果关系。</w:t>
       </w:r>
     </w:p>
     <w:p>
@@ -1846,7 +2258,24 @@
           <w:color w:val="000000"/>
           <w:sz w:val="18"/>
         </w:rPr>
-        <w:t>当前证据支持真实模型计划进入受限执行闭环，以及变化后复用有效结果的系统价值。预算是对已知图的可检验约束；后续规划相对强贪心的实际收益尚未建立。自动生成等价视图、更多任务域和模型、真人质量评阅及生产部署仍需验证。</w:t>
+        <w:t>系统已实现可视执行、版本核验、有效结果复用和原生业务工具适配。证据支持这些组件能够运行并被复核，也支持受控变化下的复用收益；尚不支持后续规划或受限引用优于强对照。登记视图的等价性来自本地规则，不能推广为自动理解任意业务内容。</w:t>
+      </w:r>
+    </w:p>
+    <w:p>
+      <w:pPr>
+        <w:spacing w:after="40" w:line="246" w:lineRule="auto"/>
+        <w:ind w:firstLine="230"/>
+        <w:jc w:val="both"/>
+      </w:pPr>
+      <w:r>
+        <w:rPr>
+          <w:rFonts w:ascii="Linux Libertine" w:hAnsi="Linux Libertine" w:eastAsia="SimSun"/>
+          <w:b w:val="0"/>
+          <w:i w:val="0"/>
+          <w:color w:val="000000"/>
+          <w:sz w:val="18"/>
+        </w:rPr>
+        <w:t>实验仅使用一个模型。业务任务的用户与确认环节也由 DeepSeek 模拟，后者可见原始参数，因此不能宣称模型供应商完全看不到原值。数据库一致性不覆盖全部业务政策；人类对自由文本解释和操作合理性的评阅尚未完成。软件检查、开发样本与独立质量评价不能互相替代。</w:t>
       </w:r>
     </w:p>
     <w:p>
@@ -1863,7 +2292,7 @@
           <w:color w:val="000000"/>
           <w:sz w:val="18"/>
         </w:rPr>
-        <w:t>仓库提供独立源码、双语界面、无密钥运行、原始模型响应、逐请求接收记录及离线核验器。模型程序与披露决策可追溯到同一轮数据；旧实验不被覆盖。该演示让观众检查每一步为何执行、发送了什么，以及条件变化后哪些工作可以保留。</w:t>
+        <w:t>开源包独立于商业客户端，包含双语页面、任务输入、真实模型记录、接收记录和离线核验器。构造的信息补充案例可重跑三阶段决策与两次 HTTP 发送，但不计入模型实验。所有失败、无收益结果和版本来源均保留；读者可以追溯正文数字并复核界面所示过程。</w:t>
       </w:r>
     </w:p>
     <w:p>
@@ -1930,7 +2359,7 @@
           <w:color w:val="000000"/>
           <w:sz w:val="16"/>
         </w:rPr>
-        <w:t>[2] W. Li, Y. Xu. ToolMinimize: Auditing and Rewriting LLM Agent Tool Calls to Minimize Privacy Exposure. arXiv:2608.24957, 2026.</w:t>
+        <w:t>[2] S. R. Seeam 等. PrivScope: Task-scoped Disclosure Control for Hybrid Agentic Systems. arXiv:2605.16630, 2026.</w:t>
       </w:r>
     </w:p>
     <w:p>
@@ -1964,7 +2393,7 @@
           <w:color w:val="000000"/>
           <w:sz w:val="16"/>
         </w:rPr>
-        <w:t>[4] Y. Lyu, Y. Ren, R. Lai, W. Liu. From Version Conflicts to Decision Conflicts: Selective Revalidation for Long-Running AI Agents. arXiv:2609.08015, 2026.</w:t>
+        <w:t>[4] Z. Chen 等. FinQA: A Dataset of Numerical Reasoning over Financial Data. EMNLP, 2021, 3697–3711.</w:t>
       </w:r>
     </w:p>
     <w:p>
@@ -1981,41 +2410,7 @@
           <w:color w:val="000000"/>
           <w:sz w:val="16"/>
         </w:rPr>
-        <w:t>[5] Hyperwise. FreshCtx 0.16.0. github.com/Hyperwise-LLC/freshctx, 2026. Apache-2.0.</w:t>
-      </w:r>
-    </w:p>
-    <w:p>
-      <w:pPr>
-        <w:spacing w:after="20" w:line="246" w:lineRule="auto"/>
-        <w:ind w:left="202" w:hanging="202"/>
-        <w:jc w:val="left"/>
-      </w:pPr>
-      <w:r>
-        <w:rPr>
-          <w:rFonts w:ascii="Linux Libertine" w:hAnsi="Linux Libertine" w:eastAsia="SimSun"/>
-          <w:b w:val="0"/>
-          <w:i w:val="0"/>
-          <w:color w:val="000000"/>
-          <w:sz w:val="16"/>
-        </w:rPr>
-        <w:t>[6] L. Gao 等. PAL: Program-aided Language Models. ICML, 2023, 10764–10799.</w:t>
-      </w:r>
-    </w:p>
-    <w:p>
-      <w:pPr>
-        <w:spacing w:after="20" w:line="246" w:lineRule="auto"/>
-        <w:ind w:left="202" w:hanging="202"/>
-        <w:jc w:val="left"/>
-      </w:pPr>
-      <w:r>
-        <w:rPr>
-          <w:rFonts w:ascii="Linux Libertine" w:hAnsi="Linux Libertine" w:eastAsia="SimSun"/>
-          <w:b w:val="0"/>
-          <w:i w:val="0"/>
-          <w:color w:val="000000"/>
-          <w:sz w:val="16"/>
-        </w:rPr>
-        <w:t>[7] Z. Chen 等. FinQA: A Dataset of Numerical Reasoning over Financial Data. EMNLP, 2021, 3697–3711.</w:t>
+        <w:t>[5] V. Barres 等. τ²-Bench: Evaluating Conversational Agents in a Dual-Control Environment. arXiv:2506.07982, 2025.</w:t>
       </w:r>
     </w:p>
     <w:sectPr>

</xml_diff>

<commit_message>
Implement exact suffix-aware disclosure planning and publish verified four-page study
</commit_message>
<xml_diff>
--- a/paper/zh-CN/按步执行与信息共享_中文最新稿.docx
+++ b/paper/zh-CN/按步执行与信息共享_中文最新稿.docx
@@ -94,7 +94,7 @@
           <w:color w:val="000000"/>
           <w:sz w:val="18"/>
         </w:rPr>
-        <w:t>智能体处理本地资料时，运行中新增的步骤可能需要云端模型或外部工具。沿用完整上下文会扩大共享范围，固定裁剪又可能遗漏后续输入。本文介绍按步执行与信息共享原型：由本地控制器选择登记的执行方式和接收方视图，在发送前核对来源、能力与授权，状态变化后保留仍有效的计算结果。双栏界面将任务步骤与实际接收内容对应展示。24 道公开财务问题产生 48 份真实模型计划；受控配对执行中，结果复用使 HTTP 算子调用从 331 次降至 261 次。零售与航空多轮开发任务进一步检验原生业务操作和本地引用绑定。实验分别报告任务答案、执行一致性与实际外发，避免把成功执行等同于语义正确。</w:t>
+        <w:t>智能体访问本地资料、云端模型和外部工具时，后续步骤及其所需输入可能随执行而改变。逐次选择发送量最少的视图，未必使整段任务的累计披露最少；直接枚举视图组合又容易使规划状态膨胀。本文介绍一个按步执行原型：将执行位置与接收方视图作为共同候选，按来源版本核验请求，并在传输预算内选择当前已知步骤的后续方案。规划器仅保留后续仍可能使用的披露项，将其余项转为累计成本，再分解不共享新增披露项的步骤。48 个构造负载的 144 个预算设置均与独立整数规划得到相同最优值；已有真实模型计划的重新执行验证了控制器与 HTTP 接收记录的一致性。双栏界面允许观众检查每一步的选择、实际发送内容及状态变化后的重算。</w:t>
       </w:r>
     </w:p>
     <w:p>
@@ -111,7 +111,7 @@
           <w:color w:val="000000"/>
           <w:sz w:val="16"/>
         </w:rPr>
-        <w:t>关键词：智能体执行；接收方视图；累计披露；局部修复；系统演示。</w:t>
+        <w:t>关键词：智能体执行；接收方视图；披露状态压缩；预算规划；系统演示。</w:t>
       </w:r>
     </w:p>
     <w:p>
@@ -144,7 +144,7 @@
           <w:color w:val="000000"/>
           <w:sz w:val="18"/>
         </w:rPr>
-        <w:t>企业智能体常先读取内部资料，再向云端模型或工具提出请求。以合同检查为例，解释条款需要条款内容，核算金额可能只需几个数值，后续检索又需要新的查询条件。任务开始时通常无法确定所有步骤，因此，每次新增操作都需要重新判断在哪里执行、当前接收方需要哪些输入。</w:t>
+        <w:t>企业智能体可能先检查内部记录，再向云端解释模型或业务工具发出请求。不同接收方需要不同输入：模型解释可以使用业务事实，检索工具只需查询条件，数值服务则可接收原值或已在本地计算的中间值。固定发送完整上下文会扩大共享范围，而固定裁剪又可能遗漏后来出现的需求。系统必须在每个已知步骤重新选择执行方式和输入。</w:t>
       </w:r>
     </w:p>
     <w:p>
@@ -161,7 +161,7 @@
           <w:color w:val="000000"/>
           <w:sz w:val="18"/>
         </w:rPr>
-        <w:t>即使请求字段没有变化，原来的执行方式也可能失效。例如，本地计算能力被撤销后，待执行步骤必须改用外部服务；已经算出的、来源仍有效的中间结果却无需重复计算。系统需要同时管理执行候选、接收方已见信息与结果来源，而不能仅在任务开始时做一次脱敏。</w:t>
+        <w:t>选择还受历史影响。两步均可发送同一对原值，或分别发送不同派生值；逐步贪心可能先选一个派生值，随后再披露两个新值。连续使用原值方案只增加两项不同披露，却可能产生更多重复传输。因此，累计不同披露项与传输字段次数需要分开控制。状态或能力变化后，这个选择还必须与结果缓存保持一致。</w:t>
       </w:r>
     </w:p>
     <w:p>
@@ -178,7 +178,7 @@
           <w:color w:val="000000"/>
           <w:sz w:val="18"/>
         </w:rPr>
-        <w:t>PlanTwin [1] 通过规划抽象和本地门控限制云端观察；PrivScope [2] 按子任务控制披露范围与抽象程度；MINIM [3] 根据敏感性和任务必要性处理界面观察。这些工作已覆盖本地裁剪、抽象与披露控制，本文不将这些组成技术单独作为首次提出的方法。</w:t>
+        <w:t>PlanTwin [1]、PrivScope [2] 和 MINIM [3] 已研究规划抽象、任务范围与必要性裁剪。本文聚焦登记视图之间的有限选择：如何在不删除实际披露历史的前提下压缩搜索状态，并把选择落实为可核查的执行。状态压缩借鉴前沿搜索 [4]，不将动态规划或本地门控本身作为首次提出的技术。</w:t>
       </w:r>
     </w:p>
     <w:p>
@@ -195,24 +195,7 @@
           <w:color w:val="000000"/>
           <w:sz w:val="18"/>
         </w:rPr>
-        <w:t>本演示面向智能体应用开发者与数据管理员，将上述决策落实为可检查的执行过程：数值路径比较登记的等价输入并复用有效结果；业务路径以不透明引用保留本地精确值，在执行具体工具时完成绑定。两条路径共用“模型提案—本地核验—实际执行—接收记录”的观察方式，其适用条件和证据分别报告。</w:t>
-      </w:r>
-    </w:p>
-    <w:p>
-      <w:pPr>
-        <w:spacing w:after="40" w:line="246" w:lineRule="auto"/>
-        <w:ind w:firstLine="230"/>
-        <w:jc w:val="both"/>
-      </w:pPr>
-      <w:r>
-        <w:rPr>
-          <w:rFonts w:ascii="Linux Libertine" w:hAnsi="Linux Libertine" w:eastAsia="SimSun"/>
-          <w:b w:val="0"/>
-          <w:i w:val="0"/>
-          <w:color w:val="000000"/>
-          <w:sz w:val="18"/>
-        </w:rPr>
-        <w:t>系统的展示重点是决策与实际数据流之间的对应关系。观众可以检查模型提出的计算，改变本地能力或源值，比较哪些步骤被重算，并直接查看接收端收到的内容。本文贡献为具备可复核执行记录的研究原型，以及对复用、规划和引用检查作用的分项评估；不声称已解决任意自然语言任务的最小充分信息判定。</w:t>
+        <w:t>本文提供三项可检查的结果：面向接收方并集成本和传输预算的精确规划；与版本核验、局部重算和真实 HTTP 请求衔接的控制器；分开报告优化正确性、规划开销和模型任务结果的开放演示。有限候选由应用登记，候选的语义等价性不由规划器自行推断。</w:t>
       </w:r>
     </w:p>
     <w:p>
@@ -280,7 +263,7 @@
           <w:color w:val="000000"/>
           <w:sz w:val="16"/>
         </w:rPr>
-        <w:t>图 1  按步执行的系统结构。原始资料保留在本地；模型与工具通过登记出口交互。新步骤或状态变化触发重新判定，外部结果写回本地状态。</w:t>
+        <w:t>图 1  按步执行的系统结构。原始资料保留在本地；每个新步骤或状态变化触发重新判定，外部执行通过登记出口完成，结果返回本地。</w:t>
       </w:r>
     </w:p>
     <w:p>
@@ -307,7 +290,7 @@
           <w:color w:val="000000"/>
           <w:sz w:val="18"/>
         </w:rPr>
-        <w:t>2  逐步执行与接收方视图</w:t>
+        <w:t>2  后续相关披露规划</w:t>
       </w:r>
     </w:p>
     <w:p>
@@ -323,7 +306,7 @@
           <w:color w:val="000000"/>
           <w:sz w:val="18"/>
         </w:rPr>
-        <w:t>2.1  执行候选与披露历史</w:t>
+        <w:t>2.1  有限候选与优化目标</w:t>
       </w:r>
     </w:p>
     <w:p>
@@ -340,24 +323,7 @@
           <w:color w:val="000000"/>
           <w:sz w:val="18"/>
         </w:rPr>
-        <w:t>版本化状态 S 保存源值、授权与本地能力。数值路径中，模型先读取不含业务数值的表结构，再提交计算图；控制器只接受六种登记算子组成的前向程序，所有节点都须参与最终结果。候选 a 指定执行位置、接收方 r 和输入视图 V；视图可以是原值与子表达式，也可以是已算出的直接操作数。</w:t>
-      </w:r>
-    </w:p>
-    <w:p>
-      <w:pPr>
-        <w:spacing w:after="40" w:line="246" w:lineRule="auto"/>
-        <w:ind w:firstLine="230"/>
-        <w:jc w:val="both"/>
-      </w:pPr>
-      <w:r>
-        <w:rPr>
-          <w:rFonts w:ascii="Linux Libertine" w:hAnsi="Linux Libertine" w:eastAsia="SimSun"/>
-          <w:b w:val="0"/>
-          <w:i w:val="0"/>
-          <w:color w:val="000000"/>
-          <w:sz w:val="18"/>
-        </w:rPr>
-        <w:t>一次披露以接收方、源字段或派生表达式及来源版本的指纹标识。令 E(a) 为候选披露项，H 为确认发送的集合；本地执行的 E(a) 为空。每次得到匹配接收记录后更新：</w:t>
+        <w:t>状态 S 保存来源版本、授权、能力和有效计算结果。当前已知的 m 个步骤各有有限候选集 Aᵢ；候选指定执行位置、接收方、输入视图、工作量与字段传输量。原值或派生值的标识包含接收方、表达式及来源版本。令 H 为此前实际发送的完整历史，E(a) 为候选的披露项，W、T 分别为总工作量和字段次数，则：</w:t>
       </w:r>
     </w:p>
     <w:p>
@@ -367,51 +333,44 @@
       </w:pPr>
       <m:oMathPara>
         <m:oMath>
-          <m:sSub>
+          <m:limLow>
             <m:e>
               <m:r>
-                <m:t>H</m:t>
+                <m:rPr>
+                  <m:nor/>
+                </m:rPr>
+                <m:t>min lex</m:t>
               </m:r>
             </m:e>
+            <m:lim>
+              <m:r>
+                <m:t>p∈P,T(p)≤B</m:t>
+              </m:r>
+            </m:lim>
+          </m:limLow>
+          <m:r>
+            <m:t>(|</m:t>
+          </m:r>
+          <m:nary>
+            <m:naryPr>
+              <m:chr m:val="⋃"/>
+              <m:limLoc m:val="undOvr"/>
+              <m:grow m:val="1"/>
+              <m:subHide m:val="off"/>
+              <m:supHide m:val="on"/>
+            </m:naryPr>
             <m:sub>
               <m:r>
-                <m:t>t+1</m:t>
+                <m:t>a∈p</m:t>
               </m:r>
             </m:sub>
-          </m:sSub>
-          <m:r>
-            <m:t>=</m:t>
-          </m:r>
-          <m:sSub>
+            <m:sup/>
             <m:e>
               <m:r>
-                <m:t>H</m:t>
+                <m:t>E(a)∖H|,W(p),T(p))</m:t>
               </m:r>
             </m:e>
-            <m:sub>
-              <m:r>
-                <m:t>t</m:t>
-              </m:r>
-            </m:sub>
-          </m:sSub>
-          <m:r>
-            <m:t>∪E(</m:t>
-          </m:r>
-          <m:sSub>
-            <m:e>
-              <m:r>
-                <m:t>a</m:t>
-              </m:r>
-            </m:e>
-            <m:sub>
-              <m:r>
-                <m:t>t</m:t>
-              </m:r>
-            </m:sub>
-          </m:sSub>
-          <m:r>
-            <m:t>)</m:t>
-          </m:r>
+          </m:nary>
         </m:oMath>
       </m:oMathPara>
       <w:r>
@@ -439,7 +398,7 @@
           <w:color w:val="000000"/>
           <w:sz w:val="18"/>
         </w:rPr>
-        <w:t>同一字段发送给不同接收方分别计数；派生值也计数。源版本变化后再次发送计为新项。H 不随重试或局部修复回退。该指标描述显式披露，不度量敏感性，也不排除接收方通过多个值联合推断。</w:t>
+        <w:t>P 仅含授权、能力与输入需求均满足的方案。B 是同阶段预算；重复发送仍消耗字段次数，历史披露不因重算而撤销。本地完成不增加披露项。该成本衡量显式共享项目，不衡量接收方可能推断出的全部信息。</w:t>
       </w:r>
     </w:p>
     <w:p>
@@ -455,7 +414,7 @@
           <w:color w:val="000000"/>
           <w:sz w:val="18"/>
         </w:rPr>
-        <w:t>2.2  比较当前已知的后续方案</w:t>
+        <w:t>2.2  保留仍与后续有关的状态</w:t>
       </w:r>
     </w:p>
     <w:p>
@@ -472,7 +431,7 @@
           <w:color w:val="000000"/>
           <w:sz w:val="18"/>
         </w:rPr>
-        <w:t>设 Q 为当前已知待执行图，P(Q,S) 为满足授权、能力和剩余预算的候选组合；W(p) 是本地及接收端实际求值的算子数，T(p) 是发送的数值字段次数。原始字段重复发送仍计入 T，新增披露集合为：</w:t>
+        <w:t>设 Eᵢ 为当前前缀的新增披露集合，Uᵢ 为已知后缀所有候选可能披露的、尚不在 H 中的项目。完整集合保存已不可能复用的项目，会使本应等价的前缀无法合并。我们保留活动集合 Lᵢ，并用 zᵢ 计入退出该集合的项目：</w:t>
       </w:r>
     </w:p>
     <w:p>
@@ -482,29 +441,96 @@
       </w:pPr>
       <m:oMathPara>
         <m:oMath>
-          <m:r>
-            <m:t>D(p)=(</m:t>
-          </m:r>
-          <m:nary>
-            <m:naryPr>
-              <m:chr m:val="⋃"/>
-              <m:limLoc m:val="undOvr"/>
-              <m:grow m:val="1"/>
-              <m:subHide m:val="off"/>
-              <m:supHide m:val="on"/>
-            </m:naryPr>
+          <m:sSub>
+            <m:e>
+              <m:r>
+                <m:t>L</m:t>
+              </m:r>
+            </m:e>
             <m:sub>
               <m:r>
-                <m:t>a∈p</m:t>
+                <m:t>i</m:t>
               </m:r>
             </m:sub>
-            <m:sup/>
+          </m:sSub>
+          <m:r>
+            <m:t>=</m:t>
+          </m:r>
+          <m:sSub>
             <m:e>
               <m:r>
-                <m:t>E(a))∖H</m:t>
+                <m:t>E</m:t>
               </m:r>
             </m:e>
-          </m:nary>
+            <m:sub>
+              <m:r>
+                <m:t>i</m:t>
+              </m:r>
+            </m:sub>
+          </m:sSub>
+          <m:r>
+            <m:t>∩</m:t>
+          </m:r>
+          <m:sSub>
+            <m:e>
+              <m:r>
+                <m:t>U</m:t>
+              </m:r>
+            </m:e>
+            <m:sub>
+              <m:r>
+                <m:t>i</m:t>
+              </m:r>
+            </m:sub>
+          </m:sSub>
+          <m:r>
+            <m:t>,</m:t>
+          </m:r>
+          <m:sSub>
+            <m:e>
+              <m:r>
+                <m:t>z</m:t>
+              </m:r>
+            </m:e>
+            <m:sub>
+              <m:r>
+                <m:t>i</m:t>
+              </m:r>
+            </m:sub>
+          </m:sSub>
+          <m:r>
+            <m:t>=|</m:t>
+          </m:r>
+          <m:sSub>
+            <m:e>
+              <m:r>
+                <m:t>E</m:t>
+              </m:r>
+            </m:e>
+            <m:sub>
+              <m:r>
+                <m:t>i</m:t>
+              </m:r>
+            </m:sub>
+          </m:sSub>
+          <m:r>
+            <m:t>∖</m:t>
+          </m:r>
+          <m:sSub>
+            <m:e>
+              <m:r>
+                <m:t>U</m:t>
+              </m:r>
+            </m:e>
+            <m:sub>
+              <m:r>
+                <m:t>i</m:t>
+              </m:r>
+            </m:sub>
+          </m:sSub>
+          <m:r>
+            <m:t>|</m:t>
+          </m:r>
         </m:oMath>
       </m:oMathPara>
       <w:r>
@@ -520,44 +546,97 @@
     </w:p>
     <w:p>
       <w:pPr>
+        <w:spacing w:after="40" w:line="246" w:lineRule="auto"/>
+        <w:ind w:firstLine="230"/>
+        <w:jc w:val="both"/>
+      </w:pPr>
+      <w:r>
+        <w:rPr>
+          <w:rFonts w:ascii="Linux Libertine" w:hAnsi="Linux Libertine" w:eastAsia="SimSun"/>
+          <w:b w:val="0"/>
+          <w:i w:val="0"/>
+          <w:color w:val="000000"/>
+          <w:sz w:val="18"/>
+        </w:rPr>
+        <w:t>对任意共同后缀的新增披露集合 F⊆Uᵢ，退出的项目与后缀不相交，因此有：</w:t>
+      </w:r>
+    </w:p>
+    <w:p>
+      <w:pPr>
         <w:spacing w:before="60" w:after="60"/>
         <w:jc w:val="center"/>
       </w:pPr>
       <m:oMathPara>
         <m:oMath>
-          <m:sSup>
+          <m:d>
+            <m:dPr>
+              <m:begChr m:val="|"/>
+              <m:sepChr m:val=""/>
+              <m:endChr m:val="|"/>
+            </m:dPr>
             <m:e>
+              <m:sSub>
+                <m:e>
+                  <m:r>
+                    <m:t>E</m:t>
+                  </m:r>
+                </m:e>
+                <m:sub>
+                  <m:r>
+                    <m:t>i</m:t>
+                  </m:r>
+                </m:sub>
+              </m:sSub>
               <m:r>
-                <m:t>p</m:t>
+                <m:t>∪</m:t>
+              </m:r>
+              <m:r>
+                <m:t>F</m:t>
+              </m:r>
+              <m:r>
+                <m:t>|</m:t>
+              </m:r>
+              <m:r>
+                <m:t>=</m:t>
+              </m:r>
+              <m:sSub>
+                <m:e>
+                  <m:r>
+                    <m:t>z</m:t>
+                  </m:r>
+                </m:e>
+                <m:sub>
+                  <m:r>
+                    <m:t>i</m:t>
+                  </m:r>
+                </m:sub>
+              </m:sSub>
+              <m:r>
+                <m:t>+</m:t>
+              </m:r>
+              <m:r>
+                <m:t>|</m:t>
+              </m:r>
+              <m:sSub>
+                <m:e>
+                  <m:r>
+                    <m:t>L</m:t>
+                  </m:r>
+                </m:e>
+                <m:sub>
+                  <m:r>
+                    <m:t>i</m:t>
+                  </m:r>
+                </m:sub>
+              </m:sSub>
+              <m:r>
+                <m:t>∪</m:t>
+              </m:r>
+              <m:r>
+                <m:t>F</m:t>
               </m:r>
             </m:e>
-            <m:sup>
-              <m:r>
-                <m:t>∗</m:t>
-              </m:r>
-            </m:sup>
-          </m:sSup>
-          <m:r>
-            <m:t>=</m:t>
-          </m:r>
-          <m:limLow>
-            <m:e>
-              <m:r>
-                <m:rPr>
-                  <m:nor/>
-                </m:rPr>
-                <m:t>arg min lex</m:t>
-              </m:r>
-            </m:e>
-            <m:lim>
-              <m:r>
-                <m:t>p∈P(Q,S)</m:t>
-              </m:r>
-            </m:lim>
-          </m:limLow>
-          <m:r>
-            <m:t>(|D(p)|,W(p),T(p))</m:t>
-          </m:r>
+          </m:d>
         </m:oMath>
       </m:oMathPara>
       <w:r>
@@ -585,7 +664,7 @@
           <w:color w:val="000000"/>
           <w:sz w:val="18"/>
         </w:rPr>
-        <w:t>式（3）依次比较不同披露项、算子求值与传输字段。阶段开始时，以相同状态下逐步贪心的传输量为基准设预算 B；默认不增加字段，敏感性设置允许增加 10% 或 25%。执行每一步都扣减同一余额，不能重新取得整份额度。</w:t>
+        <w:t>加入候选后令 X=Lᵢ∪(E(a)∖H)，按下一边界更新。项目在最后一次可能出现后退出，之后不会被再次计数：</w:t>
       </w:r>
     </w:p>
     <w:p>
@@ -595,23 +674,80 @@
       </w:pPr>
       <m:oMathPara>
         <m:oMath>
+          <m:sSup>
+            <m:e>
+              <m:r>
+                <m:t>L</m:t>
+              </m:r>
+            </m:e>
+            <m:sup>
+              <m:r>
+                <m:t>′</m:t>
+              </m:r>
+            </m:sup>
+          </m:sSup>
           <m:r>
-            <m:t>B=⌊(1+ρ)T(</m:t>
+            <m:t>=X∩</m:t>
           </m:r>
           <m:sSub>
             <m:e>
               <m:r>
-                <m:t>p</m:t>
+                <m:t>U</m:t>
               </m:r>
             </m:e>
             <m:sub>
               <m:r>
-                <m:t>g</m:t>
+                <m:t>i+1</m:t>
               </m:r>
             </m:sub>
           </m:sSub>
           <m:r>
-            <m:t>)⌋</m:t>
+            <m:t>,</m:t>
+          </m:r>
+          <m:sSup>
+            <m:e>
+              <m:r>
+                <m:t>z</m:t>
+              </m:r>
+            </m:e>
+            <m:sup>
+              <m:r>
+                <m:t>′</m:t>
+              </m:r>
+            </m:sup>
+          </m:sSup>
+          <m:r>
+            <m:t>=</m:t>
+          </m:r>
+          <m:sSub>
+            <m:e>
+              <m:r>
+                <m:t>z</m:t>
+              </m:r>
+            </m:e>
+            <m:sub>
+              <m:r>
+                <m:t>i</m:t>
+              </m:r>
+            </m:sub>
+          </m:sSub>
+          <m:r>
+            <m:t>+|X∖</m:t>
+          </m:r>
+          <m:sSub>
+            <m:e>
+              <m:r>
+                <m:t>U</m:t>
+              </m:r>
+            </m:e>
+            <m:sub>
+              <m:r>
+                <m:t>i+1</m:t>
+              </m:r>
+            </m:sub>
+          </m:sSub>
+          <m:r>
+            <m:t>|</m:t>
           </m:r>
         </m:oMath>
       </m:oMathPara>
@@ -640,7 +776,7 @@
           <w:color w:val="000000"/>
           <w:sz w:val="18"/>
         </w:rPr>
-        <w:t>同一深度的标签记录披露集合、累计求值与传输 (E,w,b)。下式成立时第二个标签可被剪枝：</w:t>
+        <w:t>标签为 (L,z,w,b)。相同 L 下，若一个标签传输量不高，且已累计的 (z,w) 按字典序更优，则另一标签可被删除。严格较少的 z 优先于任何工作量差异：</w:t>
       </w:r>
     </w:p>
     <w:p>
@@ -650,66 +786,6 @@
       </w:pPr>
       <m:oMathPara>
         <m:oMath>
-          <m:sSub>
-            <m:e>
-              <m:r>
-                <m:t>E</m:t>
-              </m:r>
-            </m:e>
-            <m:sub>
-              <m:r>
-                <m:t>1</m:t>
-              </m:r>
-            </m:sub>
-          </m:sSub>
-          <m:r>
-            <m:t>⊆</m:t>
-          </m:r>
-          <m:sSub>
-            <m:e>
-              <m:r>
-                <m:t>E</m:t>
-              </m:r>
-            </m:e>
-            <m:sub>
-              <m:r>
-                <m:t>2</m:t>
-              </m:r>
-            </m:sub>
-          </m:sSub>
-          <m:r>
-            <m:t>∧</m:t>
-          </m:r>
-          <m:sSub>
-            <m:e>
-              <m:r>
-                <m:t>w</m:t>
-              </m:r>
-            </m:e>
-            <m:sub>
-              <m:r>
-                <m:t>1</m:t>
-              </m:r>
-            </m:sub>
-          </m:sSub>
-          <m:r>
-            <m:t>≤</m:t>
-          </m:r>
-          <m:sSub>
-            <m:e>
-              <m:r>
-                <m:t>w</m:t>
-              </m:r>
-            </m:e>
-            <m:sub>
-              <m:r>
-                <m:t>2</m:t>
-              </m:r>
-            </m:sub>
-          </m:sSub>
-          <m:r>
-            <m:t>∧</m:t>
-          </m:r>
           <m:sSub>
             <m:e>
               <m:r>
@@ -737,6 +813,87 @@
               </m:r>
             </m:sub>
           </m:sSub>
+          <m:r>
+            <m:t>∧(</m:t>
+          </m:r>
+          <m:sSub>
+            <m:e>
+              <m:r>
+                <m:t>z</m:t>
+              </m:r>
+            </m:e>
+            <m:sub>
+              <m:r>
+                <m:t>1</m:t>
+              </m:r>
+            </m:sub>
+          </m:sSub>
+          <m:r>
+            <m:t>,</m:t>
+          </m:r>
+          <m:sSub>
+            <m:e>
+              <m:r>
+                <m:t>w</m:t>
+              </m:r>
+            </m:e>
+            <m:sub>
+              <m:r>
+                <m:t>1</m:t>
+              </m:r>
+            </m:sub>
+          </m:sSub>
+          <m:r>
+            <m:t>)</m:t>
+          </m:r>
+          <m:sSub>
+            <m:e>
+              <m:r>
+                <m:t>≤</m:t>
+              </m:r>
+            </m:e>
+            <m:sub>
+              <m:r>
+                <m:rPr>
+                  <m:nor/>
+                </m:rPr>
+                <m:t>lex</m:t>
+              </m:r>
+            </m:sub>
+          </m:sSub>
+          <m:r>
+            <m:t>(</m:t>
+          </m:r>
+          <m:sSub>
+            <m:e>
+              <m:r>
+                <m:t>z</m:t>
+              </m:r>
+            </m:e>
+            <m:sub>
+              <m:r>
+                <m:t>2</m:t>
+              </m:r>
+            </m:sub>
+          </m:sSub>
+          <m:r>
+            <m:t>,</m:t>
+          </m:r>
+          <m:sSub>
+            <m:e>
+              <m:r>
+                <m:t>w</m:t>
+              </m:r>
+            </m:e>
+            <m:sub>
+              <m:r>
+                <m:t>2</m:t>
+              </m:r>
+            </m:sub>
+          </m:sSub>
+          <m:r>
+            <m:t>)</m:t>
+          </m:r>
         </m:oMath>
       </m:oMathPara>
       <w:r>
@@ -764,81 +921,7 @@
           <w:color w:val="000000"/>
           <w:sz w:val="18"/>
         </w:rPr>
-        <w:t>若候选输出等价且后续可行性不依赖表示，追加同一后缀保持集合包含与两项成本关系，因此剪枝不会丢失受限问题的最优解。未来派生值用表达式及源版本标识，无需预先计算其数值。最坏搜索仍为指数级，超过 4,096 个标签明确失败。</w:t>
-      </w:r>
-    </w:p>
-    <w:p>
-      <w:pPr>
-        <w:keepNext/>
-        <w:spacing w:before="80" w:after="40"/>
-      </w:pPr>
-      <w:r>
-        <w:rPr>
-          <w:rFonts w:ascii="Linux Libertine" w:hAnsi="Linux Libertine" w:eastAsia="SimHei"/>
-          <w:b/>
-          <w:i w:val="0"/>
-          <w:color w:val="000000"/>
-          <w:sz w:val="18"/>
-        </w:rPr>
-        <w:t>一个逐步选择失效的例子</w:t>
-      </w:r>
-    </w:p>
-    <w:p>
-      <w:pPr>
-        <w:spacing w:after="40" w:line="246" w:lineRule="auto"/>
-        <w:ind w:firstLine="230"/>
-        <w:jc w:val="both"/>
-      </w:pPr>
-      <w:r>
-        <w:rPr>
-          <w:rFonts w:ascii="Linux Libertine" w:hAnsi="Linux Libertine" w:eastAsia="SimSun"/>
-          <w:b w:val="0"/>
-          <w:i w:val="0"/>
-          <w:color w:val="000000"/>
-          <w:sz w:val="18"/>
-        </w:rPr>
-        <w:t>设两个步骤均可向服务甲发送同一对原值 {x,y}；另一条路径向服务乙分别发送一个派生值 {u} 与两个不同派生值 {v,w}。逐步贪心先选乙，只披露一项；第二步无论选哪条路径，累计都至少为三项。后续规划连续选择甲，累计只有两项，但会传输四个字段。该例说明为什么披露集合与传输次数须分别衡量。</w:t>
-      </w:r>
-    </w:p>
-    <w:p>
-      <w:pPr>
-        <w:spacing w:after="0" w:before="0" w:line="20" w:lineRule="exact"/>
-      </w:pPr>
-      <w:r>
-        <w:br w:type="column"/>
-      </w:r>
-    </w:p>
-    <w:p>
-      <w:pPr>
-        <w:keepNext/>
-        <w:spacing w:before="80" w:after="40"/>
-      </w:pPr>
-      <w:r>
-        <w:rPr>
-          <w:rFonts w:ascii="Linux Libertine" w:hAnsi="Linux Libertine" w:eastAsia="SimHei"/>
-          <w:b/>
-          <w:i w:val="0"/>
-          <w:color w:val="000000"/>
-          <w:sz w:val="18"/>
-        </w:rPr>
-        <w:t>2.3  核验决策，而不只核验请求字段</w:t>
-      </w:r>
-    </w:p>
-    <w:p>
-      <w:pPr>
-        <w:spacing w:after="40" w:line="246" w:lineRule="auto"/>
-        <w:ind w:firstLine="230"/>
-        <w:jc w:val="both"/>
-      </w:pPr>
-      <w:r>
-        <w:rPr>
-          <w:rFonts w:ascii="Linux Libertine" w:hAnsi="Linux Libertine" w:eastAsia="SimSun"/>
-          <w:b w:val="0"/>
-          <w:i w:val="0"/>
-          <w:color w:val="000000"/>
-          <w:sz w:val="18"/>
-        </w:rPr>
-        <w:t>控制器区分两类依赖：源值决定结果是否仍有效；能力和授权决定执行方式是否仍可行。发送前，两类依赖的记录版本都必须与当前版本一致：</w:t>
+        <w:t>式（3）保证追加共同后缀后该关系仍成立。若后续可行性不依赖前缀所选表示，剪枝保留至少一个最优解。设跨边界可能复用的项目数最多为 ω，字段预算为整数 B，则保留标签数满足：</w:t>
       </w:r>
     </w:p>
     <w:p>
@@ -849,64 +932,31 @@
       <m:oMathPara>
         <m:oMath>
           <m:r>
-            <m:t>Δ=</m:t>
+            <m:t>|</m:t>
           </m:r>
-          <m:sSub>
+          <m:r>
+            <m:rPr>
+              <m:sty m:val="p"/>
+            </m:rPr>
+            <m:t>Labels</m:t>
+          </m:r>
+          <m:r>
+            <m:t>|≤</m:t>
+          </m:r>
+          <m:sSup>
             <m:e>
               <m:r>
-                <m:t>Δ</m:t>
+                <m:t>2</m:t>
               </m:r>
             </m:e>
-            <m:sub>
+            <m:sup>
               <m:r>
-                <m:rPr>
-                  <m:nor/>
-                </m:rPr>
-                <m:t>值</m:t>
+                <m:t>ω</m:t>
               </m:r>
-            </m:sub>
-          </m:sSub>
+            </m:sup>
+          </m:sSup>
           <m:r>
-            <m:t>∪</m:t>
-          </m:r>
-          <m:sSub>
-            <m:e>
-              <m:r>
-                <m:t>Δ</m:t>
-              </m:r>
-            </m:e>
-            <m:sub>
-              <m:r>
-                <m:rPr>
-                  <m:nor/>
-                </m:rPr>
-                <m:t>规划</m:t>
-              </m:r>
-            </m:sub>
-          </m:sSub>
-          <m:r>
-            <m:t>,</m:t>
-          </m:r>
-          <m:r>
-            <m:t>∀k∈Δ:v(k)=</m:t>
-          </m:r>
-          <m:sSub>
-            <m:e>
-              <m:r>
-                <m:t>v</m:t>
-              </m:r>
-            </m:e>
-            <m:sub>
-              <m:r>
-                <m:rPr>
-                  <m:nor/>
-                </m:rPr>
-                <m:t>当前</m:t>
-              </m:r>
-            </m:sub>
-          </m:sSub>
-          <m:r>
-            <m:t>(k)</m:t>
+            <m:t>(B+1)</m:t>
           </m:r>
         </m:oMath>
       </m:oMathPara>
@@ -935,7 +985,65 @@
           <w:color w:val="000000"/>
           <w:sz w:val="18"/>
         </w:rPr>
-        <w:t>源版本、当前能力和授权在序列化前同步检查；状态变化后重新选择剩余步骤，缓存仅按值依赖判断是否保留。受控版本往返测试使用单调版本号。已失效结果不得作为新请求的操作数，未用源字段改变则不使该结果失效。</w:t>
+        <w:t>这是依赖边界宽度和数值预算的界，不是一般多项式保证。实现还需要处理组内支配比较；超过 4,096 个标签会明确报告资源上限。</w:t>
+      </w:r>
+    </w:p>
+    <w:p>
+      <w:pPr>
+        <w:spacing w:after="0" w:line="20" w:lineRule="exact"/>
+      </w:pPr>
+      <w:r>
+        <w:br w:type="column"/>
+      </w:r>
+    </w:p>
+    <w:p>
+      <w:pPr>
+        <w:keepNext/>
+        <w:spacing w:before="80" w:after="40"/>
+      </w:pPr>
+      <w:r>
+        <w:rPr>
+          <w:rFonts w:ascii="Linux Libertine" w:hAnsi="Linux Libertine" w:eastAsia="SimHei"/>
+          <w:b/>
+          <w:i w:val="0"/>
+          <w:color w:val="000000"/>
+          <w:sz w:val="18"/>
+        </w:rPr>
+        <w:t>2.3  分解披露关联，保持执行顺序</w:t>
+      </w:r>
+    </w:p>
+    <w:p>
+      <w:pPr>
+        <w:spacing w:after="40" w:line="246" w:lineRule="auto"/>
+        <w:ind w:firstLine="230"/>
+        <w:jc w:val="both"/>
+      </w:pPr>
+      <w:r>
+        <w:rPr>
+          <w:rFonts w:ascii="Linux Libertine" w:hAnsi="Linux Libertine" w:eastAsia="SimSun"/>
+          <w:b w:val="0"/>
+          <w:i w:val="0"/>
+          <w:color w:val="000000"/>
+          <w:sz w:val="18"/>
+        </w:rPr>
+        <w:t>两个步骤若有候选共享新增披露项，便在成本图中相连。不同连通分量的新增集合不相交，披露量、工作量和传输量可以相加。对每个分量求不同字段上限下的最优候选，再在统一 B 下组合成本前沿。任何全局最优解都可用相同字段上限下的分量最优解替换，因此分解保持最优值。</w:t>
+      </w:r>
+    </w:p>
+    <w:p>
+      <w:pPr>
+        <w:spacing w:after="40" w:line="246" w:lineRule="auto"/>
+        <w:ind w:firstLine="230"/>
+        <w:jc w:val="both"/>
+      </w:pPr>
+      <w:r>
+        <w:rPr>
+          <w:rFonts w:ascii="Linux Libertine" w:hAnsi="Linux Libertine" w:eastAsia="SimSun"/>
+          <w:b w:val="0"/>
+          <w:i w:val="0"/>
+          <w:color w:val="000000"/>
+          <w:sz w:val="18"/>
+        </w:rPr>
+        <w:t>这里分解的是成本，不是执行过程。返回方案恢复原始步骤顺序，数据依赖和实际工具调用顺序保持不变；共享副作用或输出不等价的候选不适用该分解。完整证明和独立整数规划模型随代码提供。</w:t>
       </w:r>
     </w:p>
     <w:p>
@@ -954,13 +1062,13 @@
           <w:color w:val="000000"/>
           <w:sz w:val="18"/>
         </w:rPr>
-        <w:t>算法 1  面向接收方的后续规划与局部修复</w:t>
+        <w:t>算法 1  后续相关披露规划</w:t>
       </w:r>
     </w:p>
     <w:p>
       <w:pPr>
         <w:keepNext/>
-        <w:spacing w:after="0" w:line="245" w:lineRule="auto"/>
+        <w:spacing w:after="0" w:line="252" w:lineRule="auto"/>
       </w:pPr>
       <w:r>
         <w:rPr>
@@ -970,13 +1078,13 @@
           <w:color w:val="000000"/>
           <w:sz w:val="16"/>
         </w:rPr>
-        <w:t>Input: versioned state S, graph Q, registry R, slack ρ</w:t>
+        <w:t>Input: known choices A, full history H, field budget B</w:t>
       </w:r>
     </w:p>
     <w:p>
       <w:pPr>
         <w:keepNext/>
-        <w:spacing w:after="0" w:line="245" w:lineRule="auto"/>
+        <w:spacing w:after="0" w:line="252" w:lineRule="auto"/>
       </w:pPr>
       <w:r>
         <w:rPr>
@@ -986,13 +1094,13 @@
           <w:color w:val="000000"/>
           <w:sz w:val="16"/>
         </w:rPr>
-        <w:t>Output: checked results C and disclosure history H</w:t>
+        <w:t>Output: optimal registered plan, or explicit failure</w:t>
       </w:r>
     </w:p>
     <w:p>
       <w:pPr>
         <w:keepNext/>
-        <w:spacing w:after="0" w:line="245" w:lineRule="auto"/>
+        <w:spacing w:after="0" w:line="252" w:lineRule="auto"/>
       </w:pPr>
       <w:r>
         <w:rPr>
@@ -1002,13 +1110,13 @@
           <w:color w:val="000000"/>
           <w:sz w:val="16"/>
         </w:rPr>
-        <w:t>1:  C ← ∅; H ← ∅; B ← UNSET</w:t>
+        <w:t>1:  G ← ComponentsSharingNewTokens(A, H)</w:t>
       </w:r>
     </w:p>
     <w:p>
       <w:pPr>
         <w:keepNext/>
-        <w:spacing w:after="0" w:line="245" w:lineRule="auto"/>
+        <w:spacing w:after="0" w:line="252" w:lineRule="auto"/>
       </w:pPr>
       <w:r>
         <w:rPr>
@@ -1018,13 +1126,13 @@
           <w:color w:val="000000"/>
           <w:sz w:val="16"/>
         </w:rPr>
-        <w:t>2:  while Q is not empty do</w:t>
+        <w:t>2:  for each component g in G do</w:t>
       </w:r>
     </w:p>
     <w:p>
       <w:pPr>
         <w:keepNext/>
-        <w:spacing w:after="0" w:line="245" w:lineRule="auto"/>
+        <w:spacing w:after="0" w:line="252" w:lineRule="auto"/>
       </w:pPr>
       <w:r>
         <w:rPr>
@@ -1034,13 +1142,13 @@
           <w:color w:val="000000"/>
           <w:sz w:val="16"/>
         </w:rPr>
-        <w:t>3:      if StateChanged(S) then</w:t>
+        <w:t>3:      F[g] ← ∅; U ← KnownSuffixTokens(g, H)</w:t>
       </w:r>
     </w:p>
     <w:p>
       <w:pPr>
         <w:keepNext/>
-        <w:spacing w:after="0" w:line="245" w:lineRule="auto"/>
+        <w:spacing w:after="0" w:line="252" w:lineRule="auto"/>
       </w:pPr>
       <w:r>
         <w:rPr>
@@ -1050,13 +1158,13 @@
           <w:color w:val="000000"/>
           <w:sz w:val="16"/>
         </w:rPr>
-        <w:t>4:          C ← KeepValidPureResults(C, S)</w:t>
+        <w:t>4:      for each attainable field bound b ≤ B do</w:t>
       </w:r>
     </w:p>
     <w:p>
       <w:pPr>
         <w:keepNext/>
-        <w:spacing w:after="0" w:line="245" w:lineRule="auto"/>
+        <w:spacing w:after="0" w:line="252" w:lineRule="auto"/>
       </w:pPr>
       <w:r>
         <w:rPr>
@@ -1066,13 +1174,13 @@
           <w:color w:val="000000"/>
           <w:sz w:val="16"/>
         </w:rPr>
-        <w:t>5:          Q ← Pending(Q, C); B ← UNSET</w:t>
+        <w:t>5:          L ← {(live=∅, retired=0, work=0, fields=0)}</w:t>
       </w:r>
     </w:p>
     <w:p>
       <w:pPr>
         <w:keepNext/>
-        <w:spacing w:after="0" w:line="245" w:lineRule="auto"/>
+        <w:spacing w:after="0" w:line="252" w:lineRule="auto"/>
       </w:pPr>
       <w:r>
         <w:rPr>
@@ -1082,13 +1190,13 @@
           <w:color w:val="000000"/>
           <w:sz w:val="16"/>
         </w:rPr>
-        <w:t>6:      A ← EquivalentAlternatives(S, Q, R)</w:t>
+        <w:t>6:          for each step i in original order of g do</w:t>
       </w:r>
     </w:p>
     <w:p>
       <w:pPr>
         <w:keepNext/>
-        <w:spacing w:after="0" w:line="245" w:lineRule="auto"/>
+        <w:spacing w:after="0" w:line="252" w:lineRule="auto"/>
       </w:pPr>
       <w:r>
         <w:rPr>
@@ -1098,13 +1206,13 @@
           <w:color w:val="000000"/>
           <w:sz w:val="16"/>
         </w:rPr>
-        <w:t>7:      if B = UNSET then</w:t>
+        <w:t>7:              N ← ∅</w:t>
       </w:r>
     </w:p>
     <w:p>
       <w:pPr>
         <w:keepNext/>
-        <w:spacing w:after="0" w:line="245" w:lineRule="auto"/>
+        <w:spacing w:after="0" w:line="252" w:lineRule="auto"/>
       </w:pPr>
       <w:r>
         <w:rPr>
@@ -1114,13 +1222,13 @@
           <w:color w:val="000000"/>
           <w:sz w:val="16"/>
         </w:rPr>
-        <w:t>8:          B ← floor((1 + ρ) × Fields(Greedy(A,H)))</w:t>
+        <w:t>8:              for each label l in L and choice a in A[i] do</w:t>
       </w:r>
     </w:p>
     <w:p>
       <w:pPr>
         <w:keepNext/>
-        <w:spacing w:after="0" w:line="245" w:lineRule="auto"/>
+        <w:spacing w:after="0" w:line="252" w:lineRule="auto"/>
       </w:pPr>
       <w:r>
         <w:rPr>
@@ -1130,13 +1238,13 @@
           <w:color w:val="000000"/>
           <w:sz w:val="16"/>
         </w:rPr>
-        <w:t>9:      p ← BudgetFrontier(A, H, B)</w:t>
+        <w:t>9:                  if l.fields + a.fields &gt; b then continue</w:t>
       </w:r>
     </w:p>
     <w:p>
       <w:pPr>
         <w:keepNext/>
-        <w:spacing w:after="0" w:line="245" w:lineRule="auto"/>
+        <w:spacing w:after="0" w:line="252" w:lineRule="auto"/>
       </w:pPr>
       <w:r>
         <w:rPr>
@@ -1146,13 +1254,13 @@
           <w:color w:val="000000"/>
           <w:sz w:val="16"/>
         </w:rPr>
-        <w:t>10:     if p is infeasible then return BLOCKED</w:t>
+        <w:t>10:                 X ← l.live ∪ (Tokens(a) ∖ H)</w:t>
       </w:r>
     </w:p>
     <w:p>
       <w:pPr>
         <w:keepNext/>
-        <w:spacing w:after="0" w:line="245" w:lineRule="auto"/>
+        <w:spacing w:after="0" w:line="252" w:lineRule="auto"/>
       </w:pPr>
       <w:r>
         <w:rPr>
@@ -1162,13 +1270,13 @@
           <w:color w:val="000000"/>
           <w:sz w:val="16"/>
         </w:rPr>
-        <w:t>11:     a ← First(p); CheckCurrent(S, a)</w:t>
+        <w:t>11:                 live′ ← X ∩ U[i+1]</w:t>
       </w:r>
     </w:p>
     <w:p>
       <w:pPr>
         <w:keepNext/>
-        <w:spacing w:after="0" w:line="245" w:lineRule="auto"/>
+        <w:spacing w:after="0" w:line="252" w:lineRule="auto"/>
       </w:pPr>
       <w:r>
         <w:rPr>
@@ -1178,13 +1286,13 @@
           <w:color w:val="000000"/>
           <w:sz w:val="16"/>
         </w:rPr>
-        <w:t>12:     if a.recipient = local then y ← Evaluate(a)</w:t>
+        <w:t>12:                 retired′ ← l.retired + |X ∖ U[i+1]|</w:t>
       </w:r>
     </w:p>
     <w:p>
       <w:pPr>
         <w:keepNext/>
-        <w:spacing w:after="0" w:line="245" w:lineRule="auto"/>
+        <w:spacing w:after="0" w:line="252" w:lineRule="auto"/>
       </w:pPr>
       <w:r>
         <w:rPr>
@@ -1194,13 +1302,13 @@
           <w:color w:val="000000"/>
           <w:sz w:val="16"/>
         </w:rPr>
-        <w:t>13:     else</w:t>
+        <w:t>13:                 N ← N ∪ Extend(l, a, live′, retired′)</w:t>
       </w:r>
     </w:p>
     <w:p>
       <w:pPr>
         <w:keepNext/>
-        <w:spacing w:after="0" w:line="245" w:lineRule="auto"/>
+        <w:spacing w:after="0" w:line="252" w:lineRule="auto"/>
       </w:pPr>
       <w:r>
         <w:rPr>
@@ -1210,13 +1318,13 @@
           <w:color w:val="000000"/>
           <w:sz w:val="16"/>
         </w:rPr>
-        <w:t>14:         bytes ← Serialize(a); CheckCurrent(S, a)</w:t>
+        <w:t>14:             L ← PruneWithinEqualLiveSets(N)</w:t>
       </w:r>
     </w:p>
     <w:p>
       <w:pPr>
         <w:keepNext/>
-        <w:spacing w:after="0" w:line="245" w:lineRule="auto"/>
+        <w:spacing w:after="0" w:line="252" w:lineRule="auto"/>
       </w:pPr>
       <w:r>
         <w:rPr>
@@ -1226,13 +1334,13 @@
           <w:color w:val="000000"/>
           <w:sz w:val="16"/>
         </w:rPr>
-        <w:t>15:         y, receipt ← SendOnce(bytes)</w:t>
+        <w:t>15:             if |L| &gt; LIMIT then return LIMIT_REACHED</w:t>
       </w:r>
     </w:p>
     <w:p>
       <w:pPr>
         <w:keepNext/>
-        <w:spacing w:after="0" w:line="245" w:lineRule="auto"/>
+        <w:spacing w:after="0" w:line="252" w:lineRule="auto"/>
       </w:pPr>
       <w:r>
         <w:rPr>
@@ -1242,13 +1350,13 @@
           <w:color w:val="000000"/>
           <w:sz w:val="16"/>
         </w:rPr>
-        <w:t>16:         VerifyReceipt(receipt, bytes)</w:t>
+        <w:t>16:         if L ≠ ∅ then AddBest(F[g], L)</w:t>
       </w:r>
     </w:p>
     <w:p>
       <w:pPr>
         <w:keepNext/>
-        <w:spacing w:after="0" w:line="245" w:lineRule="auto"/>
+        <w:spacing w:after="0" w:line="252" w:lineRule="auto"/>
       </w:pPr>
       <w:r>
         <w:rPr>
@@ -1258,13 +1366,13 @@
           <w:color w:val="000000"/>
           <w:sz w:val="16"/>
         </w:rPr>
-        <w:t>17:         H ← H ∪ DisclosureTokens(a)</w:t>
+        <w:t>17:     F[g] ← PruneCostFrontier(F[g])</w:t>
       </w:r>
     </w:p>
     <w:p>
       <w:pPr>
         <w:keepNext/>
-        <w:spacing w:after="0" w:line="245" w:lineRule="auto"/>
+        <w:spacing w:after="0" w:line="252" w:lineRule="auto"/>
       </w:pPr>
       <w:r>
         <w:rPr>
@@ -1274,13 +1382,13 @@
           <w:color w:val="000000"/>
           <w:sz w:val="16"/>
         </w:rPr>
-        <w:t>18:     B ← B − NumericFields(a)</w:t>
+        <w:t>18: P ← CombineComponentsUnderOneBudget(F, B)</w:t>
       </w:r>
     </w:p>
     <w:p>
       <w:pPr>
         <w:keepNext/>
-        <w:spacing w:after="0" w:line="245" w:lineRule="auto"/>
+        <w:spacing w:after="0" w:line="252" w:lineRule="auto"/>
       </w:pPr>
       <w:r>
         <w:rPr>
@@ -1290,29 +1398,13 @@
           <w:color w:val="000000"/>
           <w:sz w:val="16"/>
         </w:rPr>
-        <w:t>19:     C ← SavePureResult(C, y, SourceDeps(a))</w:t>
-      </w:r>
-    </w:p>
-    <w:p>
-      <w:pPr>
-        <w:keepNext/>
-        <w:spacing w:after="0" w:line="245" w:lineRule="auto"/>
-      </w:pPr>
-      <w:r>
-        <w:rPr>
-          <w:rFonts w:ascii="Linux Libertine" w:hAnsi="Linux Libertine" w:eastAsia="SimSun"/>
-          <w:b w:val="0"/>
-          <w:i w:val="0"/>
-          <w:color w:val="000000"/>
-          <w:sz w:val="16"/>
-        </w:rPr>
-        <w:t>20:     Q ← RemoveCompleted(Q, a)</w:t>
+        <w:t>19: if P is empty then return NO_FEASIBLE_PLAN</w:t>
       </w:r>
     </w:p>
     <w:p>
       <w:pPr>
         <w:keepNext w:val="0"/>
-        <w:spacing w:after="0" w:line="245" w:lineRule="auto"/>
+        <w:spacing w:after="0" w:line="252" w:lineRule="auto"/>
         <w:pBdr>
           <w:bottom w:val="single" w:sz="6"/>
         </w:pBdr>
@@ -1325,7 +1417,23 @@
           <w:color w:val="000000"/>
           <w:sz w:val="16"/>
         </w:rPr>
-        <w:t>21: return C, H</w:t>
+        <w:t>20: return RestoreOriginalStepOrder(Best(P))</w:t>
+      </w:r>
+    </w:p>
+    <w:p>
+      <w:pPr>
+        <w:keepNext/>
+        <w:spacing w:before="80" w:after="40"/>
+      </w:pPr>
+      <w:r>
+        <w:rPr>
+          <w:rFonts w:ascii="Linux Libertine" w:hAnsi="Linux Libertine" w:eastAsia="SimHei"/>
+          <w:b/>
+          <w:i w:val="0"/>
+          <w:color w:val="000000"/>
+          <w:sz w:val="18"/>
+        </w:rPr>
+        <w:t>2.4  从方案到实际请求</w:t>
       </w:r>
     </w:p>
     <w:p>
@@ -1342,7 +1450,7 @@
           <w:color w:val="000000"/>
           <w:sz w:val="18"/>
         </w:rPr>
-        <w:t>算法 1 在每个状态稳定阶段维持一个余额。阶段内，剩余旧方案为下一次受限选择提供可行解；累计实际发送字段因而不超过阶段预算。新的干预会开启新阶段，这个局部界限不能替代整轮任务的实测传输量。</w:t>
+        <w:t>控制器逐步执行所选方案。发送前重新核对授权、能力和依赖来源版本，序列化后记录请求摘要；实际 HTTP 接收端保存正文与结果。新执行器在发起发送时记入披露历史，即使响应失败也不删除可能已经外发的信息。摘要用于核对本地记录，不是云服务商的独立证明。</w:t>
       </w:r>
     </w:p>
     <w:p>
@@ -1359,57 +1467,7 @@
           <w:color w:val="000000"/>
           <w:sz w:val="18"/>
         </w:rPr>
-        <w:t>接收端记录原始字节、摘要与结果，核验器逐请求重算。新模型图实验使用同一 Node 进程内的回环 HTTP 监听器；真实模型请求由另一个代理保存供应商载荷与响应摘要。它们均不构成供应商签名回执或生产分布式事务证明。</w:t>
-      </w:r>
-    </w:p>
-    <w:p>
-      <w:pPr>
-        <w:spacing w:after="40" w:line="246" w:lineRule="auto"/>
-        <w:ind w:firstLine="230"/>
-        <w:jc w:val="both"/>
-      </w:pPr>
-      <w:r>
-        <w:rPr>
-          <w:rFonts w:ascii="Linux Libertine" w:hAnsi="Linux Libertine" w:eastAsia="SimSun"/>
-          <w:b w:val="0"/>
-          <w:i w:val="0"/>
-          <w:color w:val="000000"/>
-          <w:sz w:val="18"/>
-        </w:rPr>
-        <w:t>自动复用仅限登记的无副作用计算。接收授权撤销不能收回既往披露；网络返回不确定时停止，不假设未获回执就没有信息外发。任意脚本、带副作用工具及不可信控制器均不在保证范围内。</w:t>
-      </w:r>
-    </w:p>
-    <w:p>
-      <w:pPr>
-        <w:keepNext/>
-        <w:spacing w:before="80" w:after="40"/>
-      </w:pPr>
-      <w:r>
-        <w:rPr>
-          <w:rFonts w:ascii="Linux Libertine" w:hAnsi="Linux Libertine" w:eastAsia="SimHei"/>
-          <w:b/>
-          <w:i w:val="0"/>
-          <w:color w:val="000000"/>
-          <w:sz w:val="18"/>
-        </w:rPr>
-        <w:t>2.4  业务绑定与信息补充</w:t>
-      </w:r>
-    </w:p>
-    <w:p>
-      <w:pPr>
-        <w:spacing w:after="40" w:line="246" w:lineRule="auto"/>
-        <w:ind w:firstLine="230"/>
-        <w:jc w:val="both"/>
-      </w:pPr>
-      <w:r>
-        <w:rPr>
-          <w:rFonts w:ascii="Linux Libertine" w:hAnsi="Linux Libertine" w:eastAsia="SimSun"/>
-          <w:b w:val="0"/>
-          <w:i w:val="0"/>
-          <w:color w:val="000000"/>
-          <w:sz w:val="18"/>
-        </w:rPr>
-        <w:t>业务适配器将六类登记字段替换为不透明引用，在原生工具调用前恢复精确值，并可检查目标参数和来源当前值；改变业务状态的操作另需本地确认。独立的信息补充执行器只接受已登记的结构需求，在本地完成、派生结果与获准原值之间选择，拒绝模型自行扩大的字段请求。它已通过构造案例的真实 HTTP 检查，尚未接入本文批量模型实验；其有限契约不能判定自由文本是否充分。</w:t>
+        <w:t>源值更新只使依赖该源的结果失效；能力变化使候选重新选择，但不自动删除仍有效的结果。新步骤出现时，以完整 H 和当前已知后缀重新规划，曾退出搜索状态的项目仍在 H 中。系统不假定能够看见未来尚未出现的步骤。每个稳定阶段共用一个预算余额，不能在每次重规划时重新领取额度。</w:t>
       </w:r>
     </w:p>
     <w:p>
@@ -1476,7 +1534,7 @@
           <w:color w:val="000000"/>
           <w:sz w:val="16"/>
         </w:rPr>
-        <w:t>图 2  公开财务表格的实际执行界面。① 从保存的真实模型回复创建计算步骤；② 受控撤销本地能力，保留已完成结果；③ HTTP 接收端收到中间值与所需源值。截图为冻结批次中一个计划的独立重执行，裁去导航并添加编号，不增加测试样本数。</w:t>
+        <w:t>图 2  新执行器的实际界面。① 从保存的真实模型响应创建步骤；② 本地能力变化后保留有效结果并重规划；③ 核对所选输入、发送内容及 HTTP 接收记录。截图裁去导航并添加编号，不增加实验样本数。</w:t>
       </w:r>
     </w:p>
     <w:p>
@@ -1502,7 +1560,7 @@
           <w:color w:val="000000"/>
           <w:sz w:val="18"/>
         </w:rPr>
-        <w:t>3  交互演示</w:t>
+        <w:t>3  观众如何体验系统</w:t>
       </w:r>
     </w:p>
     <w:p>
@@ -1519,7 +1577,7 @@
           <w:color w:val="000000"/>
           <w:sz w:val="18"/>
         </w:rPr>
-        <w:t>界面沿用客户端的双栏任务布局。左侧执行自动推进，右侧随选中步骤展示接收方、发送内容、保留字段与接收记录。观众可暂停跟随检查旧请求，再回到当前步骤；无需逐步点击才能完成任务。展示节奏单独放慢，不计入实验耗时。</w:t>
+        <w:t>界面沿用客户端的双栏任务布局：左侧自动推进执行，右侧显示当前步骤的接收方、输入选择、本地保留字段及请求正文。观众可以查看旧步骤并恢复跟随；整个任务无需逐步点击确认。中文与英文界面使用同一执行记录，展示时间与实际计算耗时分开。</w:t>
       </w:r>
     </w:p>
     <w:p>
@@ -1536,7 +1594,7 @@
           <w:color w:val="000000"/>
           <w:sz w:val="18"/>
         </w:rPr>
-        <w:t>场景一展示公开财务表格。模型通过真实工具调用读取表结构，提交“相加、相加、相除”的计算图。观众运行保存的计划；首步完成后，预定事件撤销本地加减能力。系统保留首步结果，把后续计算交给 HTTP 算子。切换完整重跑，首步会重复执行。右栏显示这一差异对应的实际请求，观众无需从最终统计数字猜测发生了什么。</w:t>
+        <w:t>首先运行“真实模型计划·本地能力变化”。保存的 DeepSeek 调用先取得表结构，再提出相加、相加、相除的程序。首步在本地完成后，登记事件撤销本地加减能力；系统保留首步结果，向 HTTP 算子发送剩余计算所需的输入。切换“条件变化后全部重跑”，可直接观察多出的计算和请求。</w:t>
       </w:r>
     </w:p>
     <w:p>
@@ -1553,7 +1611,7 @@
           <w:color w:val="000000"/>
           <w:sz w:val="18"/>
         </w:rPr>
-        <w:t>场景二比较已用与未用源值更新。前者使相关结果失效，后者保留已有计算。右侧显示发送的原值或中间值，以及本阶段剩余预算。全本地设置展示不需要外部数值服务的情况；混合能力是受控配置，不表示加减乘除天然需要云端。两种干预均由程序执行，不是截图中的装饰性状态。</w:t>
+        <w:t>随后比较已用与未用源值更新，检查哪些结果失效、哪些仍可复用。观众在同一页面切换压缩规划、完整状态规划和逐步贪心，查看所选输入与预算；这些短模型计划的最优值相同，页面不会为制造差异而篡改结果。较长任务的规模差异由公开规划实验单独展示。</w:t>
       </w:r>
     </w:p>
     <w:p>
@@ -1570,12 +1628,12 @@
           <w:color w:val="000000"/>
           <w:sz w:val="18"/>
         </w:rPr>
-        <w:t>无密钥模式重用真实模型计划，重新执行计算与 HTTP 请求。现场模型调用使用读者自己的密钥；密钥不随仓库发布。合同案例保留模型运行中提出检索步骤的记录。零售和航空适配器提供独立批次与离线复核命令，尚未并入图 2 的可视界面，因此不将其描述为已完成的页面演示。</w:t>
+        <w:t>无密钥模式重新执行计算与 HTTP 请求，只复用已公开的模型计划；读者也可用自备密钥生成新计划。能力撤销和源值更新是预定的受控条件，不是模型发现的故障。算术服务为回环 HTTP 接收端，混合能力设置用于研究执行选择，不意味着基本算术必须外发。</w:t>
       </w:r>
     </w:p>
     <w:p>
       <w:pPr>
-        <w:spacing w:after="0" w:before="0" w:line="20" w:lineRule="exact"/>
+        <w:spacing w:after="0" w:line="20" w:lineRule="exact"/>
       </w:pPr>
       <w:r>
         <w:br w:type="column"/>
@@ -1594,7 +1652,7 @@
           <w:color w:val="000000"/>
           <w:sz w:val="18"/>
         </w:rPr>
-        <w:t>4  实验设计</w:t>
+        <w:t>4  实验设计与复核方式</w:t>
       </w:r>
     </w:p>
     <w:p>
@@ -1611,7 +1669,7 @@
           <w:color w:val="000000"/>
           <w:sz w:val="18"/>
         </w:rPr>
-        <w:t>数值实验在模型调用前冻结提示词、执行器、评价器与事件安排。FinQA [4] 子集包含 24 题、24 份此前未用的公司年度报告，原 test 与 dev 划分各 12 题；兼容筛选限定可由表格和登记算子处理的问题，另四题仅作开发。执行器不读取答案标签。</w:t>
+        <w:t>实验分为算法问题、真实模型接入和受控执行三层。最终算法在开发检查后冻结源代码、生成规则和工作负载摘要；使用新的固定种子产生 48 个负载，每个分别设置不增加、增加 25% 和增加 100% 的字段预算，共 144 个设置。三档预算共享任务输入，不作为独立自然任务计数。</w:t>
       </w:r>
     </w:p>
     <w:p>
@@ -1628,7 +1686,7 @@
           <w:color w:val="000000"/>
           <w:sz w:val="18"/>
         </w:rPr>
-        <w:t>每题生成两份 DeepSeek 计划，每份使用两次工具调用，共 48 份计划、96 次请求。各计划在五种条件下比较完整重跑、复用加贪心、无预算后续规划及三档预算方法。五种条件为全本地、混合能力稳定、已用值更新、未用值更新和能力撤销。每种方法 240 次执行，共 1,440 次；它们共享计划，不是独立模型样本。</w:t>
+        <w:t>六类负载覆盖独立选择、局部共享、远距离重用、链式重叠、不同接收方和部分本地能力，长度为 8、16、32、64 步。工作量与已有历史重新抽样。这些是构造的登记候选，不是生产工作流，也不能估计实际隐私泄露频率。开发阶段的失败和完整记录同样保留。</w:t>
       </w:r>
     </w:p>
     <w:p>
@@ -1645,7 +1703,7 @@
           <w:color w:val="000000"/>
           <w:sz w:val="18"/>
         </w:rPr>
-        <w:t>业务开发实验使用 τ²-bench [5] 的三个零售和三个航空训练任务，保留原生工具、状态和参数校验，增加统一的本地确认层。比较完整工具返回、普通引用与受限引用；每种方法最后一批各执行六个任务。开发过程中共 54 次尝试、952 次真实调用，所有失败保留。这六个任务被反复使用，不能作为独立测试集。</w:t>
+        <w:t>最终对照为共享候选的逐步贪心、仅退出无关项的消融，以及 SciPy/HiGHS 独立整数规划 [6]；开发阶段另保留完整集合前沿的结果。整数模型对候选选择和披露项并集分别设二元变量，约束共用字段预算。比较最优目标三元组、资源上限、峰值状态和规划时间；所有失败计入分母。</w:t>
       </w:r>
     </w:p>
     <w:p>
@@ -1662,7 +1720,7 @@
           <w:color w:val="000000"/>
           <w:sz w:val="18"/>
         </w:rPr>
-        <w:t>数值评价区分模型答案与按图执行一致性，并按源问题聚类统计。业务评价检查完整数据库是否与参考操作所得状态一致，不冒充官方综合得分。另固定普通与受限引用的全部末批轨迹，在两个新数据库中仅切换引用检查；若结果分歧即停止，避免把后续保存动作误当成有效反事实。</w:t>
+        <w:t>接入实验复用此前冻结的 FinQA [5] 材料：24 道公开题、48 份真实模型计划及 96 次原始请求。新执行器与原执行器在五种条件下重新执行，共 480 次、522 条 HTTP 接收记录，没有新增模型调用。另用 250 个小问题穷举验证规划最优值；它们是算法测试，不能并入模型正确率。</w:t>
       </w:r>
     </w:p>
     <w:p>
@@ -1730,7 +1788,7 @@
           <w:color w:val="000000"/>
           <w:sz w:val="16"/>
         </w:rPr>
-        <w:t>图 3  新模型图实验，每种方法 240 次配对执行。a、b：实际 HTTP 调用与数值字段传输；c：按干预条件拆分；d：R、G、F 分别为重跑、贪心与后续规划，后三项为传输预算设置。本批次的五种修复方法结果相同，不支持额外规划收益。</w:t>
+        <w:t>图 3  既有真实模型计划的受控执行结果，每种方法 240 次。结果复用减少 HTTP 调用与字段传输；该短任务批次中贪心与后续规划一致。此图验证执行层，表 1—2 单独评价新的规划器。</w:t>
       </w:r>
     </w:p>
     <w:p>
@@ -1756,41 +1814,7 @@
           <w:color w:val="000000"/>
           <w:sz w:val="18"/>
         </w:rPr>
-        <w:t>5  结果与讨论</w:t>
-      </w:r>
-    </w:p>
-    <w:p>
-      <w:pPr>
-        <w:spacing w:after="40" w:line="246" w:lineRule="auto"/>
-        <w:ind w:firstLine="230"/>
-        <w:jc w:val="both"/>
-      </w:pPr>
-      <w:r>
-        <w:rPr>
-          <w:rFonts w:ascii="Linux Libertine" w:hAnsi="Linux Libertine" w:eastAsia="SimSun"/>
-          <w:b w:val="0"/>
-          <w:i w:val="0"/>
-          <w:color w:val="000000"/>
-          <w:sz w:val="18"/>
-        </w:rPr>
-        <w:t>数值路径中，48 份计划均可执行，但原问题标签一致性仅为 28/48。结果复用将 HTTP 调用从 331 次降至 261 次，减少 21.1%；数值字段传输从 724 次降至 500 次。按 24 题聚类的探索性自助区间为 [19.1%, 23.8%]。收益主要来自能力撤销和未用源值变化后的结果保留。</w:t>
-      </w:r>
-    </w:p>
-    <w:p>
-      <w:pPr>
-        <w:spacing w:after="40" w:line="246" w:lineRule="auto"/>
-        <w:ind w:firstLine="230"/>
-        <w:jc w:val="both"/>
-      </w:pPr>
-      <w:r>
-        <w:rPr>
-          <w:rFonts w:ascii="Linux Libertine" w:hAnsi="Linux Libertine" w:eastAsia="SimSun"/>
-          <w:b w:val="0"/>
-          <w:i w:val="0"/>
-          <w:color w:val="000000"/>
-          <w:sz w:val="18"/>
-        </w:rPr>
-        <w:t>图 3 中，贪心、后续规划和三档预算的披露项及传输字段均相同，未观察到规划的额外收益。按图执行一致也不意味着答案正确：错误涉及年份选择、差值方向和百分比单位；两道疑似标签错误的平均数题仍保留原评分，未据此提高结果。</w:t>
+        <w:t>5  结果与分析</w:t>
       </w:r>
     </w:p>
     <w:p>
@@ -1806,7 +1830,7 @@
           <w:color w:val="000000"/>
           <w:sz w:val="18"/>
         </w:rPr>
-        <w:t>表 1  原生业务开发任务的末批结果</w:t>
+        <w:t>表 1  最终规划结果（峰值取已完成设置）</w:t>
       </w:r>
     </w:p>
     <w:tbl>
@@ -1816,15 +1840,15 @@
         <w:tblLook w:firstColumn="1" w:firstRow="1" w:lastColumn="0" w:lastRow="0" w:noHBand="0" w:noVBand="1" w:val="04A0"/>
       </w:tblPr>
       <w:tblGrid>
-        <w:gridCol w:w="1469"/>
-        <w:gridCol w:w="1051"/>
-        <w:gridCol w:w="1166"/>
+        <w:gridCol w:w="1555"/>
+        <w:gridCol w:w="1066"/>
         <w:gridCol w:w="1109"/>
+        <w:gridCol w:w="1066"/>
       </w:tblGrid>
       <w:tr>
         <w:tc>
           <w:tcPr>
-            <w:tcW w:type="dxa" w:w="1469"/>
+            <w:tcW w:type="dxa" w:w="1555"/>
             <w:tcBorders>
               <w:top w:val="single" w:sz="4"/>
               <w:bottom w:val="single" w:sz="4"/>
@@ -1848,7 +1872,7 @@
         </w:tc>
         <w:tc>
           <w:tcPr>
-            <w:tcW w:type="dxa" w:w="1051"/>
+            <w:tcW w:type="dxa" w:w="1066"/>
             <w:tcBorders>
               <w:top w:val="single" w:sz="4"/>
               <w:bottom w:val="single" w:sz="4"/>
@@ -1866,31 +1890,7 @@
                 <w:color w:val="000000"/>
                 <w:sz w:val="15"/>
               </w:rPr>
-              <w:t>状态一致</w:t>
-            </w:r>
-          </w:p>
-        </w:tc>
-        <w:tc>
-          <w:tcPr>
-            <w:tcW w:type="dxa" w:w="1166"/>
-            <w:tcBorders>
-              <w:top w:val="single" w:sz="4"/>
-              <w:bottom w:val="single" w:sz="4"/>
-            </w:tcBorders>
-          </w:tcPr>
-          <w:p>
-            <w:pPr>
-              <w:spacing w:after="40" w:line="240" w:lineRule="auto"/>
-            </w:pPr>
-            <w:r>
-              <w:rPr>
-                <w:rFonts w:ascii="Linux Libertine" w:hAnsi="Linux Libertine" w:eastAsia="SimSun"/>
-                <w:b/>
-                <w:i w:val="0"/>
-                <w:color w:val="000000"/>
-                <w:sz w:val="15"/>
-              </w:rPr>
-              <w:t>原值出现</w:t>
+              <w:t>求解成功</w:t>
             </w:r>
           </w:p>
         </w:tc>
@@ -1914,7 +1914,31 @@
                 <w:color w:val="000000"/>
                 <w:sz w:val="15"/>
               </w:rPr>
-              <w:t>检查拒绝</w:t>
+              <w:t>同最优值</w:t>
+            </w:r>
+          </w:p>
+        </w:tc>
+        <w:tc>
+          <w:tcPr>
+            <w:tcW w:type="dxa" w:w="1066"/>
+            <w:tcBorders>
+              <w:top w:val="single" w:sz="4"/>
+              <w:bottom w:val="single" w:sz="4"/>
+            </w:tcBorders>
+          </w:tcPr>
+          <w:p>
+            <w:pPr>
+              <w:spacing w:after="40" w:line="240" w:lineRule="auto"/>
+            </w:pPr>
+            <w:r>
+              <w:rPr>
+                <w:rFonts w:ascii="Linux Libertine" w:hAnsi="Linux Libertine" w:eastAsia="SimSun"/>
+                <w:b/>
+                <w:i w:val="0"/>
+                <w:color w:val="000000"/>
+                <w:sz w:val="15"/>
+              </w:rPr>
+              <w:t>峰值状态</w:t>
             </w:r>
           </w:p>
         </w:tc>
@@ -1922,7 +1946,7 @@
       <w:tr>
         <w:tc>
           <w:tcPr>
-            <w:tcW w:type="dxa" w:w="1469"/>
+            <w:tcW w:type="dxa" w:w="1555"/>
             <w:tcBorders/>
           </w:tcPr>
           <w:p>
@@ -1937,13 +1961,13 @@
                 <w:color w:val="000000"/>
                 <w:sz w:val="15"/>
               </w:rPr>
-              <w:t>完整返回</w:t>
+              <w:t>逐步贪心</w:t>
             </w:r>
           </w:p>
         </w:tc>
         <w:tc>
           <w:tcPr>
-            <w:tcW w:type="dxa" w:w="1051"/>
+            <w:tcW w:type="dxa" w:w="1066"/>
             <w:tcBorders/>
           </w:tcPr>
           <w:p>
@@ -1958,28 +1982,7 @@
                 <w:color w:val="000000"/>
                 <w:sz w:val="15"/>
               </w:rPr>
-              <w:t>5/6</w:t>
-            </w:r>
-          </w:p>
-        </w:tc>
-        <w:tc>
-          <w:tcPr>
-            <w:tcW w:type="dxa" w:w="1166"/>
-            <w:tcBorders/>
-          </w:tcPr>
-          <w:p>
-            <w:pPr>
-              <w:spacing w:after="40" w:line="240" w:lineRule="auto"/>
-            </w:pPr>
-            <w:r>
-              <w:rPr>
-                <w:rFonts w:ascii="Linux Libertine" w:hAnsi="Linux Libertine" w:eastAsia="SimSun"/>
-                <w:b w:val="0"/>
-                <w:i w:val="0"/>
-                <w:color w:val="000000"/>
-                <w:sz w:val="15"/>
-              </w:rPr>
-              <w:t>111</w:t>
+              <w:t>144/144</w:t>
             </w:r>
           </w:p>
         </w:tc>
@@ -2000,15 +2003,13 @@
                 <w:color w:val="000000"/>
                 <w:sz w:val="15"/>
               </w:rPr>
-              <w:t>0</w:t>
+              <w:t>48/144</w:t>
             </w:r>
           </w:p>
         </w:tc>
-      </w:tr>
-      <w:tr>
         <w:tc>
           <w:tcPr>
-            <w:tcW w:type="dxa" w:w="1469"/>
+            <w:tcW w:type="dxa" w:w="1066"/>
             <w:tcBorders/>
           </w:tcPr>
           <w:p>
@@ -2023,13 +2024,15 @@
                 <w:color w:val="000000"/>
                 <w:sz w:val="15"/>
               </w:rPr>
-              <w:t>普通引用</w:t>
+              <w:t>1</w:t>
             </w:r>
           </w:p>
         </w:tc>
+      </w:tr>
+      <w:tr>
         <w:tc>
           <w:tcPr>
-            <w:tcW w:type="dxa" w:w="1051"/>
+            <w:tcW w:type="dxa" w:w="1555"/>
             <w:tcBorders/>
           </w:tcPr>
           <w:p>
@@ -2044,13 +2047,13 @@
                 <w:color w:val="000000"/>
                 <w:sz w:val="15"/>
               </w:rPr>
-              <w:t>4/6</w:t>
+              <w:t>仅退出无关项</w:t>
             </w:r>
           </w:p>
         </w:tc>
         <w:tc>
           <w:tcPr>
-            <w:tcW w:type="dxa" w:w="1166"/>
+            <w:tcW w:type="dxa" w:w="1066"/>
             <w:tcBorders/>
           </w:tcPr>
           <w:p>
@@ -2065,7 +2068,7 @@
                 <w:color w:val="000000"/>
                 <w:sz w:val="15"/>
               </w:rPr>
-              <w:t>0</w:t>
+              <w:t>129/144</w:t>
             </w:r>
           </w:p>
         </w:tc>
@@ -2086,7 +2089,28 @@
                 <w:color w:val="000000"/>
                 <w:sz w:val="15"/>
               </w:rPr>
-              <w:t>0</w:t>
+              <w:t>129/144</w:t>
+            </w:r>
+          </w:p>
+        </w:tc>
+        <w:tc>
+          <w:tcPr>
+            <w:tcW w:type="dxa" w:w="1066"/>
+            <w:tcBorders/>
+          </w:tcPr>
+          <w:p>
+            <w:pPr>
+              <w:spacing w:after="40" w:line="240" w:lineRule="auto"/>
+            </w:pPr>
+            <w:r>
+              <w:rPr>
+                <w:rFonts w:ascii="Linux Libertine" w:hAnsi="Linux Libertine" w:eastAsia="SimSun"/>
+                <w:b w:val="0"/>
+                <w:i w:val="0"/>
+                <w:color w:val="000000"/>
+                <w:sz w:val="15"/>
+              </w:rPr>
+              <w:t>3867</w:t>
             </w:r>
           </w:p>
         </w:tc>
@@ -2094,7 +2118,93 @@
       <w:tr>
         <w:tc>
           <w:tcPr>
-            <w:tcW w:type="dxa" w:w="1469"/>
+            <w:tcW w:type="dxa" w:w="1555"/>
+            <w:tcBorders/>
+          </w:tcPr>
+          <w:p>
+            <w:pPr>
+              <w:spacing w:after="40" w:line="240" w:lineRule="auto"/>
+            </w:pPr>
+            <w:r>
+              <w:rPr>
+                <w:rFonts w:ascii="Linux Libertine" w:hAnsi="Linux Libertine" w:eastAsia="SimSun"/>
+                <w:b w:val="0"/>
+                <w:i w:val="0"/>
+                <w:color w:val="000000"/>
+                <w:sz w:val="15"/>
+              </w:rPr>
+              <w:t>完整压缩机制</w:t>
+            </w:r>
+          </w:p>
+        </w:tc>
+        <w:tc>
+          <w:tcPr>
+            <w:tcW w:type="dxa" w:w="1066"/>
+            <w:tcBorders/>
+          </w:tcPr>
+          <w:p>
+            <w:pPr>
+              <w:spacing w:after="40" w:line="240" w:lineRule="auto"/>
+            </w:pPr>
+            <w:r>
+              <w:rPr>
+                <w:rFonts w:ascii="Linux Libertine" w:hAnsi="Linux Libertine" w:eastAsia="SimSun"/>
+                <w:b w:val="0"/>
+                <w:i w:val="0"/>
+                <w:color w:val="000000"/>
+                <w:sz w:val="15"/>
+              </w:rPr>
+              <w:t>144/144</w:t>
+            </w:r>
+          </w:p>
+        </w:tc>
+        <w:tc>
+          <w:tcPr>
+            <w:tcW w:type="dxa" w:w="1109"/>
+            <w:tcBorders/>
+          </w:tcPr>
+          <w:p>
+            <w:pPr>
+              <w:spacing w:after="40" w:line="240" w:lineRule="auto"/>
+            </w:pPr>
+            <w:r>
+              <w:rPr>
+                <w:rFonts w:ascii="Linux Libertine" w:hAnsi="Linux Libertine" w:eastAsia="SimSun"/>
+                <w:b w:val="0"/>
+                <w:i w:val="0"/>
+                <w:color w:val="000000"/>
+                <w:sz w:val="15"/>
+              </w:rPr>
+              <w:t>144/144</w:t>
+            </w:r>
+          </w:p>
+        </w:tc>
+        <w:tc>
+          <w:tcPr>
+            <w:tcW w:type="dxa" w:w="1066"/>
+            <w:tcBorders/>
+          </w:tcPr>
+          <w:p>
+            <w:pPr>
+              <w:spacing w:after="40" w:line="240" w:lineRule="auto"/>
+            </w:pPr>
+            <w:r>
+              <w:rPr>
+                <w:rFonts w:ascii="Linux Libertine" w:hAnsi="Linux Libertine" w:eastAsia="SimSun"/>
+                <w:b w:val="0"/>
+                <w:i w:val="0"/>
+                <w:color w:val="000000"/>
+                <w:sz w:val="15"/>
+              </w:rPr>
+              <w:t>287</w:t>
+            </w:r>
+          </w:p>
+        </w:tc>
+      </w:tr>
+      <w:tr>
+        <w:tc>
+          <w:tcPr>
+            <w:tcW w:type="dxa" w:w="1555"/>
             <w:tcBorders>
               <w:bottom w:val="single" w:sz="4"/>
             </w:tcBorders>
@@ -2111,13 +2221,13 @@
                 <w:color w:val="000000"/>
                 <w:sz w:val="15"/>
               </w:rPr>
-              <w:t>受限引用</w:t>
+              <w:t>独立整数规划</w:t>
             </w:r>
           </w:p>
         </w:tc>
         <w:tc>
           <w:tcPr>
-            <w:tcW w:type="dxa" w:w="1051"/>
+            <w:tcW w:type="dxa" w:w="1066"/>
             <w:tcBorders>
               <w:bottom w:val="single" w:sz="4"/>
             </w:tcBorders>
@@ -2134,30 +2244,7 @@
                 <w:color w:val="000000"/>
                 <w:sz w:val="15"/>
               </w:rPr>
-              <w:t>6/6</w:t>
-            </w:r>
-          </w:p>
-        </w:tc>
-        <w:tc>
-          <w:tcPr>
-            <w:tcW w:type="dxa" w:w="1166"/>
-            <w:tcBorders>
-              <w:bottom w:val="single" w:sz="4"/>
-            </w:tcBorders>
-          </w:tcPr>
-          <w:p>
-            <w:pPr>
-              <w:spacing w:after="40" w:line="240" w:lineRule="auto"/>
-            </w:pPr>
-            <w:r>
-              <w:rPr>
-                <w:rFonts w:ascii="Linux Libertine" w:hAnsi="Linux Libertine" w:eastAsia="SimSun"/>
-                <w:b w:val="0"/>
-                <w:i w:val="0"/>
-                <w:color w:val="000000"/>
-                <w:sz w:val="15"/>
-              </w:rPr>
-              <w:t>0</w:t>
+              <w:t>144/144</w:t>
             </w:r>
           </w:p>
         </w:tc>
@@ -2180,7 +2267,350 @@
                 <w:color w:val="000000"/>
                 <w:sz w:val="15"/>
               </w:rPr>
-              <w:t>0</w:t>
+              <w:t>144/144</w:t>
+            </w:r>
+          </w:p>
+        </w:tc>
+        <w:tc>
+          <w:tcPr>
+            <w:tcW w:type="dxa" w:w="1066"/>
+            <w:tcBorders>
+              <w:bottom w:val="single" w:sz="4"/>
+            </w:tcBorders>
+          </w:tcPr>
+          <w:p>
+            <w:pPr>
+              <w:spacing w:after="40" w:line="240" w:lineRule="auto"/>
+            </w:pPr>
+            <w:r>
+              <w:rPr>
+                <w:rFonts w:ascii="Linux Libertine" w:hAnsi="Linux Libertine" w:eastAsia="SimSun"/>
+                <w:b w:val="0"/>
+                <w:i w:val="0"/>
+                <w:color w:val="000000"/>
+                <w:sz w:val="15"/>
+              </w:rPr>
+              <w:t>—</w:t>
+            </w:r>
+          </w:p>
+        </w:tc>
+      </w:tr>
+    </w:tbl>
+    <w:p>
+      <w:pPr>
+        <w:spacing w:after="40" w:line="246" w:lineRule="auto"/>
+        <w:ind w:firstLine="0"/>
+        <w:jc w:val="both"/>
+      </w:pPr>
+      <w:r>
+        <w:rPr>
+          <w:rFonts w:ascii="Linux Libertine" w:hAnsi="Linux Libertine" w:eastAsia="SimSun"/>
+          <w:b w:val="0"/>
+          <w:i w:val="0"/>
+          <w:color w:val="000000"/>
+          <w:sz w:val="18"/>
+        </w:rPr>
+        <w:t>完整机制在所有设置上与整数规划一致；仅退出无关项仍有 15 个设置达到标签上限。分量分解和按字典序支配删除恢复了这些可解设置。整数规划是独立最优值参照，表中的一致不等于本方法在所有任务上比通用求解器更快。</w:t>
+      </w:r>
+    </w:p>
+    <w:p>
+      <w:pPr>
+        <w:keepNext/>
+        <w:spacing w:before="80" w:after="40"/>
+      </w:pPr>
+      <w:r>
+        <w:rPr>
+          <w:rFonts w:ascii="Linux Libertine" w:hAnsi="Linux Libertine" w:eastAsia="SimHei"/>
+          <w:b/>
+          <w:i w:val="0"/>
+          <w:color w:val="000000"/>
+          <w:sz w:val="18"/>
+        </w:rPr>
+        <w:t>表 2  披露与传输的交换关系</w:t>
+      </w:r>
+    </w:p>
+    <w:tbl>
+      <w:tblPr>
+        <w:tblW w:type="auto" w:w="0"/>
+        <w:tblLayout w:type="fixed"/>
+        <w:tblLook w:firstColumn="1" w:firstRow="1" w:lastColumn="0" w:lastRow="0" w:noHBand="0" w:noVBand="1" w:val="04A0"/>
+      </w:tblPr>
+      <w:tblGrid>
+        <w:gridCol w:w="1080"/>
+        <w:gridCol w:w="1901"/>
+        <w:gridCol w:w="1814"/>
+      </w:tblGrid>
+      <w:tr>
+        <w:tc>
+          <w:tcPr>
+            <w:tcW w:type="dxa" w:w="1080"/>
+            <w:tcBorders>
+              <w:top w:val="single" w:sz="4"/>
+              <w:bottom w:val="single" w:sz="4"/>
+            </w:tcBorders>
+          </w:tcPr>
+          <w:p>
+            <w:pPr>
+              <w:spacing w:after="40" w:line="240" w:lineRule="auto"/>
+            </w:pPr>
+            <w:r>
+              <w:rPr>
+                <w:rFonts w:ascii="Linux Libertine" w:hAnsi="Linux Libertine" w:eastAsia="SimSun"/>
+                <w:b/>
+                <w:i w:val="0"/>
+                <w:color w:val="000000"/>
+                <w:sz w:val="15"/>
+              </w:rPr>
+              <w:t>预算增幅</w:t>
+            </w:r>
+          </w:p>
+        </w:tc>
+        <w:tc>
+          <w:tcPr>
+            <w:tcW w:type="dxa" w:w="1901"/>
+            <w:tcBorders>
+              <w:top w:val="single" w:sz="4"/>
+              <w:bottom w:val="single" w:sz="4"/>
+            </w:tcBorders>
+          </w:tcPr>
+          <w:p>
+            <w:pPr>
+              <w:spacing w:after="40" w:line="240" w:lineRule="auto"/>
+            </w:pPr>
+            <w:r>
+              <w:rPr>
+                <w:rFonts w:ascii="Linux Libertine" w:hAnsi="Linux Libertine" w:eastAsia="SimSun"/>
+                <w:b/>
+                <w:i w:val="0"/>
+                <w:color w:val="000000"/>
+                <w:sz w:val="15"/>
+              </w:rPr>
+              <w:t>不同披露项</w:t>
+            </w:r>
+          </w:p>
+        </w:tc>
+        <w:tc>
+          <w:tcPr>
+            <w:tcW w:type="dxa" w:w="1814"/>
+            <w:tcBorders>
+              <w:top w:val="single" w:sz="4"/>
+              <w:bottom w:val="single" w:sz="4"/>
+            </w:tcBorders>
+          </w:tcPr>
+          <w:p>
+            <w:pPr>
+              <w:spacing w:after="40" w:line="240" w:lineRule="auto"/>
+            </w:pPr>
+            <w:r>
+              <w:rPr>
+                <w:rFonts w:ascii="Linux Libertine" w:hAnsi="Linux Libertine" w:eastAsia="SimSun"/>
+                <w:b/>
+                <w:i w:val="0"/>
+                <w:color w:val="000000"/>
+                <w:sz w:val="15"/>
+              </w:rPr>
+              <w:t>字段次数</w:t>
+            </w:r>
+          </w:p>
+        </w:tc>
+      </w:tr>
+      <w:tr>
+        <w:tc>
+          <w:tcPr>
+            <w:tcW w:type="dxa" w:w="1080"/>
+            <w:tcBorders/>
+          </w:tcPr>
+          <w:p>
+            <w:pPr>
+              <w:spacing w:after="40" w:line="240" w:lineRule="auto"/>
+            </w:pPr>
+            <w:r>
+              <w:rPr>
+                <w:rFonts w:ascii="Linux Libertine" w:hAnsi="Linux Libertine" w:eastAsia="SimSun"/>
+                <w:b w:val="0"/>
+                <w:i w:val="0"/>
+                <w:color w:val="000000"/>
+                <w:sz w:val="15"/>
+              </w:rPr>
+              <w:t>0%</w:t>
+            </w:r>
+          </w:p>
+        </w:tc>
+        <w:tc>
+          <w:tcPr>
+            <w:tcW w:type="dxa" w:w="1901"/>
+            <w:tcBorders/>
+          </w:tcPr>
+          <w:p>
+            <w:pPr>
+              <w:spacing w:after="40" w:line="240" w:lineRule="auto"/>
+            </w:pPr>
+            <w:r>
+              <w:rPr>
+                <w:rFonts w:ascii="Linux Libertine" w:hAnsi="Linux Libertine" w:eastAsia="SimSun"/>
+                <w:b w:val="0"/>
+                <w:i w:val="0"/>
+                <w:color w:val="000000"/>
+                <w:sz w:val="15"/>
+              </w:rPr>
+              <w:t>1060 / 1081</w:t>
+            </w:r>
+          </w:p>
+        </w:tc>
+        <w:tc>
+          <w:tcPr>
+            <w:tcW w:type="dxa" w:w="1814"/>
+            <w:tcBorders/>
+          </w:tcPr>
+          <w:p>
+            <w:pPr>
+              <w:spacing w:after="40" w:line="240" w:lineRule="auto"/>
+            </w:pPr>
+            <w:r>
+              <w:rPr>
+                <w:rFonts w:ascii="Linux Libertine" w:hAnsi="Linux Libertine" w:eastAsia="SimSun"/>
+                <w:b w:val="0"/>
+                <w:i w:val="0"/>
+                <w:color w:val="000000"/>
+                <w:sz w:val="15"/>
+              </w:rPr>
+              <w:t>1602 / 1603</w:t>
+            </w:r>
+          </w:p>
+        </w:tc>
+      </w:tr>
+      <w:tr>
+        <w:tc>
+          <w:tcPr>
+            <w:tcW w:type="dxa" w:w="1080"/>
+            <w:tcBorders/>
+          </w:tcPr>
+          <w:p>
+            <w:pPr>
+              <w:spacing w:after="40" w:line="240" w:lineRule="auto"/>
+            </w:pPr>
+            <w:r>
+              <w:rPr>
+                <w:rFonts w:ascii="Linux Libertine" w:hAnsi="Linux Libertine" w:eastAsia="SimSun"/>
+                <w:b w:val="0"/>
+                <w:i w:val="0"/>
+                <w:color w:val="000000"/>
+                <w:sz w:val="15"/>
+              </w:rPr>
+              <w:t>25%</w:t>
+            </w:r>
+          </w:p>
+        </w:tc>
+        <w:tc>
+          <w:tcPr>
+            <w:tcW w:type="dxa" w:w="1901"/>
+            <w:tcBorders/>
+          </w:tcPr>
+          <w:p>
+            <w:pPr>
+              <w:spacing w:after="40" w:line="240" w:lineRule="auto"/>
+            </w:pPr>
+            <w:r>
+              <w:rPr>
+                <w:rFonts w:ascii="Linux Libertine" w:hAnsi="Linux Libertine" w:eastAsia="SimSun"/>
+                <w:b w:val="0"/>
+                <w:i w:val="0"/>
+                <w:color w:val="000000"/>
+                <w:sz w:val="15"/>
+              </w:rPr>
+              <w:t>923 / 1081</w:t>
+            </w:r>
+          </w:p>
+        </w:tc>
+        <w:tc>
+          <w:tcPr>
+            <w:tcW w:type="dxa" w:w="1814"/>
+            <w:tcBorders/>
+          </w:tcPr>
+          <w:p>
+            <w:pPr>
+              <w:spacing w:after="40" w:line="240" w:lineRule="auto"/>
+            </w:pPr>
+            <w:r>
+              <w:rPr>
+                <w:rFonts w:ascii="Linux Libertine" w:hAnsi="Linux Libertine" w:eastAsia="SimSun"/>
+                <w:b w:val="0"/>
+                <w:i w:val="0"/>
+                <w:color w:val="000000"/>
+                <w:sz w:val="15"/>
+              </w:rPr>
+              <w:t>1906 / 1603</w:t>
+            </w:r>
+          </w:p>
+        </w:tc>
+      </w:tr>
+      <w:tr>
+        <w:tc>
+          <w:tcPr>
+            <w:tcW w:type="dxa" w:w="1080"/>
+            <w:tcBorders>
+              <w:bottom w:val="single" w:sz="4"/>
+            </w:tcBorders>
+          </w:tcPr>
+          <w:p>
+            <w:pPr>
+              <w:spacing w:after="40" w:line="240" w:lineRule="auto"/>
+            </w:pPr>
+            <w:r>
+              <w:rPr>
+                <w:rFonts w:ascii="Linux Libertine" w:hAnsi="Linux Libertine" w:eastAsia="SimSun"/>
+                <w:b w:val="0"/>
+                <w:i w:val="0"/>
+                <w:color w:val="000000"/>
+                <w:sz w:val="15"/>
+              </w:rPr>
+              <w:t>100%</w:t>
+            </w:r>
+          </w:p>
+        </w:tc>
+        <w:tc>
+          <w:tcPr>
+            <w:tcW w:type="dxa" w:w="1901"/>
+            <w:tcBorders>
+              <w:bottom w:val="single" w:sz="4"/>
+            </w:tcBorders>
+          </w:tcPr>
+          <w:p>
+            <w:pPr>
+              <w:spacing w:after="40" w:line="240" w:lineRule="auto"/>
+            </w:pPr>
+            <w:r>
+              <w:rPr>
+                <w:rFonts w:ascii="Linux Libertine" w:hAnsi="Linux Libertine" w:eastAsia="SimSun"/>
+                <w:b w:val="0"/>
+                <w:i w:val="0"/>
+                <w:color w:val="000000"/>
+                <w:sz w:val="15"/>
+              </w:rPr>
+              <w:t>784 / 1081</w:t>
+            </w:r>
+          </w:p>
+        </w:tc>
+        <w:tc>
+          <w:tcPr>
+            <w:tcW w:type="dxa" w:w="1814"/>
+            <w:tcBorders>
+              <w:bottom w:val="single" w:sz="4"/>
+            </w:tcBorders>
+          </w:tcPr>
+          <w:p>
+            <w:pPr>
+              <w:spacing w:after="40" w:line="240" w:lineRule="auto"/>
+            </w:pPr>
+            <w:r>
+              <w:rPr>
+                <w:rFonts w:ascii="Linux Libertine" w:hAnsi="Linux Libertine" w:eastAsia="SimSun"/>
+                <w:b w:val="0"/>
+                <w:i w:val="0"/>
+                <w:color w:val="000000"/>
+                <w:sz w:val="15"/>
+              </w:rPr>
+              <w:t>2342 / 1603</w:t>
             </w:r>
           </w:p>
         </w:tc>
@@ -2200,7 +2630,7 @@
           <w:color w:val="000000"/>
           <w:sz w:val="16"/>
         </w:rPr>
-        <w:t>“原值出现”仅统计发给规划模型的不同工具消息中六类登记字段的非空原值，排除用户对话和确认模拟器；它不是语义泄露率。普通引用同样将该计数降为零，不能把这一效果归于新增用途检查。</w:t>
+        <w:t>每格为“完整机制 / 贪心”，各行含 48 个相同负载。不增加预算时不同披露项减少 1.9%；预算放宽 25% 时减少 14.6%，实际传输却增加 18.9%。减少不同项目不等于减少通信，更不等于同比减少隐私风险。</w:t>
       </w:r>
     </w:p>
     <w:p>
@@ -2217,12 +2647,29 @@
           <w:color w:val="000000"/>
           <w:sz w:val="18"/>
         </w:rPr>
-        <w:t>为核查表 1 的完成差异，对两种引用方法的 12 条轨迹、107 个业务提案逐一切换检查。两侧调用和最终状态全部一致。这说明本批次没有体现新增检查的执行收益；不同采样对话中的 4/6 与 6/6 不足以建立因果关系。</w:t>
+        <w:t>新执行器的 480 次运行均与给定程序结果一致，接收正文与发送摘要逐条相符。但原始模型答案与题目标签仅 28/48 一致；规划压缩不会修复模型选错年份或公式。既有实验的 HTTP 调用从 331 次降到 261 次来自结果复用，不能归为本轮规划算法的收益。</w:t>
       </w:r>
     </w:p>
     <w:p>
       <w:pPr>
-        <w:spacing w:after="0" w:before="0" w:line="20" w:lineRule="exact"/>
+        <w:spacing w:after="40" w:line="246" w:lineRule="auto"/>
+        <w:ind w:firstLine="0"/>
+        <w:jc w:val="both"/>
+      </w:pPr>
+      <w:r>
+        <w:rPr>
+          <w:rFonts w:ascii="Linux Libertine" w:hAnsi="Linux Libertine" w:eastAsia="SimSun"/>
+          <w:b w:val="0"/>
+          <w:i w:val="0"/>
+          <w:color w:val="000000"/>
+          <w:sz w:val="16"/>
+        </w:rPr>
+        <w:t>串行复测每个设置五次，先取各设置中位数。完整机制与整数规划的总体中位数分别为 0.53 和 2.75 毫秒；最大设置中位数为 380.0 和 2109.4 毫秒。硬件及逐次时间随记录提供。</w:t>
+      </w:r>
+    </w:p>
+    <w:p>
+      <w:pPr>
+        <w:spacing w:after="0" w:line="20" w:lineRule="exact"/>
       </w:pPr>
       <w:r>
         <w:br w:type="column"/>
@@ -2258,7 +2705,7 @@
           <w:color w:val="000000"/>
           <w:sz w:val="18"/>
         </w:rPr>
-        <w:t>系统已实现可视执行、版本核验、有效结果复用和原生业务工具适配。证据支持这些组件能够运行并被复核，也支持受控变化下的复用收益；尚不支持后续规划或受限引用优于强对照。登记视图的等价性来自本地规则，不能推广为自动理解任意业务内容。</w:t>
+        <w:t>方法适用于输出等价、成本与后续可行性可登记的有限候选。后缀范围大、披露关联紧密或预算很大时仍可能遇到资源上限；当前不优化步骤顺序，也不保证未知未来的全局最优。登记依赖和版本维护必须可信，任意网络绕过不在本原型的保证范围内。</w:t>
       </w:r>
     </w:p>
     <w:p>
@@ -2275,13 +2722,13 @@
           <w:color w:val="000000"/>
           <w:sz w:val="18"/>
         </w:rPr>
-        <w:t>实验仅使用一个模型。业务任务的用户与确认环节也由 DeepSeek 模拟，后者可见原始参数，因此不能宣称模型供应商完全看不到原值。数据库一致性不覆盖全部业务政策；人类对自由文本解释和操作合理性的评阅尚未完成。软件检查、开发样本与独立质量评价不能互相替代。</w:t>
+        <w:t>项目开源独立研究页面、规划器、接收端、冻结请求、原始记录及核验脚本，商业客户端不包含在内。默认演示无需模型密钥；公开记录可离线重算，重新调用模型需读者自己的凭据。论文中的数字由记录生成，开发失败、人审材料和既有业务适配器另附，未将尚未完成的人审当成质量证据。</w:t>
       </w:r>
     </w:p>
     <w:p>
       <w:pPr>
-        <w:spacing w:after="20" w:line="246" w:lineRule="auto"/>
-        <w:ind w:firstLine="230"/>
+        <w:spacing w:after="0" w:line="246" w:lineRule="auto"/>
+        <w:ind w:firstLine="0"/>
         <w:jc w:val="both"/>
       </w:pPr>
       <w:r>
@@ -2290,9 +2737,9 @@
           <w:b w:val="0"/>
           <w:i w:val="0"/>
           <w:color w:val="000000"/>
-          <w:sz w:val="18"/>
+          <w:sz w:val="16"/>
         </w:rPr>
-        <w:t>开源包独立于商业客户端，包含双语页面、任务输入、真实模型记录、接收记录和离线核验器。构造的信息补充案例可重跑三阶段决策与两次 HTTP 发送，但不计入模型实验。所有失败、无收益结果和版本来源均保留；读者可以追溯正文数字并复核界面所示过程。</w:t>
+        <w:t>源码与操作说明：</w:t>
       </w:r>
     </w:p>
     <w:p>
@@ -2309,7 +2756,7 @@
           <w:color w:val="000000"/>
           <w:sz w:val="15"/>
         </w:rPr>
-        <w:t>代码与复现：https://github.com/Zane-0260907/stepwise-disclosure-demo</w:t>
+        <w:t>https://github.com/Zane-0260907/stepwise-disclosure-demo</w:t>
       </w:r>
     </w:p>
     <w:p>
@@ -2393,7 +2840,7 @@
           <w:color w:val="000000"/>
           <w:sz w:val="16"/>
         </w:rPr>
-        <w:t>[4] Z. Chen 等. FinQA: A Dataset of Numerical Reasoning over Financial Data. EMNLP, 2021, 3697–3711.</w:t>
+        <w:t>[4] J. Kawahara 等. Frontier-Based Search for Enumerating All Constrained Subgraphs with Compressed Representation. IEICE Trans. E100-A(9), 1773–1784, 2017.</w:t>
       </w:r>
     </w:p>
     <w:p>
@@ -2410,7 +2857,24 @@
           <w:color w:val="000000"/>
           <w:sz w:val="16"/>
         </w:rPr>
-        <w:t>[5] V. Barres 等. τ²-Bench: Evaluating Conversational Agents in a Dual-Control Environment. arXiv:2506.07982, 2025.</w:t>
+        <w:t>[5] Z. Chen 等. FinQA: A Dataset of Numerical Reasoning over Financial Data. EMNLP, 3697–3711, 2021.</w:t>
+      </w:r>
+    </w:p>
+    <w:p>
+      <w:pPr>
+        <w:spacing w:after="20" w:line="246" w:lineRule="auto"/>
+        <w:ind w:left="202" w:hanging="202"/>
+        <w:jc w:val="left"/>
+      </w:pPr>
+      <w:r>
+        <w:rPr>
+          <w:rFonts w:ascii="Linux Libertine" w:hAnsi="Linux Libertine" w:eastAsia="SimSun"/>
+          <w:b w:val="0"/>
+          <w:i w:val="0"/>
+          <w:color w:val="000000"/>
+          <w:sz w:val="16"/>
+        </w:rPr>
+        <w:t>[6] P. Virtanen 等. SciPy 1.0: Fundamental Algorithms for Scientific Computing in Python. Nature Methods 17, 261–272, 2020. 整数规划使用 SciPy 1.15.3 的 HiGHS 接口.</w:t>
       </w:r>
     </w:p>
     <w:sectPr>

</xml_diff>